<commit_message>
feat(doc): integrasi master data rutan ke dokumen s22 pertama dan kedua
</commit_message>
<xml_diff>
--- a/public/word-template/surat_permintaan_perpanjangan_penahanan_kedua_30_hari.docx
+++ b/public/word-template/surat_permintaan_perpanjangan_penahanan_kedua_30_hari.docx
@@ -77,7 +77,7 @@
                       <w:lang w:val="en-US"/>
                     </w:rPr>
                     <w:drawing>
-                      <wp:inline distT="0" distB="0" distL="0" distR="0" wp14:anchorId="1D461AF8" wp14:editId="4502893B">
+                      <wp:inline distT="0" distB="0" distL="0" distR="0" wp14:anchorId="1D461AF8" wp14:editId="233C4F70">
                         <wp:extent cx="738127" cy="690404"/>
                         <wp:effectExtent l="0" t="0" r="5080" b="0"/>
                         <wp:docPr id="6" name="Picture 6"/>
@@ -162,7 +162,25 @@
                       <w:sz w:val="24"/>
                       <w:szCs w:val="24"/>
                     </w:rPr>
-                    <w:t>DAERAH ${daerahPoliceFullName}</w:t>
+                    <w:t>DAERAH ${</w:t>
+                  </w:r>
+                  <w:proofErr w:type="spellStart"/>
+                  <w:r>
+                    <w:rPr>
+                      <w:rFonts w:ascii="Arial Narrow" w:hAnsi="Arial Narrow"/>
+                      <w:sz w:val="24"/>
+                      <w:szCs w:val="24"/>
+                    </w:rPr>
+                    <w:t>daerahPoliceFullName</w:t>
+                  </w:r>
+                  <w:proofErr w:type="spellEnd"/>
+                  <w:r>
+                    <w:rPr>
+                      <w:rFonts w:ascii="Arial Narrow" w:hAnsi="Arial Narrow"/>
+                      <w:sz w:val="24"/>
+                      <w:szCs w:val="24"/>
+                    </w:rPr>
+                    <w:t>}</w:t>
                   </w:r>
                 </w:p>
                 <w:p>
@@ -180,7 +198,25 @@
                       <w:sz w:val="24"/>
                       <w:szCs w:val="24"/>
                     </w:rPr>
-                    <w:t>${resorPoliceFullName}</w:t>
+                    <w:t>${</w:t>
+                  </w:r>
+                  <w:proofErr w:type="spellStart"/>
+                  <w:r>
+                    <w:rPr>
+                      <w:rFonts w:ascii="Arial Narrow" w:hAnsi="Arial Narrow"/>
+                      <w:sz w:val="24"/>
+                      <w:szCs w:val="24"/>
+                    </w:rPr>
+                    <w:t>resorPoliceFullName</w:t>
+                  </w:r>
+                  <w:proofErr w:type="spellEnd"/>
+                  <w:r>
+                    <w:rPr>
+                      <w:rFonts w:ascii="Arial Narrow" w:hAnsi="Arial Narrow"/>
+                      <w:sz w:val="24"/>
+                      <w:szCs w:val="24"/>
+                    </w:rPr>
+                    <w:t>}</w:t>
                   </w:r>
                 </w:p>
                 <w:p>
@@ -198,7 +234,25 @@
                       <w:sz w:val="24"/>
                       <w:szCs w:val="24"/>
                     </w:rPr>
-                    <w:t>${resorPoliceAddress}</w:t>
+                    <w:t>${</w:t>
+                  </w:r>
+                  <w:proofErr w:type="spellStart"/>
+                  <w:r>
+                    <w:rPr>
+                      <w:rFonts w:ascii="Arial Narrow" w:hAnsi="Arial Narrow"/>
+                      <w:sz w:val="24"/>
+                      <w:szCs w:val="24"/>
+                    </w:rPr>
+                    <w:t>resorPoliceAddress</w:t>
+                  </w:r>
+                  <w:proofErr w:type="spellEnd"/>
+                  <w:r>
+                    <w:rPr>
+                      <w:rFonts w:ascii="Arial Narrow" w:hAnsi="Arial Narrow"/>
+                      <w:sz w:val="24"/>
+                      <w:szCs w:val="24"/>
+                    </w:rPr>
+                    <w:t>}</w:t>
                   </w:r>
                 </w:p>
               </w:tc>
@@ -268,7 +322,27 @@
                 <w:sz w:val="24"/>
                 <w:szCs w:val="24"/>
               </w:rPr>
-              <w:t>${documentLocation}</w:t>
+              <w:t>${</w:t>
+            </w:r>
+            <w:proofErr w:type="spellStart"/>
+            <w:r>
+              <w:rPr>
+                <w:rFonts w:ascii="Arial Narrow" w:hAnsi="Arial Narrow" w:cs="Times New Roman"/>
+                <w:color w:val="000000"/>
+                <w:sz w:val="24"/>
+                <w:szCs w:val="24"/>
+              </w:rPr>
+              <w:t>documentLocation</w:t>
+            </w:r>
+            <w:proofErr w:type="spellEnd"/>
+            <w:r>
+              <w:rPr>
+                <w:rFonts w:ascii="Arial Narrow" w:hAnsi="Arial Narrow" w:cs="Times New Roman"/>
+                <w:color w:val="000000"/>
+                <w:sz w:val="24"/>
+                <w:szCs w:val="24"/>
+              </w:rPr>
+              <w:t>}</w:t>
             </w:r>
           </w:p>
           <w:p>
@@ -290,7 +364,27 @@
                 <w:sz w:val="24"/>
                 <w:szCs w:val="24"/>
               </w:rPr>
-              <w:t>${documentDate}</w:t>
+              <w:t>${</w:t>
+            </w:r>
+            <w:proofErr w:type="spellStart"/>
+            <w:r>
+              <w:rPr>
+                <w:rFonts w:ascii="Arial Narrow" w:hAnsi="Arial Narrow" w:cs="Times New Roman"/>
+                <w:color w:val="000000"/>
+                <w:sz w:val="24"/>
+                <w:szCs w:val="24"/>
+              </w:rPr>
+              <w:t>documentDate</w:t>
+            </w:r>
+            <w:proofErr w:type="spellEnd"/>
+            <w:r>
+              <w:rPr>
+                <w:rFonts w:ascii="Arial Narrow" w:hAnsi="Arial Narrow" w:cs="Times New Roman"/>
+                <w:color w:val="000000"/>
+                <w:sz w:val="24"/>
+                <w:szCs w:val="24"/>
+              </w:rPr>
+              <w:t>}</w:t>
             </w:r>
           </w:p>
         </w:tc>
@@ -392,6 +486,7 @@
                 <w:szCs w:val="24"/>
               </w:rPr>
             </w:pPr>
+            <w:proofErr w:type="spellStart"/>
             <w:r>
               <w:rPr>
                 <w:rFonts w:ascii="Arial Narrow" w:hAnsi="Arial Narrow" w:cs="Times New Roman"/>
@@ -400,6 +495,7 @@
               </w:rPr>
               <w:t>Nomor</w:t>
             </w:r>
+            <w:proofErr w:type="spellEnd"/>
           </w:p>
         </w:tc>
         <w:tc>
@@ -443,7 +539,25 @@
                 <w:sz w:val="24"/>
                 <w:szCs w:val="24"/>
               </w:rPr>
-              <w:t>${documentNumber}</w:t>
+              <w:t>${</w:t>
+            </w:r>
+            <w:proofErr w:type="spellStart"/>
+            <w:r>
+              <w:rPr>
+                <w:rFonts w:ascii="Arial Narrow" w:hAnsi="Arial Narrow" w:cs="Times New Roman"/>
+                <w:sz w:val="24"/>
+                <w:szCs w:val="24"/>
+              </w:rPr>
+              <w:t>documentNumber</w:t>
+            </w:r>
+            <w:proofErr w:type="spellEnd"/>
+            <w:r>
+              <w:rPr>
+                <w:rFonts w:ascii="Arial Narrow" w:hAnsi="Arial Narrow" w:cs="Times New Roman"/>
+                <w:sz w:val="24"/>
+                <w:szCs w:val="24"/>
+              </w:rPr>
+              <w:t>}</w:t>
             </w:r>
           </w:p>
         </w:tc>
@@ -476,6 +590,7 @@
                 <w:szCs w:val="24"/>
               </w:rPr>
             </w:pPr>
+            <w:proofErr w:type="spellStart"/>
             <w:r>
               <w:rPr>
                 <w:rFonts w:ascii="Arial Narrow" w:hAnsi="Arial Narrow" w:cs="Times New Roman"/>
@@ -484,6 +599,7 @@
               </w:rPr>
               <w:t>Klasifikasi</w:t>
             </w:r>
+            <w:proofErr w:type="spellEnd"/>
           </w:p>
         </w:tc>
         <w:tc>
@@ -528,7 +644,25 @@
                 <w:sz w:val="24"/>
                 <w:szCs w:val="24"/>
               </w:rPr>
-              <w:t>${documentClassificationName}</w:t>
+              <w:t>${</w:t>
+            </w:r>
+            <w:proofErr w:type="spellStart"/>
+            <w:r>
+              <w:rPr>
+                <w:rFonts w:ascii="Arial Narrow" w:hAnsi="Arial Narrow" w:cs="Times New Roman"/>
+                <w:sz w:val="24"/>
+                <w:szCs w:val="24"/>
+              </w:rPr>
+              <w:t>documentClassificationName</w:t>
+            </w:r>
+            <w:proofErr w:type="spellEnd"/>
+            <w:r>
+              <w:rPr>
+                <w:rFonts w:ascii="Arial Narrow" w:hAnsi="Arial Narrow" w:cs="Times New Roman"/>
+                <w:sz w:val="24"/>
+                <w:szCs w:val="24"/>
+              </w:rPr>
+              <w:t>}</w:t>
             </w:r>
           </w:p>
         </w:tc>
@@ -670,6 +804,7 @@
                 <w:u w:val="single"/>
               </w:rPr>
             </w:pPr>
+            <w:proofErr w:type="spellStart"/>
             <w:r>
               <w:rPr>
                 <w:rFonts w:ascii="Arial Narrow" w:hAnsi="Arial Narrow" w:cs="Times New Roman"/>
@@ -684,8 +819,63 @@
                 <w:sz w:val="24"/>
                 <w:szCs w:val="24"/>
               </w:rPr>
-              <w:t>ermohonan perpanjangan penahanan tersangka</w:t>
-            </w:r>
+              <w:t>ermohonan</w:t>
+            </w:r>
+            <w:proofErr w:type="spellEnd"/>
+            <w:r>
+              <w:rPr>
+                <w:rFonts w:ascii="Arial Narrow" w:hAnsi="Arial Narrow" w:cs="Times New Roman"/>
+                <w:sz w:val="24"/>
+                <w:szCs w:val="24"/>
+              </w:rPr>
+              <w:t xml:space="preserve"> </w:t>
+            </w:r>
+            <w:proofErr w:type="spellStart"/>
+            <w:r>
+              <w:rPr>
+                <w:rFonts w:ascii="Arial Narrow" w:hAnsi="Arial Narrow" w:cs="Times New Roman"/>
+                <w:sz w:val="24"/>
+                <w:szCs w:val="24"/>
+              </w:rPr>
+              <w:t>perpanjangan</w:t>
+            </w:r>
+            <w:proofErr w:type="spellEnd"/>
+            <w:r>
+              <w:rPr>
+                <w:rFonts w:ascii="Arial Narrow" w:hAnsi="Arial Narrow" w:cs="Times New Roman"/>
+                <w:sz w:val="24"/>
+                <w:szCs w:val="24"/>
+              </w:rPr>
+              <w:t xml:space="preserve"> </w:t>
+            </w:r>
+            <w:proofErr w:type="spellStart"/>
+            <w:r>
+              <w:rPr>
+                <w:rFonts w:ascii="Arial Narrow" w:hAnsi="Arial Narrow" w:cs="Times New Roman"/>
+                <w:sz w:val="24"/>
+                <w:szCs w:val="24"/>
+              </w:rPr>
+              <w:t>penahanan</w:t>
+            </w:r>
+            <w:proofErr w:type="spellEnd"/>
+            <w:r>
+              <w:rPr>
+                <w:rFonts w:ascii="Arial Narrow" w:hAnsi="Arial Narrow" w:cs="Times New Roman"/>
+                <w:sz w:val="24"/>
+                <w:szCs w:val="24"/>
+              </w:rPr>
+              <w:t xml:space="preserve"> </w:t>
+            </w:r>
+            <w:proofErr w:type="spellStart"/>
+            <w:r>
+              <w:rPr>
+                <w:rFonts w:ascii="Arial Narrow" w:hAnsi="Arial Narrow" w:cs="Times New Roman"/>
+                <w:sz w:val="24"/>
+                <w:szCs w:val="24"/>
+              </w:rPr>
+              <w:t>tersangka</w:t>
+            </w:r>
+            <w:proofErr w:type="spellEnd"/>
           </w:p>
         </w:tc>
         <w:tc>
@@ -732,6 +922,7 @@
                 <w:szCs w:val="24"/>
               </w:rPr>
             </w:pPr>
+            <w:proofErr w:type="spellStart"/>
             <w:r>
               <w:rPr>
                 <w:rFonts w:ascii="Arial Narrow" w:hAnsi="Arial Narrow" w:cs="Times New Roman"/>
@@ -740,6 +931,7 @@
               </w:rPr>
               <w:t>Kepada</w:t>
             </w:r>
+            <w:proofErr w:type="spellEnd"/>
           </w:p>
         </w:tc>
       </w:tr>
@@ -909,13 +1101,23 @@
                 <w:szCs w:val="24"/>
               </w:rPr>
             </w:pPr>
-            <w:r>
-              <w:rPr>
-                <w:rFonts w:ascii="Arial Narrow" w:hAnsi="Arial Narrow" w:cs="Times New Roman"/>
-                <w:sz w:val="24"/>
-                <w:szCs w:val="24"/>
-              </w:rPr>
-              <w:t>Yth.</w:t>
+            <w:proofErr w:type="spellStart"/>
+            <w:r>
+              <w:rPr>
+                <w:rFonts w:ascii="Arial Narrow" w:hAnsi="Arial Narrow" w:cs="Times New Roman"/>
+                <w:sz w:val="24"/>
+                <w:szCs w:val="24"/>
+              </w:rPr>
+              <w:t>Yth</w:t>
+            </w:r>
+            <w:proofErr w:type="spellEnd"/>
+            <w:r>
+              <w:rPr>
+                <w:rFonts w:ascii="Arial Narrow" w:hAnsi="Arial Narrow" w:cs="Times New Roman"/>
+                <w:sz w:val="24"/>
+                <w:szCs w:val="24"/>
+              </w:rPr>
+              <w:t>.</w:t>
             </w:r>
           </w:p>
         </w:tc>
@@ -953,7 +1155,25 @@
                 <w:sz w:val="24"/>
                 <w:szCs w:val="24"/>
               </w:rPr>
-              <w:t>${prosecutorName}</w:t>
+              <w:t>${</w:t>
+            </w:r>
+            <w:proofErr w:type="spellStart"/>
+            <w:r>
+              <w:rPr>
+                <w:rFonts w:ascii="Arial Narrow" w:hAnsi="Arial Narrow" w:cs="Times New Roman"/>
+                <w:sz w:val="24"/>
+                <w:szCs w:val="24"/>
+              </w:rPr>
+              <w:t>prosecutorName</w:t>
+            </w:r>
+            <w:proofErr w:type="spellEnd"/>
+            <w:r>
+              <w:rPr>
+                <w:rFonts w:ascii="Arial Narrow" w:hAnsi="Arial Narrow" w:cs="Times New Roman"/>
+                <w:sz w:val="24"/>
+                <w:szCs w:val="24"/>
+              </w:rPr>
+              <w:t>}</w:t>
             </w:r>
           </w:p>
         </w:tc>
@@ -1340,7 +1560,27 @@
                 <w:szCs w:val="24"/>
                 <w:u w:val="single"/>
               </w:rPr>
-              <w:t>${prosecutorLocation}</w:t>
+              <w:t>${</w:t>
+            </w:r>
+            <w:proofErr w:type="spellStart"/>
+            <w:r>
+              <w:rPr>
+                <w:rFonts w:ascii="Arial Narrow" w:hAnsi="Arial Narrow" w:cs="Times New Roman"/>
+                <w:sz w:val="24"/>
+                <w:szCs w:val="24"/>
+                <w:u w:val="single"/>
+              </w:rPr>
+              <w:t>prosecutorLocation</w:t>
+            </w:r>
+            <w:proofErr w:type="spellEnd"/>
+            <w:r>
+              <w:rPr>
+                <w:rFonts w:ascii="Arial Narrow" w:hAnsi="Arial Narrow" w:cs="Times New Roman"/>
+                <w:sz w:val="24"/>
+                <w:szCs w:val="24"/>
+                <w:u w:val="single"/>
+              </w:rPr>
+              <w:t>}</w:t>
             </w:r>
           </w:p>
         </w:tc>
@@ -1427,6 +1667,7 @@
                 <w:lang w:eastAsia="en-ID"/>
               </w:rPr>
             </w:pPr>
+            <w:proofErr w:type="spellStart"/>
             <w:r>
               <w:rPr>
                 <w:rFonts w:ascii="Arial Narrow" w:eastAsia="Times New Roman" w:hAnsi="Arial Narrow" w:cs="Times New Roman"/>
@@ -1436,6 +1677,7 @@
               </w:rPr>
               <w:t>Rujukan</w:t>
             </w:r>
+            <w:proofErr w:type="spellEnd"/>
             <w:r>
               <w:rPr>
                 <w:rFonts w:ascii="Arial Narrow" w:eastAsia="Times New Roman" w:hAnsi="Arial Narrow" w:cs="Times New Roman"/>
@@ -1507,13 +1749,95 @@
                 <w:szCs w:val="24"/>
               </w:rPr>
             </w:pPr>
-            <w:r>
-              <w:rPr>
-                <w:rFonts w:ascii="Arial Narrow" w:hAnsi="Arial Narrow" w:cs="Times New Roman"/>
-                <w:sz w:val="24"/>
-                <w:szCs w:val="24"/>
-              </w:rPr>
-              <w:t>Undang-Undang Nomor 2 Tahun 2002 tentang Kepolisian Negara Republik Indonesia;</w:t>
+            <w:proofErr w:type="spellStart"/>
+            <w:r>
+              <w:rPr>
+                <w:rFonts w:ascii="Arial Narrow" w:hAnsi="Arial Narrow" w:cs="Times New Roman"/>
+                <w:sz w:val="24"/>
+                <w:szCs w:val="24"/>
+              </w:rPr>
+              <w:t>Undang-Undang</w:t>
+            </w:r>
+            <w:proofErr w:type="spellEnd"/>
+            <w:r>
+              <w:rPr>
+                <w:rFonts w:ascii="Arial Narrow" w:hAnsi="Arial Narrow" w:cs="Times New Roman"/>
+                <w:sz w:val="24"/>
+                <w:szCs w:val="24"/>
+              </w:rPr>
+              <w:t xml:space="preserve"> </w:t>
+            </w:r>
+            <w:proofErr w:type="spellStart"/>
+            <w:r>
+              <w:rPr>
+                <w:rFonts w:ascii="Arial Narrow" w:hAnsi="Arial Narrow" w:cs="Times New Roman"/>
+                <w:sz w:val="24"/>
+                <w:szCs w:val="24"/>
+              </w:rPr>
+              <w:t>Nomor</w:t>
+            </w:r>
+            <w:proofErr w:type="spellEnd"/>
+            <w:r>
+              <w:rPr>
+                <w:rFonts w:ascii="Arial Narrow" w:hAnsi="Arial Narrow" w:cs="Times New Roman"/>
+                <w:sz w:val="24"/>
+                <w:szCs w:val="24"/>
+              </w:rPr>
+              <w:t xml:space="preserve"> 2 </w:t>
+            </w:r>
+            <w:proofErr w:type="spellStart"/>
+            <w:r>
+              <w:rPr>
+                <w:rFonts w:ascii="Arial Narrow" w:hAnsi="Arial Narrow" w:cs="Times New Roman"/>
+                <w:sz w:val="24"/>
+                <w:szCs w:val="24"/>
+              </w:rPr>
+              <w:t>Tahun</w:t>
+            </w:r>
+            <w:proofErr w:type="spellEnd"/>
+            <w:r>
+              <w:rPr>
+                <w:rFonts w:ascii="Arial Narrow" w:hAnsi="Arial Narrow" w:cs="Times New Roman"/>
+                <w:sz w:val="24"/>
+                <w:szCs w:val="24"/>
+              </w:rPr>
+              <w:t xml:space="preserve"> 2002 </w:t>
+            </w:r>
+            <w:proofErr w:type="spellStart"/>
+            <w:r>
+              <w:rPr>
+                <w:rFonts w:ascii="Arial Narrow" w:hAnsi="Arial Narrow" w:cs="Times New Roman"/>
+                <w:sz w:val="24"/>
+                <w:szCs w:val="24"/>
+              </w:rPr>
+              <w:t>tentang</w:t>
+            </w:r>
+            <w:proofErr w:type="spellEnd"/>
+            <w:r>
+              <w:rPr>
+                <w:rFonts w:ascii="Arial Narrow" w:hAnsi="Arial Narrow" w:cs="Times New Roman"/>
+                <w:sz w:val="24"/>
+                <w:szCs w:val="24"/>
+              </w:rPr>
+              <w:t xml:space="preserve"> </w:t>
+            </w:r>
+            <w:proofErr w:type="spellStart"/>
+            <w:r>
+              <w:rPr>
+                <w:rFonts w:ascii="Arial Narrow" w:hAnsi="Arial Narrow" w:cs="Times New Roman"/>
+                <w:sz w:val="24"/>
+                <w:szCs w:val="24"/>
+              </w:rPr>
+              <w:t>Kepolisian</w:t>
+            </w:r>
+            <w:proofErr w:type="spellEnd"/>
+            <w:r>
+              <w:rPr>
+                <w:rFonts w:ascii="Arial Narrow" w:hAnsi="Arial Narrow" w:cs="Times New Roman"/>
+                <w:sz w:val="24"/>
+                <w:szCs w:val="24"/>
+              </w:rPr>
+              <w:t xml:space="preserve"> Negara Republik Indonesia;</w:t>
             </w:r>
           </w:p>
         </w:tc>
@@ -1583,7 +1907,115 @@
                 <w:sz w:val="24"/>
                 <w:szCs w:val="24"/>
               </w:rPr>
-              <w:t>Pasal 3 dan Pasal 618 Undang-Undang Nomor 1 Tahun 2023 tentang Kitab Undang-Undang Hukum Pidana;</w:t>
+              <w:t xml:space="preserve">Pasal 3 dan Pasal 618 </w:t>
+            </w:r>
+            <w:proofErr w:type="spellStart"/>
+            <w:r>
+              <w:rPr>
+                <w:rFonts w:ascii="Arial Narrow" w:hAnsi="Arial Narrow" w:cs="Times New Roman"/>
+                <w:sz w:val="24"/>
+                <w:szCs w:val="24"/>
+              </w:rPr>
+              <w:t>Undang-Undang</w:t>
+            </w:r>
+            <w:proofErr w:type="spellEnd"/>
+            <w:r>
+              <w:rPr>
+                <w:rFonts w:ascii="Arial Narrow" w:hAnsi="Arial Narrow" w:cs="Times New Roman"/>
+                <w:sz w:val="24"/>
+                <w:szCs w:val="24"/>
+              </w:rPr>
+              <w:t xml:space="preserve"> </w:t>
+            </w:r>
+            <w:proofErr w:type="spellStart"/>
+            <w:r>
+              <w:rPr>
+                <w:rFonts w:ascii="Arial Narrow" w:hAnsi="Arial Narrow" w:cs="Times New Roman"/>
+                <w:sz w:val="24"/>
+                <w:szCs w:val="24"/>
+              </w:rPr>
+              <w:t>Nomor</w:t>
+            </w:r>
+            <w:proofErr w:type="spellEnd"/>
+            <w:r>
+              <w:rPr>
+                <w:rFonts w:ascii="Arial Narrow" w:hAnsi="Arial Narrow" w:cs="Times New Roman"/>
+                <w:sz w:val="24"/>
+                <w:szCs w:val="24"/>
+              </w:rPr>
+              <w:t xml:space="preserve"> 1 </w:t>
+            </w:r>
+            <w:proofErr w:type="spellStart"/>
+            <w:r>
+              <w:rPr>
+                <w:rFonts w:ascii="Arial Narrow" w:hAnsi="Arial Narrow" w:cs="Times New Roman"/>
+                <w:sz w:val="24"/>
+                <w:szCs w:val="24"/>
+              </w:rPr>
+              <w:t>Tahun</w:t>
+            </w:r>
+            <w:proofErr w:type="spellEnd"/>
+            <w:r>
+              <w:rPr>
+                <w:rFonts w:ascii="Arial Narrow" w:hAnsi="Arial Narrow" w:cs="Times New Roman"/>
+                <w:sz w:val="24"/>
+                <w:szCs w:val="24"/>
+              </w:rPr>
+              <w:t xml:space="preserve"> 2023 </w:t>
+            </w:r>
+            <w:proofErr w:type="spellStart"/>
+            <w:r>
+              <w:rPr>
+                <w:rFonts w:ascii="Arial Narrow" w:hAnsi="Arial Narrow" w:cs="Times New Roman"/>
+                <w:sz w:val="24"/>
+                <w:szCs w:val="24"/>
+              </w:rPr>
+              <w:t>tentang</w:t>
+            </w:r>
+            <w:proofErr w:type="spellEnd"/>
+            <w:r>
+              <w:rPr>
+                <w:rFonts w:ascii="Arial Narrow" w:hAnsi="Arial Narrow" w:cs="Times New Roman"/>
+                <w:sz w:val="24"/>
+                <w:szCs w:val="24"/>
+              </w:rPr>
+              <w:t xml:space="preserve"> Kitab </w:t>
+            </w:r>
+            <w:proofErr w:type="spellStart"/>
+            <w:r>
+              <w:rPr>
+                <w:rFonts w:ascii="Arial Narrow" w:hAnsi="Arial Narrow" w:cs="Times New Roman"/>
+                <w:sz w:val="24"/>
+                <w:szCs w:val="24"/>
+              </w:rPr>
+              <w:t>Undang-Undang</w:t>
+            </w:r>
+            <w:proofErr w:type="spellEnd"/>
+            <w:r>
+              <w:rPr>
+                <w:rFonts w:ascii="Arial Narrow" w:hAnsi="Arial Narrow" w:cs="Times New Roman"/>
+                <w:sz w:val="24"/>
+                <w:szCs w:val="24"/>
+              </w:rPr>
+              <w:t xml:space="preserve"> Hukum </w:t>
+            </w:r>
+            <w:proofErr w:type="spellStart"/>
+            <w:r>
+              <w:rPr>
+                <w:rFonts w:ascii="Arial Narrow" w:hAnsi="Arial Narrow" w:cs="Times New Roman"/>
+                <w:sz w:val="24"/>
+                <w:szCs w:val="24"/>
+              </w:rPr>
+              <w:t>Pidana</w:t>
+            </w:r>
+            <w:proofErr w:type="spellEnd"/>
+            <w:r>
+              <w:rPr>
+                <w:rFonts w:ascii="Arial Narrow" w:hAnsi="Arial Narrow" w:cs="Times New Roman"/>
+                <w:sz w:val="24"/>
+                <w:szCs w:val="24"/>
+              </w:rPr>
+              <w:t>;</w:t>
             </w:r>
           </w:p>
         </w:tc>
@@ -1728,7 +2160,29 @@
                 <w:shd w:val="clear" w:color="auto" w:fill="FFFFFF"/>
                 <w:lang w:eastAsia="en-ID"/>
               </w:rPr>
-              <w:t>${rujukan_undang_undang};</w:t>
+              <w:t>${</w:t>
+            </w:r>
+            <w:proofErr w:type="spellStart"/>
+            <w:r>
+              <w:rPr>
+                <w:rFonts w:ascii="Arial Narrow" w:eastAsia="Times New Roman" w:hAnsi="Arial Narrow" w:cs="Times New Roman"/>
+                <w:sz w:val="24"/>
+                <w:szCs w:val="24"/>
+                <w:shd w:val="clear" w:color="auto" w:fill="FFFFFF"/>
+                <w:lang w:eastAsia="en-ID"/>
+              </w:rPr>
+              <w:t>rujukan_undang_undang</w:t>
+            </w:r>
+            <w:proofErr w:type="spellEnd"/>
+            <w:r>
+              <w:rPr>
+                <w:rFonts w:ascii="Arial Narrow" w:eastAsia="Times New Roman" w:hAnsi="Arial Narrow" w:cs="Times New Roman"/>
+                <w:sz w:val="24"/>
+                <w:szCs w:val="24"/>
+                <w:shd w:val="clear" w:color="auto" w:fill="FFFFFF"/>
+                <w:lang w:eastAsia="en-ID"/>
+              </w:rPr>
+              <w:t>};</w:t>
             </w:r>
           </w:p>
         </w:tc>
@@ -2054,6 +2508,7 @@
                 <w:lang w:eastAsia="en-ID"/>
               </w:rPr>
             </w:pPr>
+            <w:proofErr w:type="spellStart"/>
             <w:r>
               <w:rPr>
                 <w:rFonts w:ascii="Arial Narrow" w:eastAsia="Times New Roman" w:hAnsi="Arial Narrow" w:cs="Times New Roman"/>
@@ -2062,7 +2517,18 @@
                 <w:shd w:val="clear" w:color="auto" w:fill="FFFFFF"/>
                 <w:lang w:eastAsia="en-ID"/>
               </w:rPr>
-              <w:t>i.</w:t>
+              <w:t>i</w:t>
+            </w:r>
+            <w:proofErr w:type="spellEnd"/>
+            <w:r>
+              <w:rPr>
+                <w:rFonts w:ascii="Arial Narrow" w:eastAsia="Times New Roman" w:hAnsi="Arial Narrow" w:cs="Times New Roman"/>
+                <w:sz w:val="24"/>
+                <w:szCs w:val="24"/>
+                <w:shd w:val="clear" w:color="auto" w:fill="FFFFFF"/>
+                <w:lang w:eastAsia="en-ID"/>
+              </w:rPr>
+              <w:t>.</w:t>
             </w:r>
           </w:p>
         </w:tc>
@@ -2588,7 +3054,29 @@
                       <w:sz w:val="24"/>
                       <w:szCs w:val="24"/>
                     </w:rPr>
-                    <w:t>${suspectName}</w:t>
+                    <w:t>${</w:t>
+                  </w:r>
+                  <w:proofErr w:type="spellStart"/>
+                  <w:r>
+                    <w:rPr>
+                      <w:rFonts w:ascii="Arial Narrow" w:eastAsia="Arial Narrow" w:hAnsi="Arial Narrow" w:cs="Times New Roman"/>
+                      <w:bCs/>
+                      <w:color w:val="000000"/>
+                      <w:sz w:val="24"/>
+                      <w:szCs w:val="24"/>
+                    </w:rPr>
+                    <w:t>suspectName</w:t>
+                  </w:r>
+                  <w:proofErr w:type="spellEnd"/>
+                  <w:r>
+                    <w:rPr>
+                      <w:rFonts w:ascii="Arial Narrow" w:eastAsia="Arial Narrow" w:hAnsi="Arial Narrow" w:cs="Times New Roman"/>
+                      <w:bCs/>
+                      <w:color w:val="000000"/>
+                      <w:sz w:val="24"/>
+                      <w:szCs w:val="24"/>
+                    </w:rPr>
+                    <w:t>}</w:t>
                   </w:r>
                 </w:p>
               </w:tc>
@@ -2636,6 +3124,7 @@
                       <w:lang w:eastAsia="en-ID"/>
                     </w:rPr>
                   </w:pPr>
+                  <w:proofErr w:type="spellStart"/>
                   <w:r>
                     <w:rPr>
                       <w:rFonts w:ascii="Arial Narrow" w:eastAsia="Times New Roman" w:hAnsi="Arial Narrow" w:cs="Times New Roman"/>
@@ -2644,8 +3133,31 @@
                       <w:shd w:val="clear" w:color="auto" w:fill="FFFFFF"/>
                       <w:lang w:eastAsia="en-ID"/>
                     </w:rPr>
-                    <w:t>nomor identitas</w:t>
-                  </w:r>
+                    <w:t>nomor</w:t>
+                  </w:r>
+                  <w:proofErr w:type="spellEnd"/>
+                  <w:r>
+                    <w:rPr>
+                      <w:rFonts w:ascii="Arial Narrow" w:eastAsia="Times New Roman" w:hAnsi="Arial Narrow" w:cs="Times New Roman"/>
+                      <w:sz w:val="24"/>
+                      <w:szCs w:val="24"/>
+                      <w:shd w:val="clear" w:color="auto" w:fill="FFFFFF"/>
+                      <w:lang w:eastAsia="en-ID"/>
+                    </w:rPr>
+                    <w:t xml:space="preserve"> </w:t>
+                  </w:r>
+                  <w:proofErr w:type="spellStart"/>
+                  <w:r>
+                    <w:rPr>
+                      <w:rFonts w:ascii="Arial Narrow" w:eastAsia="Times New Roman" w:hAnsi="Arial Narrow" w:cs="Times New Roman"/>
+                      <w:sz w:val="24"/>
+                      <w:szCs w:val="24"/>
+                      <w:shd w:val="clear" w:color="auto" w:fill="FFFFFF"/>
+                      <w:lang w:eastAsia="en-ID"/>
+                    </w:rPr>
+                    <w:t>identitas</w:t>
+                  </w:r>
+                  <w:proofErr w:type="spellEnd"/>
                 </w:p>
               </w:tc>
               <w:tc>
@@ -2698,7 +3210,29 @@
                       <w:sz w:val="24"/>
                       <w:szCs w:val="24"/>
                     </w:rPr>
-                    <w:t>${suspectIdentityNumber}</w:t>
+                    <w:t>${</w:t>
+                  </w:r>
+                  <w:proofErr w:type="spellStart"/>
+                  <w:r>
+                    <w:rPr>
+                      <w:rFonts w:ascii="Arial Narrow" w:eastAsia="Arial Narrow" w:hAnsi="Arial Narrow" w:cs="Times New Roman"/>
+                      <w:bCs/>
+                      <w:color w:val="000000"/>
+                      <w:sz w:val="24"/>
+                      <w:szCs w:val="24"/>
+                    </w:rPr>
+                    <w:t>suspectIdentityNumber</w:t>
+                  </w:r>
+                  <w:proofErr w:type="spellEnd"/>
+                  <w:r>
+                    <w:rPr>
+                      <w:rFonts w:ascii="Arial Narrow" w:eastAsia="Arial Narrow" w:hAnsi="Arial Narrow" w:cs="Times New Roman"/>
+                      <w:bCs/>
+                      <w:color w:val="000000"/>
+                      <w:sz w:val="24"/>
+                      <w:szCs w:val="24"/>
+                    </w:rPr>
+                    <w:t>}</w:t>
                   </w:r>
                 </w:p>
               </w:tc>
@@ -2746,6 +3280,7 @@
                       <w:lang w:eastAsia="en-ID"/>
                     </w:rPr>
                   </w:pPr>
+                  <w:proofErr w:type="spellStart"/>
                   <w:r>
                     <w:rPr>
                       <w:rFonts w:ascii="Arial Narrow" w:eastAsia="Times New Roman" w:hAnsi="Arial Narrow" w:cs="Times New Roman"/>
@@ -2764,8 +3299,31 @@
                       <w:shd w:val="clear" w:color="auto" w:fill="FFFFFF"/>
                       <w:lang w:eastAsia="en-ID"/>
                     </w:rPr>
-                    <w:t>enis kelamin</w:t>
-                  </w:r>
+                    <w:t>enis</w:t>
+                  </w:r>
+                  <w:proofErr w:type="spellEnd"/>
+                  <w:r>
+                    <w:rPr>
+                      <w:rFonts w:ascii="Arial Narrow" w:eastAsia="Times New Roman" w:hAnsi="Arial Narrow" w:cs="Times New Roman"/>
+                      <w:sz w:val="24"/>
+                      <w:szCs w:val="24"/>
+                      <w:shd w:val="clear" w:color="auto" w:fill="FFFFFF"/>
+                      <w:lang w:eastAsia="en-ID"/>
+                    </w:rPr>
+                    <w:t xml:space="preserve"> </w:t>
+                  </w:r>
+                  <w:proofErr w:type="spellStart"/>
+                  <w:r>
+                    <w:rPr>
+                      <w:rFonts w:ascii="Arial Narrow" w:eastAsia="Times New Roman" w:hAnsi="Arial Narrow" w:cs="Times New Roman"/>
+                      <w:sz w:val="24"/>
+                      <w:szCs w:val="24"/>
+                      <w:shd w:val="clear" w:color="auto" w:fill="FFFFFF"/>
+                      <w:lang w:eastAsia="en-ID"/>
+                    </w:rPr>
+                    <w:t>kelamin</w:t>
+                  </w:r>
+                  <w:proofErr w:type="spellEnd"/>
                 </w:p>
               </w:tc>
               <w:tc>
@@ -2818,7 +3376,29 @@
                       <w:sz w:val="24"/>
                       <w:szCs w:val="24"/>
                     </w:rPr>
-                    <w:t>${suspectGenderName}</w:t>
+                    <w:t>${</w:t>
+                  </w:r>
+                  <w:proofErr w:type="spellStart"/>
+                  <w:r>
+                    <w:rPr>
+                      <w:rFonts w:ascii="Arial Narrow" w:eastAsia="Arial Narrow" w:hAnsi="Arial Narrow" w:cs="Times New Roman"/>
+                      <w:bCs/>
+                      <w:color w:val="000000"/>
+                      <w:sz w:val="24"/>
+                      <w:szCs w:val="24"/>
+                    </w:rPr>
+                    <w:t>suspectGenderName</w:t>
+                  </w:r>
+                  <w:proofErr w:type="spellEnd"/>
+                  <w:r>
+                    <w:rPr>
+                      <w:rFonts w:ascii="Arial Narrow" w:eastAsia="Arial Narrow" w:hAnsi="Arial Narrow" w:cs="Times New Roman"/>
+                      <w:bCs/>
+                      <w:color w:val="000000"/>
+                      <w:sz w:val="24"/>
+                      <w:szCs w:val="24"/>
+                    </w:rPr>
+                    <w:t>}</w:t>
                   </w:r>
                 </w:p>
               </w:tc>
@@ -2866,6 +3446,7 @@
                       <w:lang w:eastAsia="en-ID"/>
                     </w:rPr>
                   </w:pPr>
+                  <w:proofErr w:type="spellStart"/>
                   <w:r>
                     <w:rPr>
                       <w:rFonts w:ascii="Arial Narrow" w:eastAsia="Times New Roman" w:hAnsi="Arial Narrow" w:cs="Times New Roman"/>
@@ -2874,8 +3455,9 @@
                       <w:shd w:val="clear" w:color="auto" w:fill="FFFFFF"/>
                       <w:lang w:eastAsia="en-ID"/>
                     </w:rPr>
-                    <w:t>tempat/</w:t>
-                  </w:r>
+                    <w:t>tempat</w:t>
+                  </w:r>
+                  <w:proofErr w:type="spellEnd"/>
                   <w:r>
                     <w:rPr>
                       <w:rFonts w:ascii="Arial Narrow" w:eastAsia="Times New Roman" w:hAnsi="Arial Narrow" w:cs="Times New Roman"/>
@@ -2884,8 +3466,9 @@
                       <w:shd w:val="clear" w:color="auto" w:fill="FFFFFF"/>
                       <w:lang w:eastAsia="en-ID"/>
                     </w:rPr>
-                    <w:t>tgl</w:t>
-                  </w:r>
+                    <w:t>/</w:t>
+                  </w:r>
+                  <w:proofErr w:type="spellStart"/>
                   <w:r>
                     <w:rPr>
                       <w:rFonts w:ascii="Arial Narrow" w:eastAsia="Times New Roman" w:hAnsi="Arial Narrow" w:cs="Times New Roman"/>
@@ -2894,8 +3477,31 @@
                       <w:shd w:val="clear" w:color="auto" w:fill="FFFFFF"/>
                       <w:lang w:eastAsia="en-ID"/>
                     </w:rPr>
-                    <w:t xml:space="preserve"> lahir</w:t>
-                  </w:r>
+                    <w:t>tgl</w:t>
+                  </w:r>
+                  <w:proofErr w:type="spellEnd"/>
+                  <w:r>
+                    <w:rPr>
+                      <w:rFonts w:ascii="Arial Narrow" w:eastAsia="Times New Roman" w:hAnsi="Arial Narrow" w:cs="Times New Roman"/>
+                      <w:sz w:val="24"/>
+                      <w:szCs w:val="24"/>
+                      <w:shd w:val="clear" w:color="auto" w:fill="FFFFFF"/>
+                      <w:lang w:eastAsia="en-ID"/>
+                    </w:rPr>
+                    <w:t xml:space="preserve"> </w:t>
+                  </w:r>
+                  <w:proofErr w:type="spellStart"/>
+                  <w:r>
+                    <w:rPr>
+                      <w:rFonts w:ascii="Arial Narrow" w:eastAsia="Times New Roman" w:hAnsi="Arial Narrow" w:cs="Times New Roman"/>
+                      <w:sz w:val="24"/>
+                      <w:szCs w:val="24"/>
+                      <w:shd w:val="clear" w:color="auto" w:fill="FFFFFF"/>
+                      <w:lang w:eastAsia="en-ID"/>
+                    </w:rPr>
+                    <w:t>lahir</w:t>
+                  </w:r>
+                  <w:proofErr w:type="spellEnd"/>
                 </w:p>
               </w:tc>
               <w:tc>
@@ -2948,18 +3554,9 @@
                       <w:sz w:val="24"/>
                       <w:szCs w:val="24"/>
                     </w:rPr>
-                    <w:t>${suspectBirthPlace}</w:t>
-                  </w:r>
-                  <w:r>
-                    <w:rPr>
-                      <w:rFonts w:ascii="Arial Narrow" w:eastAsia="Times New Roman" w:hAnsi="Arial Narrow" w:cs="Times New Roman"/>
-                      <w:sz w:val="24"/>
-                      <w:szCs w:val="24"/>
-                      <w:shd w:val="clear" w:color="auto" w:fill="FFFFFF"/>
-                      <w:lang w:eastAsia="en-ID"/>
-                    </w:rPr>
-                    <w:t>/</w:t>
-                  </w:r>
+                    <w:t>${</w:t>
+                  </w:r>
+                  <w:proofErr w:type="spellStart"/>
                   <w:r>
                     <w:rPr>
                       <w:rFonts w:ascii="Arial Narrow" w:eastAsia="Arial Narrow" w:hAnsi="Arial Narrow" w:cs="Times New Roman"/>
@@ -2968,7 +3565,60 @@
                       <w:sz w:val="24"/>
                       <w:szCs w:val="24"/>
                     </w:rPr>
-                    <w:t>${suspectBirthDate}</w:t>
+                    <w:t>suspectBirthPlace</w:t>
+                  </w:r>
+                  <w:proofErr w:type="spellEnd"/>
+                  <w:r>
+                    <w:rPr>
+                      <w:rFonts w:ascii="Arial Narrow" w:eastAsia="Arial Narrow" w:hAnsi="Arial Narrow" w:cs="Times New Roman"/>
+                      <w:bCs/>
+                      <w:color w:val="000000"/>
+                      <w:sz w:val="24"/>
+                      <w:szCs w:val="24"/>
+                    </w:rPr>
+                    <w:t>}</w:t>
+                  </w:r>
+                  <w:r>
+                    <w:rPr>
+                      <w:rFonts w:ascii="Arial Narrow" w:eastAsia="Times New Roman" w:hAnsi="Arial Narrow" w:cs="Times New Roman"/>
+                      <w:sz w:val="24"/>
+                      <w:szCs w:val="24"/>
+                      <w:shd w:val="clear" w:color="auto" w:fill="FFFFFF"/>
+                      <w:lang w:eastAsia="en-ID"/>
+                    </w:rPr>
+                    <w:t>/</w:t>
+                  </w:r>
+                  <w:r>
+                    <w:rPr>
+                      <w:rFonts w:ascii="Arial Narrow" w:eastAsia="Arial Narrow" w:hAnsi="Arial Narrow" w:cs="Times New Roman"/>
+                      <w:bCs/>
+                      <w:color w:val="000000"/>
+                      <w:sz w:val="24"/>
+                      <w:szCs w:val="24"/>
+                    </w:rPr>
+                    <w:t>${</w:t>
+                  </w:r>
+                  <w:proofErr w:type="spellStart"/>
+                  <w:r>
+                    <w:rPr>
+                      <w:rFonts w:ascii="Arial Narrow" w:eastAsia="Arial Narrow" w:hAnsi="Arial Narrow" w:cs="Times New Roman"/>
+                      <w:bCs/>
+                      <w:color w:val="000000"/>
+                      <w:sz w:val="24"/>
+                      <w:szCs w:val="24"/>
+                    </w:rPr>
+                    <w:t>suspectBirthDate</w:t>
+                  </w:r>
+                  <w:proofErr w:type="spellEnd"/>
+                  <w:r>
+                    <w:rPr>
+                      <w:rFonts w:ascii="Arial Narrow" w:eastAsia="Arial Narrow" w:hAnsi="Arial Narrow" w:cs="Times New Roman"/>
+                      <w:bCs/>
+                      <w:color w:val="000000"/>
+                      <w:sz w:val="24"/>
+                      <w:szCs w:val="24"/>
+                    </w:rPr>
+                    <w:t>}</w:t>
                   </w:r>
                 </w:p>
               </w:tc>
@@ -3016,6 +3666,7 @@
                       <w:lang w:eastAsia="en-ID"/>
                     </w:rPr>
                   </w:pPr>
+                  <w:proofErr w:type="spellStart"/>
                   <w:r>
                     <w:rPr>
                       <w:rFonts w:ascii="Arial Narrow" w:eastAsia="Times New Roman" w:hAnsi="Arial Narrow" w:cs="Times New Roman"/>
@@ -3026,6 +3677,7 @@
                     </w:rPr>
                     <w:t>pekerjaan</w:t>
                   </w:r>
+                  <w:proofErr w:type="spellEnd"/>
                 </w:p>
               </w:tc>
               <w:tc>
@@ -3078,7 +3730,29 @@
                       <w:sz w:val="24"/>
                       <w:szCs w:val="24"/>
                     </w:rPr>
-                    <w:t>${suspectJobName}</w:t>
+                    <w:t>${</w:t>
+                  </w:r>
+                  <w:proofErr w:type="spellStart"/>
+                  <w:r>
+                    <w:rPr>
+                      <w:rFonts w:ascii="Arial Narrow" w:eastAsia="Arial Narrow" w:hAnsi="Arial Narrow" w:cs="Times New Roman"/>
+                      <w:bCs/>
+                      <w:color w:val="000000"/>
+                      <w:sz w:val="24"/>
+                      <w:szCs w:val="24"/>
+                    </w:rPr>
+                    <w:t>suspectJobName</w:t>
+                  </w:r>
+                  <w:proofErr w:type="spellEnd"/>
+                  <w:r>
+                    <w:rPr>
+                      <w:rFonts w:ascii="Arial Narrow" w:eastAsia="Arial Narrow" w:hAnsi="Arial Narrow" w:cs="Times New Roman"/>
+                      <w:bCs/>
+                      <w:color w:val="000000"/>
+                      <w:sz w:val="24"/>
+                      <w:szCs w:val="24"/>
+                    </w:rPr>
+                    <w:t>}</w:t>
                   </w:r>
                 </w:p>
               </w:tc>
@@ -3188,7 +3862,29 @@
                       <w:sz w:val="24"/>
                       <w:szCs w:val="24"/>
                     </w:rPr>
-                    <w:t>${suspectReligionName}</w:t>
+                    <w:t>${</w:t>
+                  </w:r>
+                  <w:proofErr w:type="spellStart"/>
+                  <w:r>
+                    <w:rPr>
+                      <w:rFonts w:ascii="Arial Narrow" w:eastAsia="Arial Narrow" w:hAnsi="Arial Narrow" w:cs="Times New Roman"/>
+                      <w:bCs/>
+                      <w:color w:val="000000"/>
+                      <w:sz w:val="24"/>
+                      <w:szCs w:val="24"/>
+                    </w:rPr>
+                    <w:t>suspectReligionName</w:t>
+                  </w:r>
+                  <w:proofErr w:type="spellEnd"/>
+                  <w:r>
+                    <w:rPr>
+                      <w:rFonts w:ascii="Arial Narrow" w:eastAsia="Arial Narrow" w:hAnsi="Arial Narrow" w:cs="Times New Roman"/>
+                      <w:bCs/>
+                      <w:color w:val="000000"/>
+                      <w:sz w:val="24"/>
+                      <w:szCs w:val="24"/>
+                    </w:rPr>
+                    <w:t>}</w:t>
                   </w:r>
                   <w:r>
                     <w:rPr>
@@ -3246,6 +3942,7 @@
                       <w:lang w:eastAsia="en-ID"/>
                     </w:rPr>
                   </w:pPr>
+                  <w:proofErr w:type="spellStart"/>
                   <w:r>
                     <w:rPr>
                       <w:rFonts w:ascii="Arial Narrow" w:eastAsia="Times New Roman" w:hAnsi="Arial Narrow" w:cs="Times New Roman"/>
@@ -3266,6 +3963,7 @@
                     </w:rPr>
                     <w:t>ewarganegaraan</w:t>
                   </w:r>
+                  <w:proofErr w:type="spellEnd"/>
                 </w:p>
               </w:tc>
               <w:tc>
@@ -3318,7 +4016,29 @@
                       <w:sz w:val="24"/>
                       <w:szCs w:val="24"/>
                     </w:rPr>
-                    <w:t>${suspectNationality}</w:t>
+                    <w:t>${</w:t>
+                  </w:r>
+                  <w:proofErr w:type="spellStart"/>
+                  <w:r>
+                    <w:rPr>
+                      <w:rFonts w:ascii="Arial Narrow" w:eastAsia="Arial Narrow" w:hAnsi="Arial Narrow" w:cs="Times New Roman"/>
+                      <w:bCs/>
+                      <w:color w:val="000000"/>
+                      <w:sz w:val="24"/>
+                      <w:szCs w:val="24"/>
+                    </w:rPr>
+                    <w:t>suspectNationality</w:t>
+                  </w:r>
+                  <w:proofErr w:type="spellEnd"/>
+                  <w:r>
+                    <w:rPr>
+                      <w:rFonts w:ascii="Arial Narrow" w:eastAsia="Arial Narrow" w:hAnsi="Arial Narrow" w:cs="Times New Roman"/>
+                      <w:bCs/>
+                      <w:color w:val="000000"/>
+                      <w:sz w:val="24"/>
+                      <w:szCs w:val="24"/>
+                    </w:rPr>
+                    <w:t>}</w:t>
                   </w:r>
                 </w:p>
               </w:tc>
@@ -3366,6 +4086,7 @@
                       <w:lang w:eastAsia="en-ID"/>
                     </w:rPr>
                   </w:pPr>
+                  <w:proofErr w:type="spellStart"/>
                   <w:r>
                     <w:rPr>
                       <w:rFonts w:ascii="Arial Narrow" w:hAnsi="Arial Narrow" w:cs="Times New Roman"/>
@@ -3382,14 +4103,43 @@
                     </w:rPr>
                     <w:t>lamat</w:t>
                   </w:r>
+                  <w:proofErr w:type="spellEnd"/>
                   <w:r>
                     <w:rPr>
                       <w:rFonts w:ascii="Arial Narrow" w:hAnsi="Arial Narrow" w:cs="Times New Roman"/>
                       <w:sz w:val="24"/>
                       <w:szCs w:val="24"/>
                     </w:rPr>
-                    <w:t>/tempat tinggal</w:t>
-                  </w:r>
+                    <w:t>/</w:t>
+                  </w:r>
+                  <w:proofErr w:type="spellStart"/>
+                  <w:r>
+                    <w:rPr>
+                      <w:rFonts w:ascii="Arial Narrow" w:hAnsi="Arial Narrow" w:cs="Times New Roman"/>
+                      <w:sz w:val="24"/>
+                      <w:szCs w:val="24"/>
+                    </w:rPr>
+                    <w:t>tempat</w:t>
+                  </w:r>
+                  <w:proofErr w:type="spellEnd"/>
+                  <w:r>
+                    <w:rPr>
+                      <w:rFonts w:ascii="Arial Narrow" w:hAnsi="Arial Narrow" w:cs="Times New Roman"/>
+                      <w:sz w:val="24"/>
+                      <w:szCs w:val="24"/>
+                    </w:rPr>
+                    <w:t xml:space="preserve"> </w:t>
+                  </w:r>
+                  <w:proofErr w:type="spellStart"/>
+                  <w:r>
+                    <w:rPr>
+                      <w:rFonts w:ascii="Arial Narrow" w:hAnsi="Arial Narrow" w:cs="Times New Roman"/>
+                      <w:sz w:val="24"/>
+                      <w:szCs w:val="24"/>
+                    </w:rPr>
+                    <w:t>tinggal</w:t>
+                  </w:r>
+                  <w:proofErr w:type="spellEnd"/>
                 </w:p>
               </w:tc>
               <w:tc>
@@ -3445,7 +4195,29 @@
                       <w:sz w:val="24"/>
                       <w:szCs w:val="24"/>
                     </w:rPr>
-                    <w:t>${suspectFullAddress}</w:t>
+                    <w:t>${</w:t>
+                  </w:r>
+                  <w:proofErr w:type="spellStart"/>
+                  <w:r>
+                    <w:rPr>
+                      <w:rFonts w:ascii="Arial Narrow" w:eastAsia="Arial Narrow" w:hAnsi="Arial Narrow" w:cs="Times New Roman"/>
+                      <w:bCs/>
+                      <w:color w:val="000000"/>
+                      <w:sz w:val="24"/>
+                      <w:szCs w:val="24"/>
+                    </w:rPr>
+                    <w:t>suspectFullAddress</w:t>
+                  </w:r>
+                  <w:proofErr w:type="spellEnd"/>
+                  <w:r>
+                    <w:rPr>
+                      <w:rFonts w:ascii="Arial Narrow" w:eastAsia="Arial Narrow" w:hAnsi="Arial Narrow" w:cs="Times New Roman"/>
+                      <w:bCs/>
+                      <w:color w:val="000000"/>
+                      <w:sz w:val="24"/>
+                      <w:szCs w:val="24"/>
+                    </w:rPr>
+                    <w:t>}</w:t>
                   </w:r>
                 </w:p>
               </w:tc>
@@ -3620,21 +4392,1273 @@
                 <w:szCs w:val="24"/>
               </w:rPr>
             </w:pPr>
-            <w:r>
-              <w:rPr>
-                <w:rFonts w:ascii="Arial Narrow" w:hAnsi="Arial Narrow" w:cs="Times New Roman"/>
-                <w:sz w:val="24"/>
-                <w:szCs w:val="24"/>
-              </w:rPr>
-              <w:t xml:space="preserve">Berkaitan dengan hal tersebut, dikarenakan tersangka menderita gangguan fisik atau mental yang berat yang dibuktikan dengan surat keterangan dokter atau perkara yang sedang diperiksa diancam dengan pidana penjara 9 (sembilan) tahun atau lebih*), untuk kepentingan proses penyidikan karena pemeriksaan terhadap tersangka dan proses penyidikan perkaranya belum selesai, sedangkan masa penahanan dari pengadilan negeri akan berakhir pada tanggal </w:t>
-            </w:r>
-            <w:r>
-              <w:rPr>
-                <w:rFonts w:ascii="Arial Narrow" w:hAnsi="Arial Narrow" w:cs="Times New Roman"/>
-                <w:sz w:val="24"/>
-                <w:szCs w:val="24"/>
-              </w:rPr>
-              <w:t>${pengadilan_negeri_akhir_tanggal}, maka penyidik mengajukan permohonan kepada Ketua untuk dapatnya penahanan terhadap tersangka diperpanjang selama ${requestedExtensionDays} (tiga puluh) hari di rutan ${rutan_name} dari tanggal ${extensionStartDate} s.d. ${extensionEndDate}.</w:t>
+            <w:proofErr w:type="spellStart"/>
+            <w:r>
+              <w:rPr>
+                <w:rFonts w:ascii="Arial Narrow" w:hAnsi="Arial Narrow" w:cs="Times New Roman"/>
+                <w:sz w:val="24"/>
+                <w:szCs w:val="24"/>
+              </w:rPr>
+              <w:t>Berkaitan</w:t>
+            </w:r>
+            <w:proofErr w:type="spellEnd"/>
+            <w:r>
+              <w:rPr>
+                <w:rFonts w:ascii="Arial Narrow" w:hAnsi="Arial Narrow" w:cs="Times New Roman"/>
+                <w:sz w:val="24"/>
+                <w:szCs w:val="24"/>
+              </w:rPr>
+              <w:t xml:space="preserve"> </w:t>
+            </w:r>
+            <w:proofErr w:type="spellStart"/>
+            <w:r>
+              <w:rPr>
+                <w:rFonts w:ascii="Arial Narrow" w:hAnsi="Arial Narrow" w:cs="Times New Roman"/>
+                <w:sz w:val="24"/>
+                <w:szCs w:val="24"/>
+              </w:rPr>
+              <w:t>dengan</w:t>
+            </w:r>
+            <w:proofErr w:type="spellEnd"/>
+            <w:r>
+              <w:rPr>
+                <w:rFonts w:ascii="Arial Narrow" w:hAnsi="Arial Narrow" w:cs="Times New Roman"/>
+                <w:sz w:val="24"/>
+                <w:szCs w:val="24"/>
+              </w:rPr>
+              <w:t xml:space="preserve"> </w:t>
+            </w:r>
+            <w:proofErr w:type="spellStart"/>
+            <w:r>
+              <w:rPr>
+                <w:rFonts w:ascii="Arial Narrow" w:hAnsi="Arial Narrow" w:cs="Times New Roman"/>
+                <w:sz w:val="24"/>
+                <w:szCs w:val="24"/>
+              </w:rPr>
+              <w:t>hal</w:t>
+            </w:r>
+            <w:proofErr w:type="spellEnd"/>
+            <w:r>
+              <w:rPr>
+                <w:rFonts w:ascii="Arial Narrow" w:hAnsi="Arial Narrow" w:cs="Times New Roman"/>
+                <w:sz w:val="24"/>
+                <w:szCs w:val="24"/>
+              </w:rPr>
+              <w:t xml:space="preserve"> </w:t>
+            </w:r>
+            <w:proofErr w:type="spellStart"/>
+            <w:r>
+              <w:rPr>
+                <w:rFonts w:ascii="Arial Narrow" w:hAnsi="Arial Narrow" w:cs="Times New Roman"/>
+                <w:sz w:val="24"/>
+                <w:szCs w:val="24"/>
+              </w:rPr>
+              <w:t>tersebut</w:t>
+            </w:r>
+            <w:proofErr w:type="spellEnd"/>
+            <w:r>
+              <w:rPr>
+                <w:rFonts w:ascii="Arial Narrow" w:hAnsi="Arial Narrow" w:cs="Times New Roman"/>
+                <w:sz w:val="24"/>
+                <w:szCs w:val="24"/>
+              </w:rPr>
+              <w:t xml:space="preserve">, </w:t>
+            </w:r>
+            <w:proofErr w:type="spellStart"/>
+            <w:r>
+              <w:rPr>
+                <w:rFonts w:ascii="Arial Narrow" w:hAnsi="Arial Narrow" w:cs="Times New Roman"/>
+                <w:sz w:val="24"/>
+                <w:szCs w:val="24"/>
+              </w:rPr>
+              <w:t>dikarenakan</w:t>
+            </w:r>
+            <w:proofErr w:type="spellEnd"/>
+            <w:r>
+              <w:rPr>
+                <w:rFonts w:ascii="Arial Narrow" w:hAnsi="Arial Narrow" w:cs="Times New Roman"/>
+                <w:sz w:val="24"/>
+                <w:szCs w:val="24"/>
+              </w:rPr>
+              <w:t xml:space="preserve"> </w:t>
+            </w:r>
+            <w:proofErr w:type="spellStart"/>
+            <w:r>
+              <w:rPr>
+                <w:rFonts w:ascii="Arial Narrow" w:hAnsi="Arial Narrow" w:cs="Times New Roman"/>
+                <w:sz w:val="24"/>
+                <w:szCs w:val="24"/>
+              </w:rPr>
+              <w:t>tersangka</w:t>
+            </w:r>
+            <w:proofErr w:type="spellEnd"/>
+            <w:r>
+              <w:rPr>
+                <w:rFonts w:ascii="Arial Narrow" w:hAnsi="Arial Narrow" w:cs="Times New Roman"/>
+                <w:sz w:val="24"/>
+                <w:szCs w:val="24"/>
+              </w:rPr>
+              <w:t xml:space="preserve"> </w:t>
+            </w:r>
+            <w:proofErr w:type="spellStart"/>
+            <w:r>
+              <w:rPr>
+                <w:rFonts w:ascii="Arial Narrow" w:hAnsi="Arial Narrow" w:cs="Times New Roman"/>
+                <w:sz w:val="24"/>
+                <w:szCs w:val="24"/>
+              </w:rPr>
+              <w:t>menderita</w:t>
+            </w:r>
+            <w:proofErr w:type="spellEnd"/>
+            <w:r>
+              <w:rPr>
+                <w:rFonts w:ascii="Arial Narrow" w:hAnsi="Arial Narrow" w:cs="Times New Roman"/>
+                <w:sz w:val="24"/>
+                <w:szCs w:val="24"/>
+              </w:rPr>
+              <w:t xml:space="preserve"> </w:t>
+            </w:r>
+            <w:proofErr w:type="spellStart"/>
+            <w:r>
+              <w:rPr>
+                <w:rFonts w:ascii="Arial Narrow" w:hAnsi="Arial Narrow" w:cs="Times New Roman"/>
+                <w:sz w:val="24"/>
+                <w:szCs w:val="24"/>
+              </w:rPr>
+              <w:t>gangguan</w:t>
+            </w:r>
+            <w:proofErr w:type="spellEnd"/>
+            <w:r>
+              <w:rPr>
+                <w:rFonts w:ascii="Arial Narrow" w:hAnsi="Arial Narrow" w:cs="Times New Roman"/>
+                <w:sz w:val="24"/>
+                <w:szCs w:val="24"/>
+              </w:rPr>
+              <w:t xml:space="preserve"> </w:t>
+            </w:r>
+            <w:proofErr w:type="spellStart"/>
+            <w:r>
+              <w:rPr>
+                <w:rFonts w:ascii="Arial Narrow" w:hAnsi="Arial Narrow" w:cs="Times New Roman"/>
+                <w:sz w:val="24"/>
+                <w:szCs w:val="24"/>
+              </w:rPr>
+              <w:t>fisik</w:t>
+            </w:r>
+            <w:proofErr w:type="spellEnd"/>
+            <w:r>
+              <w:rPr>
+                <w:rFonts w:ascii="Arial Narrow" w:hAnsi="Arial Narrow" w:cs="Times New Roman"/>
+                <w:sz w:val="24"/>
+                <w:szCs w:val="24"/>
+              </w:rPr>
+              <w:t xml:space="preserve"> </w:t>
+            </w:r>
+            <w:proofErr w:type="spellStart"/>
+            <w:r>
+              <w:rPr>
+                <w:rFonts w:ascii="Arial Narrow" w:hAnsi="Arial Narrow" w:cs="Times New Roman"/>
+                <w:sz w:val="24"/>
+                <w:szCs w:val="24"/>
+              </w:rPr>
+              <w:t>atau</w:t>
+            </w:r>
+            <w:proofErr w:type="spellEnd"/>
+            <w:r>
+              <w:rPr>
+                <w:rFonts w:ascii="Arial Narrow" w:hAnsi="Arial Narrow" w:cs="Times New Roman"/>
+                <w:sz w:val="24"/>
+                <w:szCs w:val="24"/>
+              </w:rPr>
+              <w:t xml:space="preserve"> mental yang </w:t>
+            </w:r>
+            <w:proofErr w:type="spellStart"/>
+            <w:r>
+              <w:rPr>
+                <w:rFonts w:ascii="Arial Narrow" w:hAnsi="Arial Narrow" w:cs="Times New Roman"/>
+                <w:sz w:val="24"/>
+                <w:szCs w:val="24"/>
+              </w:rPr>
+              <w:t>berat</w:t>
+            </w:r>
+            <w:proofErr w:type="spellEnd"/>
+            <w:r>
+              <w:rPr>
+                <w:rFonts w:ascii="Arial Narrow" w:hAnsi="Arial Narrow" w:cs="Times New Roman"/>
+                <w:sz w:val="24"/>
+                <w:szCs w:val="24"/>
+              </w:rPr>
+              <w:t xml:space="preserve"> yang </w:t>
+            </w:r>
+            <w:proofErr w:type="spellStart"/>
+            <w:r>
+              <w:rPr>
+                <w:rFonts w:ascii="Arial Narrow" w:hAnsi="Arial Narrow" w:cs="Times New Roman"/>
+                <w:sz w:val="24"/>
+                <w:szCs w:val="24"/>
+              </w:rPr>
+              <w:t>dibuktikan</w:t>
+            </w:r>
+            <w:proofErr w:type="spellEnd"/>
+            <w:r>
+              <w:rPr>
+                <w:rFonts w:ascii="Arial Narrow" w:hAnsi="Arial Narrow" w:cs="Times New Roman"/>
+                <w:sz w:val="24"/>
+                <w:szCs w:val="24"/>
+              </w:rPr>
+              <w:t xml:space="preserve"> </w:t>
+            </w:r>
+            <w:proofErr w:type="spellStart"/>
+            <w:r>
+              <w:rPr>
+                <w:rFonts w:ascii="Arial Narrow" w:hAnsi="Arial Narrow" w:cs="Times New Roman"/>
+                <w:sz w:val="24"/>
+                <w:szCs w:val="24"/>
+              </w:rPr>
+              <w:t>dengan</w:t>
+            </w:r>
+            <w:proofErr w:type="spellEnd"/>
+            <w:r>
+              <w:rPr>
+                <w:rFonts w:ascii="Arial Narrow" w:hAnsi="Arial Narrow" w:cs="Times New Roman"/>
+                <w:sz w:val="24"/>
+                <w:szCs w:val="24"/>
+              </w:rPr>
+              <w:t xml:space="preserve"> </w:t>
+            </w:r>
+            <w:proofErr w:type="spellStart"/>
+            <w:r>
+              <w:rPr>
+                <w:rFonts w:ascii="Arial Narrow" w:hAnsi="Arial Narrow" w:cs="Times New Roman"/>
+                <w:sz w:val="24"/>
+                <w:szCs w:val="24"/>
+              </w:rPr>
+              <w:t>surat</w:t>
+            </w:r>
+            <w:proofErr w:type="spellEnd"/>
+            <w:r>
+              <w:rPr>
+                <w:rFonts w:ascii="Arial Narrow" w:hAnsi="Arial Narrow" w:cs="Times New Roman"/>
+                <w:sz w:val="24"/>
+                <w:szCs w:val="24"/>
+              </w:rPr>
+              <w:t xml:space="preserve"> </w:t>
+            </w:r>
+            <w:proofErr w:type="spellStart"/>
+            <w:r>
+              <w:rPr>
+                <w:rFonts w:ascii="Arial Narrow" w:hAnsi="Arial Narrow" w:cs="Times New Roman"/>
+                <w:sz w:val="24"/>
+                <w:szCs w:val="24"/>
+              </w:rPr>
+              <w:t>keterangan</w:t>
+            </w:r>
+            <w:proofErr w:type="spellEnd"/>
+            <w:r>
+              <w:rPr>
+                <w:rFonts w:ascii="Arial Narrow" w:hAnsi="Arial Narrow" w:cs="Times New Roman"/>
+                <w:sz w:val="24"/>
+                <w:szCs w:val="24"/>
+              </w:rPr>
+              <w:t xml:space="preserve"> </w:t>
+            </w:r>
+            <w:proofErr w:type="spellStart"/>
+            <w:r>
+              <w:rPr>
+                <w:rFonts w:ascii="Arial Narrow" w:hAnsi="Arial Narrow" w:cs="Times New Roman"/>
+                <w:sz w:val="24"/>
+                <w:szCs w:val="24"/>
+              </w:rPr>
+              <w:t>dokter</w:t>
+            </w:r>
+            <w:proofErr w:type="spellEnd"/>
+            <w:r>
+              <w:rPr>
+                <w:rFonts w:ascii="Arial Narrow" w:hAnsi="Arial Narrow" w:cs="Times New Roman"/>
+                <w:sz w:val="24"/>
+                <w:szCs w:val="24"/>
+              </w:rPr>
+              <w:t xml:space="preserve"> </w:t>
+            </w:r>
+            <w:proofErr w:type="spellStart"/>
+            <w:r>
+              <w:rPr>
+                <w:rFonts w:ascii="Arial Narrow" w:hAnsi="Arial Narrow" w:cs="Times New Roman"/>
+                <w:sz w:val="24"/>
+                <w:szCs w:val="24"/>
+              </w:rPr>
+              <w:t>atau</w:t>
+            </w:r>
+            <w:proofErr w:type="spellEnd"/>
+            <w:r>
+              <w:rPr>
+                <w:rFonts w:ascii="Arial Narrow" w:hAnsi="Arial Narrow" w:cs="Times New Roman"/>
+                <w:sz w:val="24"/>
+                <w:szCs w:val="24"/>
+              </w:rPr>
+              <w:t xml:space="preserve"> </w:t>
+            </w:r>
+            <w:proofErr w:type="spellStart"/>
+            <w:r>
+              <w:rPr>
+                <w:rFonts w:ascii="Arial Narrow" w:hAnsi="Arial Narrow" w:cs="Times New Roman"/>
+                <w:sz w:val="24"/>
+                <w:szCs w:val="24"/>
+              </w:rPr>
+              <w:t>perkara</w:t>
+            </w:r>
+            <w:proofErr w:type="spellEnd"/>
+            <w:r>
+              <w:rPr>
+                <w:rFonts w:ascii="Arial Narrow" w:hAnsi="Arial Narrow" w:cs="Times New Roman"/>
+                <w:sz w:val="24"/>
+                <w:szCs w:val="24"/>
+              </w:rPr>
+              <w:t xml:space="preserve"> yang </w:t>
+            </w:r>
+            <w:proofErr w:type="spellStart"/>
+            <w:r>
+              <w:rPr>
+                <w:rFonts w:ascii="Arial Narrow" w:hAnsi="Arial Narrow" w:cs="Times New Roman"/>
+                <w:sz w:val="24"/>
+                <w:szCs w:val="24"/>
+              </w:rPr>
+              <w:t>sedang</w:t>
+            </w:r>
+            <w:proofErr w:type="spellEnd"/>
+            <w:r>
+              <w:rPr>
+                <w:rFonts w:ascii="Arial Narrow" w:hAnsi="Arial Narrow" w:cs="Times New Roman"/>
+                <w:sz w:val="24"/>
+                <w:szCs w:val="24"/>
+              </w:rPr>
+              <w:t xml:space="preserve"> </w:t>
+            </w:r>
+            <w:proofErr w:type="spellStart"/>
+            <w:r>
+              <w:rPr>
+                <w:rFonts w:ascii="Arial Narrow" w:hAnsi="Arial Narrow" w:cs="Times New Roman"/>
+                <w:sz w:val="24"/>
+                <w:szCs w:val="24"/>
+              </w:rPr>
+              <w:t>diperiksa</w:t>
+            </w:r>
+            <w:proofErr w:type="spellEnd"/>
+            <w:r>
+              <w:rPr>
+                <w:rFonts w:ascii="Arial Narrow" w:hAnsi="Arial Narrow" w:cs="Times New Roman"/>
+                <w:sz w:val="24"/>
+                <w:szCs w:val="24"/>
+              </w:rPr>
+              <w:t xml:space="preserve"> </w:t>
+            </w:r>
+            <w:proofErr w:type="spellStart"/>
+            <w:r>
+              <w:rPr>
+                <w:rFonts w:ascii="Arial Narrow" w:hAnsi="Arial Narrow" w:cs="Times New Roman"/>
+                <w:sz w:val="24"/>
+                <w:szCs w:val="24"/>
+              </w:rPr>
+              <w:t>diancam</w:t>
+            </w:r>
+            <w:proofErr w:type="spellEnd"/>
+            <w:r>
+              <w:rPr>
+                <w:rFonts w:ascii="Arial Narrow" w:hAnsi="Arial Narrow" w:cs="Times New Roman"/>
+                <w:sz w:val="24"/>
+                <w:szCs w:val="24"/>
+              </w:rPr>
+              <w:t xml:space="preserve"> </w:t>
+            </w:r>
+            <w:proofErr w:type="spellStart"/>
+            <w:r>
+              <w:rPr>
+                <w:rFonts w:ascii="Arial Narrow" w:hAnsi="Arial Narrow" w:cs="Times New Roman"/>
+                <w:sz w:val="24"/>
+                <w:szCs w:val="24"/>
+              </w:rPr>
+              <w:t>dengan</w:t>
+            </w:r>
+            <w:proofErr w:type="spellEnd"/>
+            <w:r>
+              <w:rPr>
+                <w:rFonts w:ascii="Arial Narrow" w:hAnsi="Arial Narrow" w:cs="Times New Roman"/>
+                <w:sz w:val="24"/>
+                <w:szCs w:val="24"/>
+              </w:rPr>
+              <w:t xml:space="preserve"> </w:t>
+            </w:r>
+            <w:proofErr w:type="spellStart"/>
+            <w:r>
+              <w:rPr>
+                <w:rFonts w:ascii="Arial Narrow" w:hAnsi="Arial Narrow" w:cs="Times New Roman"/>
+                <w:sz w:val="24"/>
+                <w:szCs w:val="24"/>
+              </w:rPr>
+              <w:t>pidana</w:t>
+            </w:r>
+            <w:proofErr w:type="spellEnd"/>
+            <w:r>
+              <w:rPr>
+                <w:rFonts w:ascii="Arial Narrow" w:hAnsi="Arial Narrow" w:cs="Times New Roman"/>
+                <w:sz w:val="24"/>
+                <w:szCs w:val="24"/>
+              </w:rPr>
+              <w:t xml:space="preserve"> </w:t>
+            </w:r>
+            <w:proofErr w:type="spellStart"/>
+            <w:r>
+              <w:rPr>
+                <w:rFonts w:ascii="Arial Narrow" w:hAnsi="Arial Narrow" w:cs="Times New Roman"/>
+                <w:sz w:val="24"/>
+                <w:szCs w:val="24"/>
+              </w:rPr>
+              <w:t>penjara</w:t>
+            </w:r>
+            <w:proofErr w:type="spellEnd"/>
+            <w:r>
+              <w:rPr>
+                <w:rFonts w:ascii="Arial Narrow" w:hAnsi="Arial Narrow" w:cs="Times New Roman"/>
+                <w:sz w:val="24"/>
+                <w:szCs w:val="24"/>
+              </w:rPr>
+              <w:t xml:space="preserve"> 9 (</w:t>
+            </w:r>
+            <w:proofErr w:type="spellStart"/>
+            <w:r>
+              <w:rPr>
+                <w:rFonts w:ascii="Arial Narrow" w:hAnsi="Arial Narrow" w:cs="Times New Roman"/>
+                <w:sz w:val="24"/>
+                <w:szCs w:val="24"/>
+              </w:rPr>
+              <w:t>sembilan</w:t>
+            </w:r>
+            <w:proofErr w:type="spellEnd"/>
+            <w:r>
+              <w:rPr>
+                <w:rFonts w:ascii="Arial Narrow" w:hAnsi="Arial Narrow" w:cs="Times New Roman"/>
+                <w:sz w:val="24"/>
+                <w:szCs w:val="24"/>
+              </w:rPr>
+              <w:t xml:space="preserve">) </w:t>
+            </w:r>
+            <w:proofErr w:type="spellStart"/>
+            <w:r>
+              <w:rPr>
+                <w:rFonts w:ascii="Arial Narrow" w:hAnsi="Arial Narrow" w:cs="Times New Roman"/>
+                <w:sz w:val="24"/>
+                <w:szCs w:val="24"/>
+              </w:rPr>
+              <w:t>tahun</w:t>
+            </w:r>
+            <w:proofErr w:type="spellEnd"/>
+            <w:r>
+              <w:rPr>
+                <w:rFonts w:ascii="Arial Narrow" w:hAnsi="Arial Narrow" w:cs="Times New Roman"/>
+                <w:sz w:val="24"/>
+                <w:szCs w:val="24"/>
+              </w:rPr>
+              <w:t xml:space="preserve"> </w:t>
+            </w:r>
+            <w:proofErr w:type="spellStart"/>
+            <w:r>
+              <w:rPr>
+                <w:rFonts w:ascii="Arial Narrow" w:hAnsi="Arial Narrow" w:cs="Times New Roman"/>
+                <w:sz w:val="24"/>
+                <w:szCs w:val="24"/>
+              </w:rPr>
+              <w:t>atau</w:t>
+            </w:r>
+            <w:proofErr w:type="spellEnd"/>
+            <w:r>
+              <w:rPr>
+                <w:rFonts w:ascii="Arial Narrow" w:hAnsi="Arial Narrow" w:cs="Times New Roman"/>
+                <w:sz w:val="24"/>
+                <w:szCs w:val="24"/>
+              </w:rPr>
+              <w:t xml:space="preserve"> </w:t>
+            </w:r>
+            <w:proofErr w:type="spellStart"/>
+            <w:r>
+              <w:rPr>
+                <w:rFonts w:ascii="Arial Narrow" w:hAnsi="Arial Narrow" w:cs="Times New Roman"/>
+                <w:sz w:val="24"/>
+                <w:szCs w:val="24"/>
+              </w:rPr>
+              <w:t>lebih</w:t>
+            </w:r>
+            <w:proofErr w:type="spellEnd"/>
+            <w:r>
+              <w:rPr>
+                <w:rFonts w:ascii="Arial Narrow" w:hAnsi="Arial Narrow" w:cs="Times New Roman"/>
+                <w:sz w:val="24"/>
+                <w:szCs w:val="24"/>
+              </w:rPr>
+              <w:t xml:space="preserve">*), </w:t>
+            </w:r>
+            <w:proofErr w:type="spellStart"/>
+            <w:r>
+              <w:rPr>
+                <w:rFonts w:ascii="Arial Narrow" w:hAnsi="Arial Narrow" w:cs="Times New Roman"/>
+                <w:sz w:val="24"/>
+                <w:szCs w:val="24"/>
+              </w:rPr>
+              <w:t>untuk</w:t>
+            </w:r>
+            <w:proofErr w:type="spellEnd"/>
+            <w:r>
+              <w:rPr>
+                <w:rFonts w:ascii="Arial Narrow" w:hAnsi="Arial Narrow" w:cs="Times New Roman"/>
+                <w:sz w:val="24"/>
+                <w:szCs w:val="24"/>
+              </w:rPr>
+              <w:t xml:space="preserve"> </w:t>
+            </w:r>
+            <w:proofErr w:type="spellStart"/>
+            <w:r>
+              <w:rPr>
+                <w:rFonts w:ascii="Arial Narrow" w:hAnsi="Arial Narrow" w:cs="Times New Roman"/>
+                <w:sz w:val="24"/>
+                <w:szCs w:val="24"/>
+              </w:rPr>
+              <w:t>kepentingan</w:t>
+            </w:r>
+            <w:proofErr w:type="spellEnd"/>
+            <w:r>
+              <w:rPr>
+                <w:rFonts w:ascii="Arial Narrow" w:hAnsi="Arial Narrow" w:cs="Times New Roman"/>
+                <w:sz w:val="24"/>
+                <w:szCs w:val="24"/>
+              </w:rPr>
+              <w:t xml:space="preserve"> proses </w:t>
+            </w:r>
+            <w:proofErr w:type="spellStart"/>
+            <w:r>
+              <w:rPr>
+                <w:rFonts w:ascii="Arial Narrow" w:hAnsi="Arial Narrow" w:cs="Times New Roman"/>
+                <w:sz w:val="24"/>
+                <w:szCs w:val="24"/>
+              </w:rPr>
+              <w:t>penyidikan</w:t>
+            </w:r>
+            <w:proofErr w:type="spellEnd"/>
+            <w:r>
+              <w:rPr>
+                <w:rFonts w:ascii="Arial Narrow" w:hAnsi="Arial Narrow" w:cs="Times New Roman"/>
+                <w:sz w:val="24"/>
+                <w:szCs w:val="24"/>
+              </w:rPr>
+              <w:t xml:space="preserve"> </w:t>
+            </w:r>
+            <w:proofErr w:type="spellStart"/>
+            <w:r>
+              <w:rPr>
+                <w:rFonts w:ascii="Arial Narrow" w:hAnsi="Arial Narrow" w:cs="Times New Roman"/>
+                <w:sz w:val="24"/>
+                <w:szCs w:val="24"/>
+              </w:rPr>
+              <w:t>karena</w:t>
+            </w:r>
+            <w:proofErr w:type="spellEnd"/>
+            <w:r>
+              <w:rPr>
+                <w:rFonts w:ascii="Arial Narrow" w:hAnsi="Arial Narrow" w:cs="Times New Roman"/>
+                <w:sz w:val="24"/>
+                <w:szCs w:val="24"/>
+              </w:rPr>
+              <w:t xml:space="preserve"> </w:t>
+            </w:r>
+            <w:proofErr w:type="spellStart"/>
+            <w:r>
+              <w:rPr>
+                <w:rFonts w:ascii="Arial Narrow" w:hAnsi="Arial Narrow" w:cs="Times New Roman"/>
+                <w:sz w:val="24"/>
+                <w:szCs w:val="24"/>
+              </w:rPr>
+              <w:t>pemeriksaan</w:t>
+            </w:r>
+            <w:proofErr w:type="spellEnd"/>
+            <w:r>
+              <w:rPr>
+                <w:rFonts w:ascii="Arial Narrow" w:hAnsi="Arial Narrow" w:cs="Times New Roman"/>
+                <w:sz w:val="24"/>
+                <w:szCs w:val="24"/>
+              </w:rPr>
+              <w:t xml:space="preserve"> </w:t>
+            </w:r>
+            <w:proofErr w:type="spellStart"/>
+            <w:r>
+              <w:rPr>
+                <w:rFonts w:ascii="Arial Narrow" w:hAnsi="Arial Narrow" w:cs="Times New Roman"/>
+                <w:sz w:val="24"/>
+                <w:szCs w:val="24"/>
+              </w:rPr>
+              <w:t>terhadap</w:t>
+            </w:r>
+            <w:proofErr w:type="spellEnd"/>
+            <w:r>
+              <w:rPr>
+                <w:rFonts w:ascii="Arial Narrow" w:hAnsi="Arial Narrow" w:cs="Times New Roman"/>
+                <w:sz w:val="24"/>
+                <w:szCs w:val="24"/>
+              </w:rPr>
+              <w:t xml:space="preserve"> </w:t>
+            </w:r>
+            <w:proofErr w:type="spellStart"/>
+            <w:r>
+              <w:rPr>
+                <w:rFonts w:ascii="Arial Narrow" w:hAnsi="Arial Narrow" w:cs="Times New Roman"/>
+                <w:sz w:val="24"/>
+                <w:szCs w:val="24"/>
+              </w:rPr>
+              <w:t>tersangka</w:t>
+            </w:r>
+            <w:proofErr w:type="spellEnd"/>
+            <w:r>
+              <w:rPr>
+                <w:rFonts w:ascii="Arial Narrow" w:hAnsi="Arial Narrow" w:cs="Times New Roman"/>
+                <w:sz w:val="24"/>
+                <w:szCs w:val="24"/>
+              </w:rPr>
+              <w:t xml:space="preserve"> dan proses </w:t>
+            </w:r>
+            <w:proofErr w:type="spellStart"/>
+            <w:r>
+              <w:rPr>
+                <w:rFonts w:ascii="Arial Narrow" w:hAnsi="Arial Narrow" w:cs="Times New Roman"/>
+                <w:sz w:val="24"/>
+                <w:szCs w:val="24"/>
+              </w:rPr>
+              <w:t>penyidikan</w:t>
+            </w:r>
+            <w:proofErr w:type="spellEnd"/>
+            <w:r>
+              <w:rPr>
+                <w:rFonts w:ascii="Arial Narrow" w:hAnsi="Arial Narrow" w:cs="Times New Roman"/>
+                <w:sz w:val="24"/>
+                <w:szCs w:val="24"/>
+              </w:rPr>
+              <w:t xml:space="preserve"> </w:t>
+            </w:r>
+            <w:proofErr w:type="spellStart"/>
+            <w:r>
+              <w:rPr>
+                <w:rFonts w:ascii="Arial Narrow" w:hAnsi="Arial Narrow" w:cs="Times New Roman"/>
+                <w:sz w:val="24"/>
+                <w:szCs w:val="24"/>
+              </w:rPr>
+              <w:t>perkaranya</w:t>
+            </w:r>
+            <w:proofErr w:type="spellEnd"/>
+            <w:r>
+              <w:rPr>
+                <w:rFonts w:ascii="Arial Narrow" w:hAnsi="Arial Narrow" w:cs="Times New Roman"/>
+                <w:sz w:val="24"/>
+                <w:szCs w:val="24"/>
+              </w:rPr>
+              <w:t xml:space="preserve"> </w:t>
+            </w:r>
+            <w:proofErr w:type="spellStart"/>
+            <w:r>
+              <w:rPr>
+                <w:rFonts w:ascii="Arial Narrow" w:hAnsi="Arial Narrow" w:cs="Times New Roman"/>
+                <w:sz w:val="24"/>
+                <w:szCs w:val="24"/>
+              </w:rPr>
+              <w:t>belum</w:t>
+            </w:r>
+            <w:proofErr w:type="spellEnd"/>
+            <w:r>
+              <w:rPr>
+                <w:rFonts w:ascii="Arial Narrow" w:hAnsi="Arial Narrow" w:cs="Times New Roman"/>
+                <w:sz w:val="24"/>
+                <w:szCs w:val="24"/>
+              </w:rPr>
+              <w:t xml:space="preserve"> </w:t>
+            </w:r>
+            <w:proofErr w:type="spellStart"/>
+            <w:r>
+              <w:rPr>
+                <w:rFonts w:ascii="Arial Narrow" w:hAnsi="Arial Narrow" w:cs="Times New Roman"/>
+                <w:sz w:val="24"/>
+                <w:szCs w:val="24"/>
+              </w:rPr>
+              <w:t>selesai</w:t>
+            </w:r>
+            <w:proofErr w:type="spellEnd"/>
+            <w:r>
+              <w:rPr>
+                <w:rFonts w:ascii="Arial Narrow" w:hAnsi="Arial Narrow" w:cs="Times New Roman"/>
+                <w:sz w:val="24"/>
+                <w:szCs w:val="24"/>
+              </w:rPr>
+              <w:t xml:space="preserve">, </w:t>
+            </w:r>
+            <w:proofErr w:type="spellStart"/>
+            <w:r>
+              <w:rPr>
+                <w:rFonts w:ascii="Arial Narrow" w:hAnsi="Arial Narrow" w:cs="Times New Roman"/>
+                <w:sz w:val="24"/>
+                <w:szCs w:val="24"/>
+              </w:rPr>
+              <w:t>sedangkan</w:t>
+            </w:r>
+            <w:proofErr w:type="spellEnd"/>
+            <w:r>
+              <w:rPr>
+                <w:rFonts w:ascii="Arial Narrow" w:hAnsi="Arial Narrow" w:cs="Times New Roman"/>
+                <w:sz w:val="24"/>
+                <w:szCs w:val="24"/>
+              </w:rPr>
+              <w:t xml:space="preserve"> masa </w:t>
+            </w:r>
+            <w:proofErr w:type="spellStart"/>
+            <w:r>
+              <w:rPr>
+                <w:rFonts w:ascii="Arial Narrow" w:hAnsi="Arial Narrow" w:cs="Times New Roman"/>
+                <w:sz w:val="24"/>
+                <w:szCs w:val="24"/>
+              </w:rPr>
+              <w:t>penahanan</w:t>
+            </w:r>
+            <w:proofErr w:type="spellEnd"/>
+            <w:r>
+              <w:rPr>
+                <w:rFonts w:ascii="Arial Narrow" w:hAnsi="Arial Narrow" w:cs="Times New Roman"/>
+                <w:sz w:val="24"/>
+                <w:szCs w:val="24"/>
+              </w:rPr>
+              <w:t xml:space="preserve"> </w:t>
+            </w:r>
+            <w:proofErr w:type="spellStart"/>
+            <w:r>
+              <w:rPr>
+                <w:rFonts w:ascii="Arial Narrow" w:hAnsi="Arial Narrow" w:cs="Times New Roman"/>
+                <w:sz w:val="24"/>
+                <w:szCs w:val="24"/>
+              </w:rPr>
+              <w:t>dari</w:t>
+            </w:r>
+            <w:proofErr w:type="spellEnd"/>
+            <w:r>
+              <w:rPr>
+                <w:rFonts w:ascii="Arial Narrow" w:hAnsi="Arial Narrow" w:cs="Times New Roman"/>
+                <w:sz w:val="24"/>
+                <w:szCs w:val="24"/>
+              </w:rPr>
+              <w:t xml:space="preserve"> </w:t>
+            </w:r>
+            <w:proofErr w:type="spellStart"/>
+            <w:r>
+              <w:rPr>
+                <w:rFonts w:ascii="Arial Narrow" w:hAnsi="Arial Narrow" w:cs="Times New Roman"/>
+                <w:sz w:val="24"/>
+                <w:szCs w:val="24"/>
+              </w:rPr>
+              <w:t>pengadilan</w:t>
+            </w:r>
+            <w:proofErr w:type="spellEnd"/>
+            <w:r>
+              <w:rPr>
+                <w:rFonts w:ascii="Arial Narrow" w:hAnsi="Arial Narrow" w:cs="Times New Roman"/>
+                <w:sz w:val="24"/>
+                <w:szCs w:val="24"/>
+              </w:rPr>
+              <w:t xml:space="preserve"> negeri </w:t>
+            </w:r>
+            <w:proofErr w:type="spellStart"/>
+            <w:r>
+              <w:rPr>
+                <w:rFonts w:ascii="Arial Narrow" w:hAnsi="Arial Narrow" w:cs="Times New Roman"/>
+                <w:sz w:val="24"/>
+                <w:szCs w:val="24"/>
+              </w:rPr>
+              <w:t>akan</w:t>
+            </w:r>
+            <w:proofErr w:type="spellEnd"/>
+            <w:r>
+              <w:rPr>
+                <w:rFonts w:ascii="Arial Narrow" w:hAnsi="Arial Narrow" w:cs="Times New Roman"/>
+                <w:sz w:val="24"/>
+                <w:szCs w:val="24"/>
+              </w:rPr>
+              <w:t xml:space="preserve"> </w:t>
+            </w:r>
+            <w:proofErr w:type="spellStart"/>
+            <w:r>
+              <w:rPr>
+                <w:rFonts w:ascii="Arial Narrow" w:hAnsi="Arial Narrow" w:cs="Times New Roman"/>
+                <w:sz w:val="24"/>
+                <w:szCs w:val="24"/>
+              </w:rPr>
+              <w:t>berakhir</w:t>
+            </w:r>
+            <w:proofErr w:type="spellEnd"/>
+            <w:r>
+              <w:rPr>
+                <w:rFonts w:ascii="Arial Narrow" w:hAnsi="Arial Narrow" w:cs="Times New Roman"/>
+                <w:sz w:val="24"/>
+                <w:szCs w:val="24"/>
+              </w:rPr>
+              <w:t xml:space="preserve"> pada </w:t>
+            </w:r>
+            <w:proofErr w:type="spellStart"/>
+            <w:r>
+              <w:rPr>
+                <w:rFonts w:ascii="Arial Narrow" w:hAnsi="Arial Narrow" w:cs="Times New Roman"/>
+                <w:sz w:val="24"/>
+                <w:szCs w:val="24"/>
+              </w:rPr>
+              <w:t>tanggal</w:t>
+            </w:r>
+            <w:proofErr w:type="spellEnd"/>
+            <w:r>
+              <w:rPr>
+                <w:rFonts w:ascii="Arial Narrow" w:hAnsi="Arial Narrow" w:cs="Times New Roman"/>
+                <w:sz w:val="24"/>
+                <w:szCs w:val="24"/>
+              </w:rPr>
+              <w:t xml:space="preserve"> </w:t>
+            </w:r>
+            <w:r>
+              <w:rPr>
+                <w:rFonts w:ascii="Arial Narrow" w:hAnsi="Arial Narrow" w:cs="Times New Roman"/>
+                <w:sz w:val="24"/>
+                <w:szCs w:val="24"/>
+              </w:rPr>
+              <w:t>${</w:t>
+            </w:r>
+            <w:proofErr w:type="spellStart"/>
+            <w:r>
+              <w:rPr>
+                <w:rFonts w:ascii="Arial Narrow" w:hAnsi="Arial Narrow" w:cs="Times New Roman"/>
+                <w:sz w:val="24"/>
+                <w:szCs w:val="24"/>
+              </w:rPr>
+              <w:t>pengadilan_negeri_akhir_tanggal</w:t>
+            </w:r>
+            <w:proofErr w:type="spellEnd"/>
+            <w:r>
+              <w:rPr>
+                <w:rFonts w:ascii="Arial Narrow" w:hAnsi="Arial Narrow" w:cs="Times New Roman"/>
+                <w:sz w:val="24"/>
+                <w:szCs w:val="24"/>
+              </w:rPr>
+              <w:t xml:space="preserve">}, </w:t>
+            </w:r>
+            <w:proofErr w:type="spellStart"/>
+            <w:r>
+              <w:rPr>
+                <w:rFonts w:ascii="Arial Narrow" w:hAnsi="Arial Narrow" w:cs="Times New Roman"/>
+                <w:sz w:val="24"/>
+                <w:szCs w:val="24"/>
+              </w:rPr>
+              <w:t>maka</w:t>
+            </w:r>
+            <w:proofErr w:type="spellEnd"/>
+            <w:r>
+              <w:rPr>
+                <w:rFonts w:ascii="Arial Narrow" w:hAnsi="Arial Narrow" w:cs="Times New Roman"/>
+                <w:sz w:val="24"/>
+                <w:szCs w:val="24"/>
+              </w:rPr>
+              <w:t xml:space="preserve"> </w:t>
+            </w:r>
+            <w:proofErr w:type="spellStart"/>
+            <w:r>
+              <w:rPr>
+                <w:rFonts w:ascii="Arial Narrow" w:hAnsi="Arial Narrow" w:cs="Times New Roman"/>
+                <w:sz w:val="24"/>
+                <w:szCs w:val="24"/>
+              </w:rPr>
+              <w:t>penyidik</w:t>
+            </w:r>
+            <w:proofErr w:type="spellEnd"/>
+            <w:r>
+              <w:rPr>
+                <w:rFonts w:ascii="Arial Narrow" w:hAnsi="Arial Narrow" w:cs="Times New Roman"/>
+                <w:sz w:val="24"/>
+                <w:szCs w:val="24"/>
+              </w:rPr>
+              <w:t xml:space="preserve"> </w:t>
+            </w:r>
+            <w:proofErr w:type="spellStart"/>
+            <w:r>
+              <w:rPr>
+                <w:rFonts w:ascii="Arial Narrow" w:hAnsi="Arial Narrow" w:cs="Times New Roman"/>
+                <w:sz w:val="24"/>
+                <w:szCs w:val="24"/>
+              </w:rPr>
+              <w:t>mengajukan</w:t>
+            </w:r>
+            <w:proofErr w:type="spellEnd"/>
+            <w:r>
+              <w:rPr>
+                <w:rFonts w:ascii="Arial Narrow" w:hAnsi="Arial Narrow" w:cs="Times New Roman"/>
+                <w:sz w:val="24"/>
+                <w:szCs w:val="24"/>
+              </w:rPr>
+              <w:t xml:space="preserve"> </w:t>
+            </w:r>
+            <w:proofErr w:type="spellStart"/>
+            <w:r>
+              <w:rPr>
+                <w:rFonts w:ascii="Arial Narrow" w:hAnsi="Arial Narrow" w:cs="Times New Roman"/>
+                <w:sz w:val="24"/>
+                <w:szCs w:val="24"/>
+              </w:rPr>
+              <w:t>permohonan</w:t>
+            </w:r>
+            <w:proofErr w:type="spellEnd"/>
+            <w:r>
+              <w:rPr>
+                <w:rFonts w:ascii="Arial Narrow" w:hAnsi="Arial Narrow" w:cs="Times New Roman"/>
+                <w:sz w:val="24"/>
+                <w:szCs w:val="24"/>
+              </w:rPr>
+              <w:t xml:space="preserve"> </w:t>
+            </w:r>
+            <w:proofErr w:type="spellStart"/>
+            <w:r>
+              <w:rPr>
+                <w:rFonts w:ascii="Arial Narrow" w:hAnsi="Arial Narrow" w:cs="Times New Roman"/>
+                <w:sz w:val="24"/>
+                <w:szCs w:val="24"/>
+              </w:rPr>
+              <w:t>kepada</w:t>
+            </w:r>
+            <w:proofErr w:type="spellEnd"/>
+            <w:r>
+              <w:rPr>
+                <w:rFonts w:ascii="Arial Narrow" w:hAnsi="Arial Narrow" w:cs="Times New Roman"/>
+                <w:sz w:val="24"/>
+                <w:szCs w:val="24"/>
+              </w:rPr>
+              <w:t xml:space="preserve"> </w:t>
+            </w:r>
+            <w:proofErr w:type="spellStart"/>
+            <w:r>
+              <w:rPr>
+                <w:rFonts w:ascii="Arial Narrow" w:hAnsi="Arial Narrow" w:cs="Times New Roman"/>
+                <w:sz w:val="24"/>
+                <w:szCs w:val="24"/>
+              </w:rPr>
+              <w:t>Ketua</w:t>
+            </w:r>
+            <w:proofErr w:type="spellEnd"/>
+            <w:r>
+              <w:rPr>
+                <w:rFonts w:ascii="Arial Narrow" w:hAnsi="Arial Narrow" w:cs="Times New Roman"/>
+                <w:sz w:val="24"/>
+                <w:szCs w:val="24"/>
+              </w:rPr>
+              <w:t xml:space="preserve"> </w:t>
+            </w:r>
+            <w:proofErr w:type="spellStart"/>
+            <w:r>
+              <w:rPr>
+                <w:rFonts w:ascii="Arial Narrow" w:hAnsi="Arial Narrow" w:cs="Times New Roman"/>
+                <w:sz w:val="24"/>
+                <w:szCs w:val="24"/>
+              </w:rPr>
+              <w:t>untuk</w:t>
+            </w:r>
+            <w:proofErr w:type="spellEnd"/>
+            <w:r>
+              <w:rPr>
+                <w:rFonts w:ascii="Arial Narrow" w:hAnsi="Arial Narrow" w:cs="Times New Roman"/>
+                <w:sz w:val="24"/>
+                <w:szCs w:val="24"/>
+              </w:rPr>
+              <w:t xml:space="preserve"> </w:t>
+            </w:r>
+            <w:proofErr w:type="spellStart"/>
+            <w:r>
+              <w:rPr>
+                <w:rFonts w:ascii="Arial Narrow" w:hAnsi="Arial Narrow" w:cs="Times New Roman"/>
+                <w:sz w:val="24"/>
+                <w:szCs w:val="24"/>
+              </w:rPr>
+              <w:t>dapatnya</w:t>
+            </w:r>
+            <w:proofErr w:type="spellEnd"/>
+            <w:r>
+              <w:rPr>
+                <w:rFonts w:ascii="Arial Narrow" w:hAnsi="Arial Narrow" w:cs="Times New Roman"/>
+                <w:sz w:val="24"/>
+                <w:szCs w:val="24"/>
+              </w:rPr>
+              <w:t xml:space="preserve"> </w:t>
+            </w:r>
+            <w:proofErr w:type="spellStart"/>
+            <w:r>
+              <w:rPr>
+                <w:rFonts w:ascii="Arial Narrow" w:hAnsi="Arial Narrow" w:cs="Times New Roman"/>
+                <w:sz w:val="24"/>
+                <w:szCs w:val="24"/>
+              </w:rPr>
+              <w:t>penahanan</w:t>
+            </w:r>
+            <w:proofErr w:type="spellEnd"/>
+            <w:r>
+              <w:rPr>
+                <w:rFonts w:ascii="Arial Narrow" w:hAnsi="Arial Narrow" w:cs="Times New Roman"/>
+                <w:sz w:val="24"/>
+                <w:szCs w:val="24"/>
+              </w:rPr>
+              <w:t xml:space="preserve"> </w:t>
+            </w:r>
+            <w:proofErr w:type="spellStart"/>
+            <w:r>
+              <w:rPr>
+                <w:rFonts w:ascii="Arial Narrow" w:hAnsi="Arial Narrow" w:cs="Times New Roman"/>
+                <w:sz w:val="24"/>
+                <w:szCs w:val="24"/>
+              </w:rPr>
+              <w:t>terhadap</w:t>
+            </w:r>
+            <w:proofErr w:type="spellEnd"/>
+            <w:r>
+              <w:rPr>
+                <w:rFonts w:ascii="Arial Narrow" w:hAnsi="Arial Narrow" w:cs="Times New Roman"/>
+                <w:sz w:val="24"/>
+                <w:szCs w:val="24"/>
+              </w:rPr>
+              <w:t xml:space="preserve"> </w:t>
+            </w:r>
+            <w:proofErr w:type="spellStart"/>
+            <w:r>
+              <w:rPr>
+                <w:rFonts w:ascii="Arial Narrow" w:hAnsi="Arial Narrow" w:cs="Times New Roman"/>
+                <w:sz w:val="24"/>
+                <w:szCs w:val="24"/>
+              </w:rPr>
+              <w:t>tersangka</w:t>
+            </w:r>
+            <w:proofErr w:type="spellEnd"/>
+            <w:r>
+              <w:rPr>
+                <w:rFonts w:ascii="Arial Narrow" w:hAnsi="Arial Narrow" w:cs="Times New Roman"/>
+                <w:sz w:val="24"/>
+                <w:szCs w:val="24"/>
+              </w:rPr>
+              <w:t xml:space="preserve"> </w:t>
+            </w:r>
+            <w:proofErr w:type="spellStart"/>
+            <w:r>
+              <w:rPr>
+                <w:rFonts w:ascii="Arial Narrow" w:hAnsi="Arial Narrow" w:cs="Times New Roman"/>
+                <w:sz w:val="24"/>
+                <w:szCs w:val="24"/>
+              </w:rPr>
+              <w:t>diperpanjang</w:t>
+            </w:r>
+            <w:proofErr w:type="spellEnd"/>
+            <w:r>
+              <w:rPr>
+                <w:rFonts w:ascii="Arial Narrow" w:hAnsi="Arial Narrow" w:cs="Times New Roman"/>
+                <w:sz w:val="24"/>
+                <w:szCs w:val="24"/>
+              </w:rPr>
+              <w:t xml:space="preserve"> </w:t>
+            </w:r>
+            <w:proofErr w:type="spellStart"/>
+            <w:r>
+              <w:rPr>
+                <w:rFonts w:ascii="Arial Narrow" w:hAnsi="Arial Narrow" w:cs="Times New Roman"/>
+                <w:sz w:val="24"/>
+                <w:szCs w:val="24"/>
+              </w:rPr>
+              <w:t>selama</w:t>
+            </w:r>
+            <w:proofErr w:type="spellEnd"/>
+            <w:r>
+              <w:rPr>
+                <w:rFonts w:ascii="Arial Narrow" w:hAnsi="Arial Narrow" w:cs="Times New Roman"/>
+                <w:sz w:val="24"/>
+                <w:szCs w:val="24"/>
+              </w:rPr>
+              <w:t xml:space="preserve"> ${</w:t>
+            </w:r>
+            <w:proofErr w:type="spellStart"/>
+            <w:r>
+              <w:rPr>
+                <w:rFonts w:ascii="Arial Narrow" w:hAnsi="Arial Narrow" w:cs="Times New Roman"/>
+                <w:sz w:val="24"/>
+                <w:szCs w:val="24"/>
+              </w:rPr>
+              <w:t>requestedExtensionDays</w:t>
+            </w:r>
+            <w:proofErr w:type="spellEnd"/>
+            <w:r>
+              <w:rPr>
+                <w:rFonts w:ascii="Arial Narrow" w:hAnsi="Arial Narrow" w:cs="Times New Roman"/>
+                <w:sz w:val="24"/>
+                <w:szCs w:val="24"/>
+              </w:rPr>
+              <w:t>} (</w:t>
+            </w:r>
+            <w:proofErr w:type="spellStart"/>
+            <w:r>
+              <w:rPr>
+                <w:rFonts w:ascii="Arial Narrow" w:hAnsi="Arial Narrow" w:cs="Times New Roman"/>
+                <w:sz w:val="24"/>
+                <w:szCs w:val="24"/>
+              </w:rPr>
+              <w:t>tiga</w:t>
+            </w:r>
+            <w:proofErr w:type="spellEnd"/>
+            <w:r>
+              <w:rPr>
+                <w:rFonts w:ascii="Arial Narrow" w:hAnsi="Arial Narrow" w:cs="Times New Roman"/>
+                <w:sz w:val="24"/>
+                <w:szCs w:val="24"/>
+              </w:rPr>
+              <w:t xml:space="preserve"> </w:t>
+            </w:r>
+            <w:proofErr w:type="spellStart"/>
+            <w:r>
+              <w:rPr>
+                <w:rFonts w:ascii="Arial Narrow" w:hAnsi="Arial Narrow" w:cs="Times New Roman"/>
+                <w:sz w:val="24"/>
+                <w:szCs w:val="24"/>
+              </w:rPr>
+              <w:t>puluh</w:t>
+            </w:r>
+            <w:proofErr w:type="spellEnd"/>
+            <w:r>
+              <w:rPr>
+                <w:rFonts w:ascii="Arial Narrow" w:hAnsi="Arial Narrow" w:cs="Times New Roman"/>
+                <w:sz w:val="24"/>
+                <w:szCs w:val="24"/>
+              </w:rPr>
+              <w:t xml:space="preserve">) </w:t>
+            </w:r>
+            <w:proofErr w:type="spellStart"/>
+            <w:r>
+              <w:rPr>
+                <w:rFonts w:ascii="Arial Narrow" w:hAnsi="Arial Narrow" w:cs="Times New Roman"/>
+                <w:sz w:val="24"/>
+                <w:szCs w:val="24"/>
+              </w:rPr>
+              <w:t>hari</w:t>
+            </w:r>
+            <w:proofErr w:type="spellEnd"/>
+            <w:r>
+              <w:rPr>
+                <w:rFonts w:ascii="Arial Narrow" w:hAnsi="Arial Narrow" w:cs="Times New Roman"/>
+                <w:sz w:val="24"/>
+                <w:szCs w:val="24"/>
+              </w:rPr>
+              <w:t xml:space="preserve"> di ${</w:t>
+            </w:r>
+            <w:proofErr w:type="spellStart"/>
+            <w:r>
+              <w:rPr>
+                <w:rFonts w:ascii="Arial Narrow" w:hAnsi="Arial Narrow" w:cs="Times New Roman"/>
+                <w:sz w:val="24"/>
+                <w:szCs w:val="24"/>
+              </w:rPr>
+              <w:t>rutan_name</w:t>
+            </w:r>
+            <w:proofErr w:type="spellEnd"/>
+            <w:r>
+              <w:rPr>
+                <w:rFonts w:ascii="Arial Narrow" w:hAnsi="Arial Narrow" w:cs="Times New Roman"/>
+                <w:sz w:val="24"/>
+                <w:szCs w:val="24"/>
+              </w:rPr>
+              <w:t xml:space="preserve">} </w:t>
+            </w:r>
+            <w:proofErr w:type="spellStart"/>
+            <w:r>
+              <w:rPr>
+                <w:rFonts w:ascii="Arial Narrow" w:hAnsi="Arial Narrow" w:cs="Times New Roman"/>
+                <w:sz w:val="24"/>
+                <w:szCs w:val="24"/>
+              </w:rPr>
+              <w:t>dari</w:t>
+            </w:r>
+            <w:proofErr w:type="spellEnd"/>
+            <w:r>
+              <w:rPr>
+                <w:rFonts w:ascii="Arial Narrow" w:hAnsi="Arial Narrow" w:cs="Times New Roman"/>
+                <w:sz w:val="24"/>
+                <w:szCs w:val="24"/>
+              </w:rPr>
+              <w:t xml:space="preserve"> </w:t>
+            </w:r>
+            <w:proofErr w:type="spellStart"/>
+            <w:r>
+              <w:rPr>
+                <w:rFonts w:ascii="Arial Narrow" w:hAnsi="Arial Narrow" w:cs="Times New Roman"/>
+                <w:sz w:val="24"/>
+                <w:szCs w:val="24"/>
+              </w:rPr>
+              <w:t>tanggal</w:t>
+            </w:r>
+            <w:proofErr w:type="spellEnd"/>
+            <w:r>
+              <w:rPr>
+                <w:rFonts w:ascii="Arial Narrow" w:hAnsi="Arial Narrow" w:cs="Times New Roman"/>
+                <w:sz w:val="24"/>
+                <w:szCs w:val="24"/>
+              </w:rPr>
+              <w:t xml:space="preserve"> ${</w:t>
+            </w:r>
+            <w:proofErr w:type="spellStart"/>
+            <w:r>
+              <w:rPr>
+                <w:rFonts w:ascii="Arial Narrow" w:hAnsi="Arial Narrow" w:cs="Times New Roman"/>
+                <w:sz w:val="24"/>
+                <w:szCs w:val="24"/>
+              </w:rPr>
+              <w:t>extensionStartDate</w:t>
+            </w:r>
+            <w:proofErr w:type="spellEnd"/>
+            <w:r>
+              <w:rPr>
+                <w:rFonts w:ascii="Arial Narrow" w:hAnsi="Arial Narrow" w:cs="Times New Roman"/>
+                <w:sz w:val="24"/>
+                <w:szCs w:val="24"/>
+              </w:rPr>
+              <w:t xml:space="preserve">} </w:t>
+            </w:r>
+            <w:proofErr w:type="spellStart"/>
+            <w:r>
+              <w:rPr>
+                <w:rFonts w:ascii="Arial Narrow" w:hAnsi="Arial Narrow" w:cs="Times New Roman"/>
+                <w:sz w:val="24"/>
+                <w:szCs w:val="24"/>
+              </w:rPr>
+              <w:t>s.d.</w:t>
+            </w:r>
+            <w:proofErr w:type="spellEnd"/>
+            <w:r>
+              <w:rPr>
+                <w:rFonts w:ascii="Arial Narrow" w:hAnsi="Arial Narrow" w:cs="Times New Roman"/>
+                <w:sz w:val="24"/>
+                <w:szCs w:val="24"/>
+              </w:rPr>
+              <w:t xml:space="preserve"> ${</w:t>
+            </w:r>
+            <w:proofErr w:type="spellStart"/>
+            <w:r>
+              <w:rPr>
+                <w:rFonts w:ascii="Arial Narrow" w:hAnsi="Arial Narrow" w:cs="Times New Roman"/>
+                <w:sz w:val="24"/>
+                <w:szCs w:val="24"/>
+              </w:rPr>
+              <w:t>extensionEndDate</w:t>
+            </w:r>
+            <w:proofErr w:type="spellEnd"/>
+            <w:r>
+              <w:rPr>
+                <w:rFonts w:ascii="Arial Narrow" w:hAnsi="Arial Narrow" w:cs="Times New Roman"/>
+                <w:sz w:val="24"/>
+                <w:szCs w:val="24"/>
+              </w:rPr>
+              <w:t>}.</w:t>
             </w:r>
           </w:p>
           <w:p>
@@ -3964,13 +5988,23 @@
                       <w:szCs w:val="24"/>
                     </w:rPr>
                   </w:pPr>
+                  <w:proofErr w:type="spellStart"/>
                   <w:r>
                     <w:rPr>
                       <w:rFonts w:ascii="Arial Narrow" w:hAnsi="Arial Narrow" w:cs="Times New Roman"/>
                       <w:sz w:val="24"/>
                       <w:szCs w:val="24"/>
                     </w:rPr>
-                    <w:t>Tembusan :</w:t>
+                    <w:t>Tembusan</w:t>
+                  </w:r>
+                  <w:proofErr w:type="spellEnd"/>
+                  <w:r>
+                    <w:rPr>
+                      <w:rFonts w:ascii="Arial Narrow" w:hAnsi="Arial Narrow" w:cs="Times New Roman"/>
+                      <w:sz w:val="24"/>
+                      <w:szCs w:val="24"/>
+                    </w:rPr>
+                    <w:t xml:space="preserve"> :</w:t>
                   </w:r>
                 </w:p>
               </w:tc>
@@ -4000,8 +6034,9 @@
                       <w:sz w:val="24"/>
                       <w:szCs w:val="24"/>
                     </w:rPr>
-                    <w:t>${carbon</w:t>
-                  </w:r>
+                    <w:t>${</w:t>
+                  </w:r>
+                  <w:proofErr w:type="spellStart"/>
                   <w:r>
                     <w:rPr>
                       <w:rFonts w:ascii="Arial Narrow" w:eastAsia="Arial Narrow" w:hAnsi="Arial Narrow" w:cs="Times New Roman"/>
@@ -4010,7 +6045,7 @@
                       <w:sz w:val="24"/>
                       <w:szCs w:val="24"/>
                     </w:rPr>
-                    <w:t>_c</w:t>
+                    <w:t>carbon</w:t>
                   </w:r>
                   <w:r>
                     <w:rPr>
@@ -4020,7 +6055,7 @@
                       <w:sz w:val="24"/>
                       <w:szCs w:val="24"/>
                     </w:rPr>
-                    <w:t>opy</w:t>
+                    <w:t>_c</w:t>
                   </w:r>
                   <w:r>
                     <w:rPr>
@@ -4030,7 +6065,7 @@
                       <w:sz w:val="24"/>
                       <w:szCs w:val="24"/>
                     </w:rPr>
-                    <w:t>_i</w:t>
+                    <w:t>opy</w:t>
                   </w:r>
                   <w:r>
                     <w:rPr>
@@ -4040,7 +6075,7 @@
                       <w:sz w:val="24"/>
                       <w:szCs w:val="24"/>
                     </w:rPr>
-                    <w:t>teration}. ${carbon</w:t>
+                    <w:t>_i</w:t>
                   </w:r>
                   <w:r>
                     <w:rPr>
@@ -4050,8 +6085,9 @@
                       <w:sz w:val="24"/>
                       <w:szCs w:val="24"/>
                     </w:rPr>
-                    <w:t>_c</w:t>
-                  </w:r>
+                    <w:t>teration</w:t>
+                  </w:r>
+                  <w:proofErr w:type="spellEnd"/>
                   <w:r>
                     <w:rPr>
                       <w:rFonts w:ascii="Arial Narrow" w:eastAsia="Arial Narrow" w:hAnsi="Arial Narrow" w:cs="Times New Roman"/>
@@ -4060,8 +6096,9 @@
                       <w:sz w:val="24"/>
                       <w:szCs w:val="24"/>
                     </w:rPr>
-                    <w:t>opy</w:t>
-                  </w:r>
+                    <w:t>}. ${</w:t>
+                  </w:r>
+                  <w:proofErr w:type="spellStart"/>
                   <w:r>
                     <w:rPr>
                       <w:rFonts w:ascii="Arial Narrow" w:eastAsia="Arial Narrow" w:hAnsi="Arial Narrow" w:cs="Times New Roman"/>
@@ -4070,7 +6107,7 @@
                       <w:sz w:val="24"/>
                       <w:szCs w:val="24"/>
                     </w:rPr>
-                    <w:t>_n</w:t>
+                    <w:t>carbon</w:t>
                   </w:r>
                   <w:r>
                     <w:rPr>
@@ -4080,7 +6117,48 @@
                       <w:sz w:val="24"/>
                       <w:szCs w:val="24"/>
                     </w:rPr>
-                    <w:t>ame}</w:t>
+                    <w:t>_c</w:t>
+                  </w:r>
+                  <w:r>
+                    <w:rPr>
+                      <w:rFonts w:ascii="Arial Narrow" w:eastAsia="Arial Narrow" w:hAnsi="Arial Narrow" w:cs="Times New Roman"/>
+                      <w:bCs/>
+                      <w:color w:val="000000"/>
+                      <w:sz w:val="24"/>
+                      <w:szCs w:val="24"/>
+                    </w:rPr>
+                    <w:t>opy</w:t>
+                  </w:r>
+                  <w:r>
+                    <w:rPr>
+                      <w:rFonts w:ascii="Arial Narrow" w:eastAsia="Arial Narrow" w:hAnsi="Arial Narrow" w:cs="Times New Roman"/>
+                      <w:bCs/>
+                      <w:color w:val="000000"/>
+                      <w:sz w:val="24"/>
+                      <w:szCs w:val="24"/>
+                    </w:rPr>
+                    <w:t>_n</w:t>
+                  </w:r>
+                  <w:r>
+                    <w:rPr>
+                      <w:rFonts w:ascii="Arial Narrow" w:eastAsia="Arial Narrow" w:hAnsi="Arial Narrow" w:cs="Times New Roman"/>
+                      <w:bCs/>
+                      <w:color w:val="000000"/>
+                      <w:sz w:val="24"/>
+                      <w:szCs w:val="24"/>
+                    </w:rPr>
+                    <w:t>ame</w:t>
+                  </w:r>
+                  <w:proofErr w:type="spellEnd"/>
+                  <w:r>
+                    <w:rPr>
+                      <w:rFonts w:ascii="Arial Narrow" w:eastAsia="Arial Narrow" w:hAnsi="Arial Narrow" w:cs="Times New Roman"/>
+                      <w:bCs/>
+                      <w:color w:val="000000"/>
+                      <w:sz w:val="24"/>
+                      <w:szCs w:val="24"/>
+                    </w:rPr>
+                    <w:t>}</w:t>
                   </w:r>
                 </w:p>
               </w:tc>
@@ -4153,7 +6231,29 @@
                       <w:sz w:val="24"/>
                       <w:szCs w:val="24"/>
                     </w:rPr>
-                    <w:t>${signatoryHeadText}</w:t>
+                    <w:t>${</w:t>
+                  </w:r>
+                  <w:proofErr w:type="spellStart"/>
+                  <w:r>
+                    <w:rPr>
+                      <w:rFonts w:ascii="Arial Narrow" w:eastAsia="Arial Narrow" w:hAnsi="Arial Narrow" w:cs="Times New Roman"/>
+                      <w:bCs/>
+                      <w:color w:val="000000"/>
+                      <w:sz w:val="24"/>
+                      <w:szCs w:val="24"/>
+                    </w:rPr>
+                    <w:t>signatoryHeadText</w:t>
+                  </w:r>
+                  <w:proofErr w:type="spellEnd"/>
+                  <w:r>
+                    <w:rPr>
+                      <w:rFonts w:ascii="Arial Narrow" w:eastAsia="Arial Narrow" w:hAnsi="Arial Narrow" w:cs="Times New Roman"/>
+                      <w:bCs/>
+                      <w:color w:val="000000"/>
+                      <w:sz w:val="24"/>
+                      <w:szCs w:val="24"/>
+                    </w:rPr>
+                    <w:t>}</w:t>
                   </w:r>
                 </w:p>
               </w:tc>
@@ -4185,7 +6285,29 @@
                       <w:sz w:val="24"/>
                       <w:szCs w:val="24"/>
                     </w:rPr>
-                    <w:t>${signatoryPositionName}</w:t>
+                    <w:t>${</w:t>
+                  </w:r>
+                  <w:proofErr w:type="spellStart"/>
+                  <w:r>
+                    <w:rPr>
+                      <w:rFonts w:ascii="Arial Narrow" w:eastAsia="Arial Narrow" w:hAnsi="Arial Narrow" w:cs="Times New Roman"/>
+                      <w:bCs/>
+                      <w:color w:val="000000"/>
+                      <w:sz w:val="24"/>
+                      <w:szCs w:val="24"/>
+                    </w:rPr>
+                    <w:t>signatoryPositionName</w:t>
+                  </w:r>
+                  <w:proofErr w:type="spellEnd"/>
+                  <w:r>
+                    <w:rPr>
+                      <w:rFonts w:ascii="Arial Narrow" w:eastAsia="Arial Narrow" w:hAnsi="Arial Narrow" w:cs="Times New Roman"/>
+                      <w:bCs/>
+                      <w:color w:val="000000"/>
+                      <w:sz w:val="24"/>
+                      <w:szCs w:val="24"/>
+                    </w:rPr>
+                    <w:t>}</w:t>
                   </w:r>
                 </w:p>
               </w:tc>
@@ -4319,7 +6441,29 @@
                             <w:sz w:val="24"/>
                             <w:szCs w:val="24"/>
                           </w:rPr>
-                          <w:t>${signatoryName}</w:t>
+                          <w:t>${</w:t>
+                        </w:r>
+                        <w:proofErr w:type="spellStart"/>
+                        <w:r>
+                          <w:rPr>
+                            <w:rFonts w:ascii="Arial Narrow" w:eastAsia="Arial Narrow" w:hAnsi="Arial Narrow" w:cs="Times New Roman"/>
+                            <w:b/>
+                            <w:color w:val="000000"/>
+                            <w:sz w:val="24"/>
+                            <w:szCs w:val="24"/>
+                          </w:rPr>
+                          <w:t>signatoryName</w:t>
+                        </w:r>
+                        <w:proofErr w:type="spellEnd"/>
+                        <w:r>
+                          <w:rPr>
+                            <w:rFonts w:ascii="Arial Narrow" w:eastAsia="Arial Narrow" w:hAnsi="Arial Narrow" w:cs="Times New Roman"/>
+                            <w:b/>
+                            <w:color w:val="000000"/>
+                            <w:sz w:val="24"/>
+                            <w:szCs w:val="24"/>
+                          </w:rPr>
+                          <w:t>}</w:t>
                         </w:r>
                       </w:p>
                     </w:tc>
@@ -4355,7 +6499,29 @@
                             <w:sz w:val="24"/>
                             <w:szCs w:val="24"/>
                           </w:rPr>
-                          <w:t>${signatoryRankName}</w:t>
+                          <w:t>${</w:t>
+                        </w:r>
+                        <w:proofErr w:type="spellStart"/>
+                        <w:r>
+                          <w:rPr>
+                            <w:rFonts w:ascii="Arial Narrow" w:eastAsia="Arial Narrow" w:hAnsi="Arial Narrow" w:cs="Times New Roman"/>
+                            <w:bCs/>
+                            <w:color w:val="000000"/>
+                            <w:sz w:val="24"/>
+                            <w:szCs w:val="24"/>
+                          </w:rPr>
+                          <w:t>signatoryRankName</w:t>
+                        </w:r>
+                        <w:proofErr w:type="spellEnd"/>
+                        <w:r>
+                          <w:rPr>
+                            <w:rFonts w:ascii="Arial Narrow" w:eastAsia="Arial Narrow" w:hAnsi="Arial Narrow" w:cs="Times New Roman"/>
+                            <w:bCs/>
+                            <w:color w:val="000000"/>
+                            <w:sz w:val="24"/>
+                            <w:szCs w:val="24"/>
+                          </w:rPr>
+                          <w:t>}</w:t>
                         </w:r>
                         <w:r>
                           <w:rPr>
@@ -4375,7 +6541,29 @@
                             <w:sz w:val="24"/>
                             <w:szCs w:val="24"/>
                           </w:rPr>
-                          <w:t>${signatoryRegisterNumber}</w:t>
+                          <w:t>${</w:t>
+                        </w:r>
+                        <w:proofErr w:type="spellStart"/>
+                        <w:r>
+                          <w:rPr>
+                            <w:rFonts w:ascii="Arial Narrow" w:eastAsia="Arial Narrow" w:hAnsi="Arial Narrow" w:cs="Times New Roman"/>
+                            <w:bCs/>
+                            <w:color w:val="000000"/>
+                            <w:sz w:val="24"/>
+                            <w:szCs w:val="24"/>
+                          </w:rPr>
+                          <w:t>signatoryRegisterNumber</w:t>
+                        </w:r>
+                        <w:proofErr w:type="spellEnd"/>
+                        <w:r>
+                          <w:rPr>
+                            <w:rFonts w:ascii="Arial Narrow" w:eastAsia="Arial Narrow" w:hAnsi="Arial Narrow" w:cs="Times New Roman"/>
+                            <w:bCs/>
+                            <w:color w:val="000000"/>
+                            <w:sz w:val="24"/>
+                            <w:szCs w:val="24"/>
+                          </w:rPr>
+                          <w:t>}</w:t>
                         </w:r>
                       </w:p>
                     </w:tc>

</xml_diff>

<commit_message>
feat(docs): tambahkan nama kota sebelum tanggal surat pada template word s22 pertama dan kedua
</commit_message>
<xml_diff>
--- a/public/word-template/surat_permintaan_perpanjangan_penahanan_kedua_30_hari.docx
+++ b/public/word-template/surat_permintaan_perpanjangan_penahanan_kedua_30_hari.docx
@@ -77,7 +77,7 @@
                       <w:lang w:val="en-US"/>
                     </w:rPr>
                     <w:drawing>
-                      <wp:inline distT="0" distB="0" distL="0" distR="0" wp14:anchorId="1D461AF8" wp14:editId="233C4F70">
+                      <wp:inline distT="0" distB="0" distL="0" distR="0" wp14:anchorId="1D461AF8" wp14:editId="3B69D9EB">
                         <wp:extent cx="738127" cy="690404"/>
                         <wp:effectExtent l="0" t="0" r="5080" b="0"/>
                         <wp:docPr id="6" name="Picture 6"/>
@@ -162,25 +162,7 @@
                       <w:sz w:val="24"/>
                       <w:szCs w:val="24"/>
                     </w:rPr>
-                    <w:t>DAERAH ${</w:t>
-                  </w:r>
-                  <w:proofErr w:type="spellStart"/>
-                  <w:r>
-                    <w:rPr>
-                      <w:rFonts w:ascii="Arial Narrow" w:hAnsi="Arial Narrow"/>
-                      <w:sz w:val="24"/>
-                      <w:szCs w:val="24"/>
-                    </w:rPr>
-                    <w:t>daerahPoliceFullName</w:t>
-                  </w:r>
-                  <w:proofErr w:type="spellEnd"/>
-                  <w:r>
-                    <w:rPr>
-                      <w:rFonts w:ascii="Arial Narrow" w:hAnsi="Arial Narrow"/>
-                      <w:sz w:val="24"/>
-                      <w:szCs w:val="24"/>
-                    </w:rPr>
-                    <w:t>}</w:t>
+                    <w:t>DAERAH ${daerahPoliceFullName}</w:t>
                   </w:r>
                 </w:p>
                 <w:p>
@@ -198,25 +180,7 @@
                       <w:sz w:val="24"/>
                       <w:szCs w:val="24"/>
                     </w:rPr>
-                    <w:t>${</w:t>
-                  </w:r>
-                  <w:proofErr w:type="spellStart"/>
-                  <w:r>
-                    <w:rPr>
-                      <w:rFonts w:ascii="Arial Narrow" w:hAnsi="Arial Narrow"/>
-                      <w:sz w:val="24"/>
-                      <w:szCs w:val="24"/>
-                    </w:rPr>
-                    <w:t>resorPoliceFullName</w:t>
-                  </w:r>
-                  <w:proofErr w:type="spellEnd"/>
-                  <w:r>
-                    <w:rPr>
-                      <w:rFonts w:ascii="Arial Narrow" w:hAnsi="Arial Narrow"/>
-                      <w:sz w:val="24"/>
-                      <w:szCs w:val="24"/>
-                    </w:rPr>
-                    <w:t>}</w:t>
+                    <w:t>${resorPoliceFullName}</w:t>
                   </w:r>
                 </w:p>
                 <w:p>
@@ -234,25 +198,7 @@
                       <w:sz w:val="24"/>
                       <w:szCs w:val="24"/>
                     </w:rPr>
-                    <w:t>${</w:t>
-                  </w:r>
-                  <w:proofErr w:type="spellStart"/>
-                  <w:r>
-                    <w:rPr>
-                      <w:rFonts w:ascii="Arial Narrow" w:hAnsi="Arial Narrow"/>
-                      <w:sz w:val="24"/>
-                      <w:szCs w:val="24"/>
-                    </w:rPr>
-                    <w:t>resorPoliceAddress</w:t>
-                  </w:r>
-                  <w:proofErr w:type="spellEnd"/>
-                  <w:r>
-                    <w:rPr>
-                      <w:rFonts w:ascii="Arial Narrow" w:hAnsi="Arial Narrow"/>
-                      <w:sz w:val="24"/>
-                      <w:szCs w:val="24"/>
-                    </w:rPr>
-                    <w:t>}</w:t>
+                    <w:t>${resorPoliceAddress}</w:t>
                   </w:r>
                 </w:p>
               </w:tc>
@@ -322,27 +268,7 @@
                 <w:sz w:val="24"/>
                 <w:szCs w:val="24"/>
               </w:rPr>
-              <w:t>${</w:t>
-            </w:r>
-            <w:proofErr w:type="spellStart"/>
-            <w:r>
-              <w:rPr>
-                <w:rFonts w:ascii="Arial Narrow" w:hAnsi="Arial Narrow" w:cs="Times New Roman"/>
-                <w:color w:val="000000"/>
-                <w:sz w:val="24"/>
-                <w:szCs w:val="24"/>
-              </w:rPr>
-              <w:t>documentLocation</w:t>
-            </w:r>
-            <w:proofErr w:type="spellEnd"/>
-            <w:r>
-              <w:rPr>
-                <w:rFonts w:ascii="Arial Narrow" w:hAnsi="Arial Narrow" w:cs="Times New Roman"/>
-                <w:color w:val="000000"/>
-                <w:sz w:val="24"/>
-                <w:szCs w:val="24"/>
-              </w:rPr>
-              <w:t>}</w:t>
+              <w:t>${documentLocation}</w:t>
             </w:r>
           </w:p>
           <w:p>
@@ -364,27 +290,7 @@
                 <w:sz w:val="24"/>
                 <w:szCs w:val="24"/>
               </w:rPr>
-              <w:t>${</w:t>
-            </w:r>
-            <w:proofErr w:type="spellStart"/>
-            <w:r>
-              <w:rPr>
-                <w:rFonts w:ascii="Arial Narrow" w:hAnsi="Arial Narrow" w:cs="Times New Roman"/>
-                <w:color w:val="000000"/>
-                <w:sz w:val="24"/>
-                <w:szCs w:val="24"/>
-              </w:rPr>
-              <w:t>documentDate</w:t>
-            </w:r>
-            <w:proofErr w:type="spellEnd"/>
-            <w:r>
-              <w:rPr>
-                <w:rFonts w:ascii="Arial Narrow" w:hAnsi="Arial Narrow" w:cs="Times New Roman"/>
-                <w:color w:val="000000"/>
-                <w:sz w:val="24"/>
-                <w:szCs w:val="24"/>
-              </w:rPr>
-              <w:t>}</w:t>
+              <w:t>${documentCity}, ${documentDate}</w:t>
             </w:r>
           </w:p>
         </w:tc>
@@ -486,7 +392,6 @@
                 <w:szCs w:val="24"/>
               </w:rPr>
             </w:pPr>
-            <w:proofErr w:type="spellStart"/>
             <w:r>
               <w:rPr>
                 <w:rFonts w:ascii="Arial Narrow" w:hAnsi="Arial Narrow" w:cs="Times New Roman"/>
@@ -495,7 +400,6 @@
               </w:rPr>
               <w:t>Nomor</w:t>
             </w:r>
-            <w:proofErr w:type="spellEnd"/>
           </w:p>
         </w:tc>
         <w:tc>
@@ -539,25 +443,7 @@
                 <w:sz w:val="24"/>
                 <w:szCs w:val="24"/>
               </w:rPr>
-              <w:t>${</w:t>
-            </w:r>
-            <w:proofErr w:type="spellStart"/>
-            <w:r>
-              <w:rPr>
-                <w:rFonts w:ascii="Arial Narrow" w:hAnsi="Arial Narrow" w:cs="Times New Roman"/>
-                <w:sz w:val="24"/>
-                <w:szCs w:val="24"/>
-              </w:rPr>
-              <w:t>documentNumber</w:t>
-            </w:r>
-            <w:proofErr w:type="spellEnd"/>
-            <w:r>
-              <w:rPr>
-                <w:rFonts w:ascii="Arial Narrow" w:hAnsi="Arial Narrow" w:cs="Times New Roman"/>
-                <w:sz w:val="24"/>
-                <w:szCs w:val="24"/>
-              </w:rPr>
-              <w:t>}</w:t>
+              <w:t>${documentNumber}</w:t>
             </w:r>
           </w:p>
         </w:tc>
@@ -590,7 +476,6 @@
                 <w:szCs w:val="24"/>
               </w:rPr>
             </w:pPr>
-            <w:proofErr w:type="spellStart"/>
             <w:r>
               <w:rPr>
                 <w:rFonts w:ascii="Arial Narrow" w:hAnsi="Arial Narrow" w:cs="Times New Roman"/>
@@ -599,7 +484,6 @@
               </w:rPr>
               <w:t>Klasifikasi</w:t>
             </w:r>
-            <w:proofErr w:type="spellEnd"/>
           </w:p>
         </w:tc>
         <w:tc>
@@ -644,25 +528,7 @@
                 <w:sz w:val="24"/>
                 <w:szCs w:val="24"/>
               </w:rPr>
-              <w:t>${</w:t>
-            </w:r>
-            <w:proofErr w:type="spellStart"/>
-            <w:r>
-              <w:rPr>
-                <w:rFonts w:ascii="Arial Narrow" w:hAnsi="Arial Narrow" w:cs="Times New Roman"/>
-                <w:sz w:val="24"/>
-                <w:szCs w:val="24"/>
-              </w:rPr>
-              <w:t>documentClassificationName</w:t>
-            </w:r>
-            <w:proofErr w:type="spellEnd"/>
-            <w:r>
-              <w:rPr>
-                <w:rFonts w:ascii="Arial Narrow" w:hAnsi="Arial Narrow" w:cs="Times New Roman"/>
-                <w:sz w:val="24"/>
-                <w:szCs w:val="24"/>
-              </w:rPr>
-              <w:t>}</w:t>
+              <w:t>${documentClassificationName}</w:t>
             </w:r>
           </w:p>
         </w:tc>
@@ -804,7 +670,6 @@
                 <w:u w:val="single"/>
               </w:rPr>
             </w:pPr>
-            <w:proofErr w:type="spellStart"/>
             <w:r>
               <w:rPr>
                 <w:rFonts w:ascii="Arial Narrow" w:hAnsi="Arial Narrow" w:cs="Times New Roman"/>
@@ -819,63 +684,8 @@
                 <w:sz w:val="24"/>
                 <w:szCs w:val="24"/>
               </w:rPr>
-              <w:t>ermohonan</w:t>
-            </w:r>
-            <w:proofErr w:type="spellEnd"/>
-            <w:r>
-              <w:rPr>
-                <w:rFonts w:ascii="Arial Narrow" w:hAnsi="Arial Narrow" w:cs="Times New Roman"/>
-                <w:sz w:val="24"/>
-                <w:szCs w:val="24"/>
-              </w:rPr>
-              <w:t xml:space="preserve"> </w:t>
-            </w:r>
-            <w:proofErr w:type="spellStart"/>
-            <w:r>
-              <w:rPr>
-                <w:rFonts w:ascii="Arial Narrow" w:hAnsi="Arial Narrow" w:cs="Times New Roman"/>
-                <w:sz w:val="24"/>
-                <w:szCs w:val="24"/>
-              </w:rPr>
-              <w:t>perpanjangan</w:t>
-            </w:r>
-            <w:proofErr w:type="spellEnd"/>
-            <w:r>
-              <w:rPr>
-                <w:rFonts w:ascii="Arial Narrow" w:hAnsi="Arial Narrow" w:cs="Times New Roman"/>
-                <w:sz w:val="24"/>
-                <w:szCs w:val="24"/>
-              </w:rPr>
-              <w:t xml:space="preserve"> </w:t>
-            </w:r>
-            <w:proofErr w:type="spellStart"/>
-            <w:r>
-              <w:rPr>
-                <w:rFonts w:ascii="Arial Narrow" w:hAnsi="Arial Narrow" w:cs="Times New Roman"/>
-                <w:sz w:val="24"/>
-                <w:szCs w:val="24"/>
-              </w:rPr>
-              <w:t>penahanan</w:t>
-            </w:r>
-            <w:proofErr w:type="spellEnd"/>
-            <w:r>
-              <w:rPr>
-                <w:rFonts w:ascii="Arial Narrow" w:hAnsi="Arial Narrow" w:cs="Times New Roman"/>
-                <w:sz w:val="24"/>
-                <w:szCs w:val="24"/>
-              </w:rPr>
-              <w:t xml:space="preserve"> </w:t>
-            </w:r>
-            <w:proofErr w:type="spellStart"/>
-            <w:r>
-              <w:rPr>
-                <w:rFonts w:ascii="Arial Narrow" w:hAnsi="Arial Narrow" w:cs="Times New Roman"/>
-                <w:sz w:val="24"/>
-                <w:szCs w:val="24"/>
-              </w:rPr>
-              <w:t>tersangka</w:t>
-            </w:r>
-            <w:proofErr w:type="spellEnd"/>
+              <w:t>ermohonan perpanjangan penahanan tersangka</w:t>
+            </w:r>
           </w:p>
         </w:tc>
         <w:tc>
@@ -922,7 +732,6 @@
                 <w:szCs w:val="24"/>
               </w:rPr>
             </w:pPr>
-            <w:proofErr w:type="spellStart"/>
             <w:r>
               <w:rPr>
                 <w:rFonts w:ascii="Arial Narrow" w:hAnsi="Arial Narrow" w:cs="Times New Roman"/>
@@ -931,7 +740,6 @@
               </w:rPr>
               <w:t>Kepada</w:t>
             </w:r>
-            <w:proofErr w:type="spellEnd"/>
           </w:p>
         </w:tc>
       </w:tr>
@@ -1101,23 +909,13 @@
                 <w:szCs w:val="24"/>
               </w:rPr>
             </w:pPr>
-            <w:proofErr w:type="spellStart"/>
-            <w:r>
-              <w:rPr>
-                <w:rFonts w:ascii="Arial Narrow" w:hAnsi="Arial Narrow" w:cs="Times New Roman"/>
-                <w:sz w:val="24"/>
-                <w:szCs w:val="24"/>
-              </w:rPr>
-              <w:t>Yth</w:t>
-            </w:r>
-            <w:proofErr w:type="spellEnd"/>
-            <w:r>
-              <w:rPr>
-                <w:rFonts w:ascii="Arial Narrow" w:hAnsi="Arial Narrow" w:cs="Times New Roman"/>
-                <w:sz w:val="24"/>
-                <w:szCs w:val="24"/>
-              </w:rPr>
-              <w:t>.</w:t>
+            <w:r>
+              <w:rPr>
+                <w:rFonts w:ascii="Arial Narrow" w:hAnsi="Arial Narrow" w:cs="Times New Roman"/>
+                <w:sz w:val="24"/>
+                <w:szCs w:val="24"/>
+              </w:rPr>
+              <w:t>Yth.</w:t>
             </w:r>
           </w:p>
         </w:tc>
@@ -1155,25 +953,7 @@
                 <w:sz w:val="24"/>
                 <w:szCs w:val="24"/>
               </w:rPr>
-              <w:t>${</w:t>
-            </w:r>
-            <w:proofErr w:type="spellStart"/>
-            <w:r>
-              <w:rPr>
-                <w:rFonts w:ascii="Arial Narrow" w:hAnsi="Arial Narrow" w:cs="Times New Roman"/>
-                <w:sz w:val="24"/>
-                <w:szCs w:val="24"/>
-              </w:rPr>
-              <w:t>prosecutorName</w:t>
-            </w:r>
-            <w:proofErr w:type="spellEnd"/>
-            <w:r>
-              <w:rPr>
-                <w:rFonts w:ascii="Arial Narrow" w:hAnsi="Arial Narrow" w:cs="Times New Roman"/>
-                <w:sz w:val="24"/>
-                <w:szCs w:val="24"/>
-              </w:rPr>
-              <w:t>}</w:t>
+              <w:t>${prosecutorName}</w:t>
             </w:r>
           </w:p>
         </w:tc>
@@ -1560,27 +1340,7 @@
                 <w:szCs w:val="24"/>
                 <w:u w:val="single"/>
               </w:rPr>
-              <w:t>${</w:t>
-            </w:r>
-            <w:proofErr w:type="spellStart"/>
-            <w:r>
-              <w:rPr>
-                <w:rFonts w:ascii="Arial Narrow" w:hAnsi="Arial Narrow" w:cs="Times New Roman"/>
-                <w:sz w:val="24"/>
-                <w:szCs w:val="24"/>
-                <w:u w:val="single"/>
-              </w:rPr>
-              <w:t>prosecutorLocation</w:t>
-            </w:r>
-            <w:proofErr w:type="spellEnd"/>
-            <w:r>
-              <w:rPr>
-                <w:rFonts w:ascii="Arial Narrow" w:hAnsi="Arial Narrow" w:cs="Times New Roman"/>
-                <w:sz w:val="24"/>
-                <w:szCs w:val="24"/>
-                <w:u w:val="single"/>
-              </w:rPr>
-              <w:t>}</w:t>
+              <w:t>${prosecutorLocation}</w:t>
             </w:r>
           </w:p>
         </w:tc>
@@ -1667,7 +1427,6 @@
                 <w:lang w:eastAsia="en-ID"/>
               </w:rPr>
             </w:pPr>
-            <w:proofErr w:type="spellStart"/>
             <w:r>
               <w:rPr>
                 <w:rFonts w:ascii="Arial Narrow" w:eastAsia="Times New Roman" w:hAnsi="Arial Narrow" w:cs="Times New Roman"/>
@@ -1677,7 +1436,6 @@
               </w:rPr>
               <w:t>Rujukan</w:t>
             </w:r>
-            <w:proofErr w:type="spellEnd"/>
             <w:r>
               <w:rPr>
                 <w:rFonts w:ascii="Arial Narrow" w:eastAsia="Times New Roman" w:hAnsi="Arial Narrow" w:cs="Times New Roman"/>
@@ -1749,95 +1507,13 @@
                 <w:szCs w:val="24"/>
               </w:rPr>
             </w:pPr>
-            <w:proofErr w:type="spellStart"/>
-            <w:r>
-              <w:rPr>
-                <w:rFonts w:ascii="Arial Narrow" w:hAnsi="Arial Narrow" w:cs="Times New Roman"/>
-                <w:sz w:val="24"/>
-                <w:szCs w:val="24"/>
-              </w:rPr>
-              <w:t>Undang-Undang</w:t>
-            </w:r>
-            <w:proofErr w:type="spellEnd"/>
-            <w:r>
-              <w:rPr>
-                <w:rFonts w:ascii="Arial Narrow" w:hAnsi="Arial Narrow" w:cs="Times New Roman"/>
-                <w:sz w:val="24"/>
-                <w:szCs w:val="24"/>
-              </w:rPr>
-              <w:t xml:space="preserve"> </w:t>
-            </w:r>
-            <w:proofErr w:type="spellStart"/>
-            <w:r>
-              <w:rPr>
-                <w:rFonts w:ascii="Arial Narrow" w:hAnsi="Arial Narrow" w:cs="Times New Roman"/>
-                <w:sz w:val="24"/>
-                <w:szCs w:val="24"/>
-              </w:rPr>
-              <w:t>Nomor</w:t>
-            </w:r>
-            <w:proofErr w:type="spellEnd"/>
-            <w:r>
-              <w:rPr>
-                <w:rFonts w:ascii="Arial Narrow" w:hAnsi="Arial Narrow" w:cs="Times New Roman"/>
-                <w:sz w:val="24"/>
-                <w:szCs w:val="24"/>
-              </w:rPr>
-              <w:t xml:space="preserve"> 2 </w:t>
-            </w:r>
-            <w:proofErr w:type="spellStart"/>
-            <w:r>
-              <w:rPr>
-                <w:rFonts w:ascii="Arial Narrow" w:hAnsi="Arial Narrow" w:cs="Times New Roman"/>
-                <w:sz w:val="24"/>
-                <w:szCs w:val="24"/>
-              </w:rPr>
-              <w:t>Tahun</w:t>
-            </w:r>
-            <w:proofErr w:type="spellEnd"/>
-            <w:r>
-              <w:rPr>
-                <w:rFonts w:ascii="Arial Narrow" w:hAnsi="Arial Narrow" w:cs="Times New Roman"/>
-                <w:sz w:val="24"/>
-                <w:szCs w:val="24"/>
-              </w:rPr>
-              <w:t xml:space="preserve"> 2002 </w:t>
-            </w:r>
-            <w:proofErr w:type="spellStart"/>
-            <w:r>
-              <w:rPr>
-                <w:rFonts w:ascii="Arial Narrow" w:hAnsi="Arial Narrow" w:cs="Times New Roman"/>
-                <w:sz w:val="24"/>
-                <w:szCs w:val="24"/>
-              </w:rPr>
-              <w:t>tentang</w:t>
-            </w:r>
-            <w:proofErr w:type="spellEnd"/>
-            <w:r>
-              <w:rPr>
-                <w:rFonts w:ascii="Arial Narrow" w:hAnsi="Arial Narrow" w:cs="Times New Roman"/>
-                <w:sz w:val="24"/>
-                <w:szCs w:val="24"/>
-              </w:rPr>
-              <w:t xml:space="preserve"> </w:t>
-            </w:r>
-            <w:proofErr w:type="spellStart"/>
-            <w:r>
-              <w:rPr>
-                <w:rFonts w:ascii="Arial Narrow" w:hAnsi="Arial Narrow" w:cs="Times New Roman"/>
-                <w:sz w:val="24"/>
-                <w:szCs w:val="24"/>
-              </w:rPr>
-              <w:t>Kepolisian</w:t>
-            </w:r>
-            <w:proofErr w:type="spellEnd"/>
-            <w:r>
-              <w:rPr>
-                <w:rFonts w:ascii="Arial Narrow" w:hAnsi="Arial Narrow" w:cs="Times New Roman"/>
-                <w:sz w:val="24"/>
-                <w:szCs w:val="24"/>
-              </w:rPr>
-              <w:t xml:space="preserve"> Negara Republik Indonesia;</w:t>
+            <w:r>
+              <w:rPr>
+                <w:rFonts w:ascii="Arial Narrow" w:hAnsi="Arial Narrow" w:cs="Times New Roman"/>
+                <w:sz w:val="24"/>
+                <w:szCs w:val="24"/>
+              </w:rPr>
+              <w:t>Undang-Undang Nomor 2 Tahun 2002 tentang Kepolisian Negara Republik Indonesia;</w:t>
             </w:r>
           </w:p>
         </w:tc>
@@ -1907,115 +1583,7 @@
                 <w:sz w:val="24"/>
                 <w:szCs w:val="24"/>
               </w:rPr>
-              <w:t xml:space="preserve">Pasal 3 dan Pasal 618 </w:t>
-            </w:r>
-            <w:proofErr w:type="spellStart"/>
-            <w:r>
-              <w:rPr>
-                <w:rFonts w:ascii="Arial Narrow" w:hAnsi="Arial Narrow" w:cs="Times New Roman"/>
-                <w:sz w:val="24"/>
-                <w:szCs w:val="24"/>
-              </w:rPr>
-              <w:t>Undang-Undang</w:t>
-            </w:r>
-            <w:proofErr w:type="spellEnd"/>
-            <w:r>
-              <w:rPr>
-                <w:rFonts w:ascii="Arial Narrow" w:hAnsi="Arial Narrow" w:cs="Times New Roman"/>
-                <w:sz w:val="24"/>
-                <w:szCs w:val="24"/>
-              </w:rPr>
-              <w:t xml:space="preserve"> </w:t>
-            </w:r>
-            <w:proofErr w:type="spellStart"/>
-            <w:r>
-              <w:rPr>
-                <w:rFonts w:ascii="Arial Narrow" w:hAnsi="Arial Narrow" w:cs="Times New Roman"/>
-                <w:sz w:val="24"/>
-                <w:szCs w:val="24"/>
-              </w:rPr>
-              <w:t>Nomor</w:t>
-            </w:r>
-            <w:proofErr w:type="spellEnd"/>
-            <w:r>
-              <w:rPr>
-                <w:rFonts w:ascii="Arial Narrow" w:hAnsi="Arial Narrow" w:cs="Times New Roman"/>
-                <w:sz w:val="24"/>
-                <w:szCs w:val="24"/>
-              </w:rPr>
-              <w:t xml:space="preserve"> 1 </w:t>
-            </w:r>
-            <w:proofErr w:type="spellStart"/>
-            <w:r>
-              <w:rPr>
-                <w:rFonts w:ascii="Arial Narrow" w:hAnsi="Arial Narrow" w:cs="Times New Roman"/>
-                <w:sz w:val="24"/>
-                <w:szCs w:val="24"/>
-              </w:rPr>
-              <w:t>Tahun</w:t>
-            </w:r>
-            <w:proofErr w:type="spellEnd"/>
-            <w:r>
-              <w:rPr>
-                <w:rFonts w:ascii="Arial Narrow" w:hAnsi="Arial Narrow" w:cs="Times New Roman"/>
-                <w:sz w:val="24"/>
-                <w:szCs w:val="24"/>
-              </w:rPr>
-              <w:t xml:space="preserve"> 2023 </w:t>
-            </w:r>
-            <w:proofErr w:type="spellStart"/>
-            <w:r>
-              <w:rPr>
-                <w:rFonts w:ascii="Arial Narrow" w:hAnsi="Arial Narrow" w:cs="Times New Roman"/>
-                <w:sz w:val="24"/>
-                <w:szCs w:val="24"/>
-              </w:rPr>
-              <w:t>tentang</w:t>
-            </w:r>
-            <w:proofErr w:type="spellEnd"/>
-            <w:r>
-              <w:rPr>
-                <w:rFonts w:ascii="Arial Narrow" w:hAnsi="Arial Narrow" w:cs="Times New Roman"/>
-                <w:sz w:val="24"/>
-                <w:szCs w:val="24"/>
-              </w:rPr>
-              <w:t xml:space="preserve"> Kitab </w:t>
-            </w:r>
-            <w:proofErr w:type="spellStart"/>
-            <w:r>
-              <w:rPr>
-                <w:rFonts w:ascii="Arial Narrow" w:hAnsi="Arial Narrow" w:cs="Times New Roman"/>
-                <w:sz w:val="24"/>
-                <w:szCs w:val="24"/>
-              </w:rPr>
-              <w:t>Undang-Undang</w:t>
-            </w:r>
-            <w:proofErr w:type="spellEnd"/>
-            <w:r>
-              <w:rPr>
-                <w:rFonts w:ascii="Arial Narrow" w:hAnsi="Arial Narrow" w:cs="Times New Roman"/>
-                <w:sz w:val="24"/>
-                <w:szCs w:val="24"/>
-              </w:rPr>
-              <w:t xml:space="preserve"> Hukum </w:t>
-            </w:r>
-            <w:proofErr w:type="spellStart"/>
-            <w:r>
-              <w:rPr>
-                <w:rFonts w:ascii="Arial Narrow" w:hAnsi="Arial Narrow" w:cs="Times New Roman"/>
-                <w:sz w:val="24"/>
-                <w:szCs w:val="24"/>
-              </w:rPr>
-              <w:t>Pidana</w:t>
-            </w:r>
-            <w:proofErr w:type="spellEnd"/>
-            <w:r>
-              <w:rPr>
-                <w:rFonts w:ascii="Arial Narrow" w:hAnsi="Arial Narrow" w:cs="Times New Roman"/>
-                <w:sz w:val="24"/>
-                <w:szCs w:val="24"/>
-              </w:rPr>
-              <w:t>;</w:t>
+              <w:t>Pasal 3 dan Pasal 618 Undang-Undang Nomor 1 Tahun 2023 tentang Kitab Undang-Undang Hukum Pidana;</w:t>
             </w:r>
           </w:p>
         </w:tc>
@@ -2160,10 +1728,19 @@
                 <w:shd w:val="clear" w:color="auto" w:fill="FFFFFF"/>
                 <w:lang w:eastAsia="en-ID"/>
               </w:rPr>
-              <w:t>${</w:t>
-            </w:r>
-            <w:proofErr w:type="spellStart"/>
-            <w:r>
+              <w:t>${rujukan_undang_undang};</w:t>
+            </w:r>
+          </w:p>
+        </w:tc>
+      </w:tr>
+      <w:tr>
+        <w:tc>
+          <w:tcPr>
+            <w:tcW w:w="226" w:type="dxa"/>
+          </w:tcPr>
+          <w:p>
+            <w:pPr>
+              <w:jc w:val="both"/>
               <w:rPr>
                 <w:rFonts w:ascii="Arial Narrow" w:eastAsia="Times New Roman" w:hAnsi="Arial Narrow" w:cs="Times New Roman"/>
                 <w:sz w:val="24"/>
@@ -2171,10 +1748,16 @@
                 <w:shd w:val="clear" w:color="auto" w:fill="FFFFFF"/>
                 <w:lang w:eastAsia="en-ID"/>
               </w:rPr>
-              <w:t>rujukan_undang_undang</w:t>
-            </w:r>
-            <w:proofErr w:type="spellEnd"/>
-            <w:r>
+            </w:pPr>
+          </w:p>
+        </w:tc>
+        <w:tc>
+          <w:tcPr>
+            <w:tcW w:w="341" w:type="dxa"/>
+          </w:tcPr>
+          <w:p>
+            <w:pPr>
+              <w:jc w:val="both"/>
               <w:rPr>
                 <w:rFonts w:ascii="Arial Narrow" w:eastAsia="Times New Roman" w:hAnsi="Arial Narrow" w:cs="Times New Roman"/>
                 <w:sz w:val="24"/>
@@ -2182,7 +1765,42 @@
                 <w:shd w:val="clear" w:color="auto" w:fill="FFFFFF"/>
                 <w:lang w:eastAsia="en-ID"/>
               </w:rPr>
-              <w:t>};</w:t>
+            </w:pPr>
+            <w:r>
+              <w:rPr>
+                <w:rFonts w:ascii="Arial Narrow" w:eastAsia="Times New Roman" w:hAnsi="Arial Narrow" w:cs="Times New Roman"/>
+                <w:sz w:val="24"/>
+                <w:szCs w:val="24"/>
+                <w:shd w:val="clear" w:color="auto" w:fill="FFFFFF"/>
+                <w:lang w:eastAsia="en-ID"/>
+              </w:rPr>
+              <w:t>e.</w:t>
+            </w:r>
+          </w:p>
+        </w:tc>
+        <w:tc>
+          <w:tcPr>
+            <w:tcW w:w="9356" w:type="dxa"/>
+          </w:tcPr>
+          <w:p>
+            <w:pPr>
+              <w:spacing w:line="276" w:lineRule="auto"/>
+              <w:jc w:val="both"/>
+              <w:rPr>
+                <w:rFonts w:ascii="Arial Narrow" w:hAnsi="Arial Narrow" w:cs="Times New Roman"/>
+                <w:sz w:val="24"/>
+                <w:szCs w:val="24"/>
+                <w:lang w:val="sv-SE"/>
+              </w:rPr>
+            </w:pPr>
+            <w:r>
+              <w:rPr>
+                <w:rFonts w:ascii="Arial Narrow" w:hAnsi="Arial Narrow" w:cs="Times New Roman"/>
+                <w:sz w:val="24"/>
+                <w:szCs w:val="24"/>
+                <w:lang w:val="sv-SE"/>
+              </w:rPr>
+              <w:t>Laporan Polisi Nomor: ${lpNumber} tanggal ${lpDate};</w:t>
             </w:r>
           </w:p>
         </w:tc>
@@ -2228,7 +1846,7 @@
                 <w:shd w:val="clear" w:color="auto" w:fill="FFFFFF"/>
                 <w:lang w:eastAsia="en-ID"/>
               </w:rPr>
-              <w:t>e.</w:t>
+              <w:t>f.</w:t>
             </w:r>
           </w:p>
         </w:tc>
@@ -2254,7 +1872,7 @@
                 <w:szCs w:val="24"/>
                 <w:lang w:val="sv-SE"/>
               </w:rPr>
-              <w:t>Laporan Polisi Nomor: ${lpNumber} tanggal ${lpDate};</w:t>
+              <w:t>Surat Perintah Penyidikan Nomor: ${sprintSidikNumber} tanggal ${sprintSidikDate};</w:t>
             </w:r>
           </w:p>
         </w:tc>
@@ -2300,7 +1918,7 @@
                 <w:shd w:val="clear" w:color="auto" w:fill="FFFFFF"/>
                 <w:lang w:eastAsia="en-ID"/>
               </w:rPr>
-              <w:t>f.</w:t>
+              <w:t>g.</w:t>
             </w:r>
           </w:p>
         </w:tc>
@@ -2326,7 +1944,7 @@
                 <w:szCs w:val="24"/>
                 <w:lang w:val="sv-SE"/>
               </w:rPr>
-              <w:t>Surat Perintah Penyidikan Nomor: ${sprintSidikNumber} tanggal ${sprintSidikDate};</w:t>
+              <w:t>Surat Pemberitahuan Dimulainya Penyidikan Nomor: ${spdpNumber}  tanggal ${spdpDate};</w:t>
             </w:r>
           </w:p>
         </w:tc>
@@ -2372,7 +1990,7 @@
                 <w:shd w:val="clear" w:color="auto" w:fill="FFFFFF"/>
                 <w:lang w:eastAsia="en-ID"/>
               </w:rPr>
-              <w:t>g.</w:t>
+              <w:t>h.</w:t>
             </w:r>
           </w:p>
         </w:tc>
@@ -2398,7 +2016,7 @@
                 <w:szCs w:val="24"/>
                 <w:lang w:val="sv-SE"/>
               </w:rPr>
-              <w:t>Surat Pemberitahuan Dimulainya Penyidikan Nomor: ${spdpNumber}  tanggal ${spdpDate};</w:t>
+              <w:t>Surat Ketetapan tentang Penetapan Tersangka Nomor: ${sketNumber} tanggal ${sketDate} atas nama ${sketSuspectName};</w:t>
             </w:r>
           </w:p>
         </w:tc>
@@ -2444,7 +2062,7 @@
                 <w:shd w:val="clear" w:color="auto" w:fill="FFFFFF"/>
                 <w:lang w:eastAsia="en-ID"/>
               </w:rPr>
-              <w:t>h.</w:t>
+              <w:t>i.</w:t>
             </w:r>
           </w:p>
         </w:tc>
@@ -2470,7 +2088,7 @@
                 <w:szCs w:val="24"/>
                 <w:lang w:val="sv-SE"/>
               </w:rPr>
-              <w:t>Surat Ketetapan tentang Penetapan Tersangka Nomor: ${sketNumber} tanggal ${sketDate} atas nama ${sketSuspectName};</w:t>
+              <w:t>Surat Perintah Penahanan Nomor: ${sphNumber}  tanggal ${sphDate} atas nama ${sphSuspectName};</w:t>
             </w:r>
           </w:p>
         </w:tc>
@@ -2508,7 +2126,6 @@
                 <w:lang w:eastAsia="en-ID"/>
               </w:rPr>
             </w:pPr>
-            <w:proofErr w:type="spellStart"/>
             <w:r>
               <w:rPr>
                 <w:rFonts w:ascii="Arial Narrow" w:eastAsia="Times New Roman" w:hAnsi="Arial Narrow" w:cs="Times New Roman"/>
@@ -2517,10 +2134,45 @@
                 <w:shd w:val="clear" w:color="auto" w:fill="FFFFFF"/>
                 <w:lang w:eastAsia="en-ID"/>
               </w:rPr>
-              <w:t>i</w:t>
-            </w:r>
-            <w:proofErr w:type="spellEnd"/>
-            <w:r>
+              <w:t>j.</w:t>
+            </w:r>
+          </w:p>
+        </w:tc>
+        <w:tc>
+          <w:tcPr>
+            <w:tcW w:w="9356" w:type="dxa"/>
+          </w:tcPr>
+          <w:p>
+            <w:pPr>
+              <w:spacing w:line="276" w:lineRule="auto"/>
+              <w:jc w:val="both"/>
+              <w:rPr>
+                <w:rFonts w:ascii="Arial Narrow" w:hAnsi="Arial Narrow" w:cs="Times New Roman"/>
+                <w:sz w:val="24"/>
+                <w:szCs w:val="24"/>
+                <w:lang w:val="sv-SE"/>
+              </w:rPr>
+            </w:pPr>
+            <w:r>
+              <w:rPr>
+                <w:rFonts w:ascii="Arial Narrow" w:hAnsi="Arial Narrow" w:cs="Times New Roman"/>
+                <w:sz w:val="24"/>
+                <w:szCs w:val="24"/>
+                <w:lang w:val="sv-SE"/>
+              </w:rPr>
+              <w:t>Surat Perpanjangan Penahanan dari ${nama_kejaksaan} Nomor: ${kejaksaanExtensionNumber} tanggal ${kejaksaanExtensionDate} atas nama ${kejaksaanExtensionSuspectName};</w:t>
+            </w:r>
+          </w:p>
+        </w:tc>
+      </w:tr>
+      <w:tr>
+        <w:tc>
+          <w:tcPr>
+            <w:tcW w:w="226" w:type="dxa"/>
+          </w:tcPr>
+          <w:p>
+            <w:pPr>
+              <w:jc w:val="both"/>
               <w:rPr>
                 <w:rFonts w:ascii="Arial Narrow" w:eastAsia="Times New Roman" w:hAnsi="Arial Narrow" w:cs="Times New Roman"/>
                 <w:sz w:val="24"/>
@@ -2528,41 +2180,12 @@
                 <w:shd w:val="clear" w:color="auto" w:fill="FFFFFF"/>
                 <w:lang w:eastAsia="en-ID"/>
               </w:rPr>
-              <w:t>.</w:t>
-            </w:r>
-          </w:p>
-        </w:tc>
-        <w:tc>
-          <w:tcPr>
-            <w:tcW w:w="9356" w:type="dxa"/>
-          </w:tcPr>
-          <w:p>
-            <w:pPr>
-              <w:spacing w:line="276" w:lineRule="auto"/>
-              <w:jc w:val="both"/>
-              <w:rPr>
-                <w:rFonts w:ascii="Arial Narrow" w:hAnsi="Arial Narrow" w:cs="Times New Roman"/>
-                <w:sz w:val="24"/>
-                <w:szCs w:val="24"/>
-                <w:lang w:val="sv-SE"/>
-              </w:rPr>
-            </w:pPr>
-            <w:r>
-              <w:rPr>
-                <w:rFonts w:ascii="Arial Narrow" w:hAnsi="Arial Narrow" w:cs="Times New Roman"/>
-                <w:sz w:val="24"/>
-                <w:szCs w:val="24"/>
-                <w:lang w:val="sv-SE"/>
-              </w:rPr>
-              <w:t>Surat Perintah Penahanan Nomor: ${sphNumber}  tanggal ${sphDate} atas nama ${sphSuspectName};</w:t>
-            </w:r>
-          </w:p>
-        </w:tc>
-      </w:tr>
-      <w:tr>
-        <w:tc>
-          <w:tcPr>
-            <w:tcW w:w="226" w:type="dxa"/>
+            </w:pPr>
+          </w:p>
+        </w:tc>
+        <w:tc>
+          <w:tcPr>
+            <w:tcW w:w="341" w:type="dxa"/>
           </w:tcPr>
           <w:p>
             <w:pPr>
@@ -2575,15 +2198,7 @@
                 <w:lang w:eastAsia="en-ID"/>
               </w:rPr>
             </w:pPr>
-          </w:p>
-        </w:tc>
-        <w:tc>
-          <w:tcPr>
-            <w:tcW w:w="341" w:type="dxa"/>
-          </w:tcPr>
-          <w:p>
-            <w:pPr>
-              <w:jc w:val="both"/>
+            <w:r>
               <w:rPr>
                 <w:rFonts w:ascii="Arial Narrow" w:eastAsia="Times New Roman" w:hAnsi="Arial Narrow" w:cs="Times New Roman"/>
                 <w:sz w:val="24"/>
@@ -2591,16 +2206,7 @@
                 <w:shd w:val="clear" w:color="auto" w:fill="FFFFFF"/>
                 <w:lang w:eastAsia="en-ID"/>
               </w:rPr>
-            </w:pPr>
-            <w:r>
-              <w:rPr>
-                <w:rFonts w:ascii="Arial Narrow" w:eastAsia="Times New Roman" w:hAnsi="Arial Narrow" w:cs="Times New Roman"/>
-                <w:sz w:val="24"/>
-                <w:szCs w:val="24"/>
-                <w:shd w:val="clear" w:color="auto" w:fill="FFFFFF"/>
-                <w:lang w:eastAsia="en-ID"/>
-              </w:rPr>
-              <w:t>j.</w:t>
+              <w:t>k.</w:t>
             </w:r>
           </w:p>
         </w:tc>
@@ -2626,71 +2232,17 @@
                 <w:szCs w:val="24"/>
                 <w:lang w:val="sv-SE"/>
               </w:rPr>
-              <w:t>Surat Perpanjangan Penahanan dari ${nama_kejaksaan} Nomor: ${kejaksaanExtensionNumber} tanggal ${kejaksaanExtensionDate} atas nama ${kejaksaanExtensionSuspectName};</w:t>
-            </w:r>
-          </w:p>
-        </w:tc>
-      </w:tr>
-      <w:tr>
-        <w:tc>
-          <w:tcPr>
-            <w:tcW w:w="226" w:type="dxa"/>
-          </w:tcPr>
-          <w:p>
-            <w:pPr>
-              <w:jc w:val="both"/>
-              <w:rPr>
-                <w:rFonts w:ascii="Arial Narrow" w:eastAsia="Times New Roman" w:hAnsi="Arial Narrow" w:cs="Times New Roman"/>
-                <w:sz w:val="24"/>
-                <w:szCs w:val="24"/>
-                <w:shd w:val="clear" w:color="auto" w:fill="FFFFFF"/>
-                <w:lang w:eastAsia="en-ID"/>
-              </w:rPr>
-            </w:pPr>
-          </w:p>
-        </w:tc>
-        <w:tc>
-          <w:tcPr>
-            <w:tcW w:w="341" w:type="dxa"/>
-          </w:tcPr>
-          <w:p>
-            <w:pPr>
-              <w:jc w:val="both"/>
-              <w:rPr>
-                <w:rFonts w:ascii="Arial Narrow" w:eastAsia="Times New Roman" w:hAnsi="Arial Narrow" w:cs="Times New Roman"/>
-                <w:sz w:val="24"/>
-                <w:szCs w:val="24"/>
-                <w:shd w:val="clear" w:color="auto" w:fill="FFFFFF"/>
-                <w:lang w:eastAsia="en-ID"/>
-              </w:rPr>
-            </w:pPr>
-            <w:r>
-              <w:rPr>
-                <w:rFonts w:ascii="Arial Narrow" w:eastAsia="Times New Roman" w:hAnsi="Arial Narrow" w:cs="Times New Roman"/>
-                <w:sz w:val="24"/>
-                <w:szCs w:val="24"/>
-                <w:shd w:val="clear" w:color="auto" w:fill="FFFFFF"/>
-                <w:lang w:eastAsia="en-ID"/>
-              </w:rPr>
-              <w:t>k.</w:t>
-            </w:r>
-          </w:p>
-        </w:tc>
-        <w:tc>
-          <w:tcPr>
-            <w:tcW w:w="9356" w:type="dxa"/>
-          </w:tcPr>
-          <w:p>
-            <w:pPr>
-              <w:spacing w:line="276" w:lineRule="auto"/>
-              <w:jc w:val="both"/>
+              <w:t>Surat Perintah Perpanjangan Penahanan Nomor: ${perpanjanganOrderNumber}</w:t>
+            </w:r>
+            <w:r>
               <w:rPr>
                 <w:rFonts w:ascii="Arial Narrow" w:hAnsi="Arial Narrow" w:cs="Times New Roman"/>
                 <w:sz w:val="24"/>
                 <w:szCs w:val="24"/>
                 <w:lang w:val="sv-SE"/>
               </w:rPr>
-            </w:pPr>
+              <w:t xml:space="preserve"> </w:t>
+            </w:r>
             <w:r>
               <w:rPr>
                 <w:rFonts w:ascii="Arial Narrow" w:hAnsi="Arial Narrow" w:cs="Times New Roman"/>
@@ -2698,7 +2250,7 @@
                 <w:szCs w:val="24"/>
                 <w:lang w:val="sv-SE"/>
               </w:rPr>
-              <w:t>Surat Perintah Perpanjangan Penahanan Nomor: ${perpanjanganOrderNumber}  tanggal ${perpanjanganOrderDate} atas nama ${perpanjanganOrderSuspectName} (JPU);</w:t>
+              <w:t>tanggal ${perpanjanganOrderDate} atas nama ${perpanjanganOrderSuspectName} (JPU);</w:t>
             </w:r>
           </w:p>
         </w:tc>
@@ -3054,29 +2606,7 @@
                       <w:sz w:val="24"/>
                       <w:szCs w:val="24"/>
                     </w:rPr>
-                    <w:t>${</w:t>
-                  </w:r>
-                  <w:proofErr w:type="spellStart"/>
-                  <w:r>
-                    <w:rPr>
-                      <w:rFonts w:ascii="Arial Narrow" w:eastAsia="Arial Narrow" w:hAnsi="Arial Narrow" w:cs="Times New Roman"/>
-                      <w:bCs/>
-                      <w:color w:val="000000"/>
-                      <w:sz w:val="24"/>
-                      <w:szCs w:val="24"/>
-                    </w:rPr>
-                    <w:t>suspectName</w:t>
-                  </w:r>
-                  <w:proofErr w:type="spellEnd"/>
-                  <w:r>
-                    <w:rPr>
-                      <w:rFonts w:ascii="Arial Narrow" w:eastAsia="Arial Narrow" w:hAnsi="Arial Narrow" w:cs="Times New Roman"/>
-                      <w:bCs/>
-                      <w:color w:val="000000"/>
-                      <w:sz w:val="24"/>
-                      <w:szCs w:val="24"/>
-                    </w:rPr>
-                    <w:t>}</w:t>
+                    <w:t>${suspectName}</w:t>
                   </w:r>
                 </w:p>
               </w:tc>
@@ -3124,7 +2654,6 @@
                       <w:lang w:eastAsia="en-ID"/>
                     </w:rPr>
                   </w:pPr>
-                  <w:proofErr w:type="spellStart"/>
                   <w:r>
                     <w:rPr>
                       <w:rFonts w:ascii="Arial Narrow" w:eastAsia="Times New Roman" w:hAnsi="Arial Narrow" w:cs="Times New Roman"/>
@@ -3133,31 +2662,8 @@
                       <w:shd w:val="clear" w:color="auto" w:fill="FFFFFF"/>
                       <w:lang w:eastAsia="en-ID"/>
                     </w:rPr>
-                    <w:t>nomor</w:t>
+                    <w:t>nomor identitas</w:t>
                   </w:r>
-                  <w:proofErr w:type="spellEnd"/>
-                  <w:r>
-                    <w:rPr>
-                      <w:rFonts w:ascii="Arial Narrow" w:eastAsia="Times New Roman" w:hAnsi="Arial Narrow" w:cs="Times New Roman"/>
-                      <w:sz w:val="24"/>
-                      <w:szCs w:val="24"/>
-                      <w:shd w:val="clear" w:color="auto" w:fill="FFFFFF"/>
-                      <w:lang w:eastAsia="en-ID"/>
-                    </w:rPr>
-                    <w:t xml:space="preserve"> </w:t>
-                  </w:r>
-                  <w:proofErr w:type="spellStart"/>
-                  <w:r>
-                    <w:rPr>
-                      <w:rFonts w:ascii="Arial Narrow" w:eastAsia="Times New Roman" w:hAnsi="Arial Narrow" w:cs="Times New Roman"/>
-                      <w:sz w:val="24"/>
-                      <w:szCs w:val="24"/>
-                      <w:shd w:val="clear" w:color="auto" w:fill="FFFFFF"/>
-                      <w:lang w:eastAsia="en-ID"/>
-                    </w:rPr>
-                    <w:t>identitas</w:t>
-                  </w:r>
-                  <w:proofErr w:type="spellEnd"/>
                 </w:p>
               </w:tc>
               <w:tc>
@@ -3210,29 +2716,7 @@
                       <w:sz w:val="24"/>
                       <w:szCs w:val="24"/>
                     </w:rPr>
-                    <w:t>${</w:t>
-                  </w:r>
-                  <w:proofErr w:type="spellStart"/>
-                  <w:r>
-                    <w:rPr>
-                      <w:rFonts w:ascii="Arial Narrow" w:eastAsia="Arial Narrow" w:hAnsi="Arial Narrow" w:cs="Times New Roman"/>
-                      <w:bCs/>
-                      <w:color w:val="000000"/>
-                      <w:sz w:val="24"/>
-                      <w:szCs w:val="24"/>
-                    </w:rPr>
-                    <w:t>suspectIdentityNumber</w:t>
-                  </w:r>
-                  <w:proofErr w:type="spellEnd"/>
-                  <w:r>
-                    <w:rPr>
-                      <w:rFonts w:ascii="Arial Narrow" w:eastAsia="Arial Narrow" w:hAnsi="Arial Narrow" w:cs="Times New Roman"/>
-                      <w:bCs/>
-                      <w:color w:val="000000"/>
-                      <w:sz w:val="24"/>
-                      <w:szCs w:val="24"/>
-                    </w:rPr>
-                    <w:t>}</w:t>
+                    <w:t>${suspectIdentityNumber}</w:t>
                   </w:r>
                 </w:p>
               </w:tc>
@@ -3280,7 +2764,6 @@
                       <w:lang w:eastAsia="en-ID"/>
                     </w:rPr>
                   </w:pPr>
-                  <w:proofErr w:type="spellStart"/>
                   <w:r>
                     <w:rPr>
                       <w:rFonts w:ascii="Arial Narrow" w:eastAsia="Times New Roman" w:hAnsi="Arial Narrow" w:cs="Times New Roman"/>
@@ -3299,31 +2782,8 @@
                       <w:shd w:val="clear" w:color="auto" w:fill="FFFFFF"/>
                       <w:lang w:eastAsia="en-ID"/>
                     </w:rPr>
-                    <w:t>enis</w:t>
+                    <w:t>enis kelamin</w:t>
                   </w:r>
-                  <w:proofErr w:type="spellEnd"/>
-                  <w:r>
-                    <w:rPr>
-                      <w:rFonts w:ascii="Arial Narrow" w:eastAsia="Times New Roman" w:hAnsi="Arial Narrow" w:cs="Times New Roman"/>
-                      <w:sz w:val="24"/>
-                      <w:szCs w:val="24"/>
-                      <w:shd w:val="clear" w:color="auto" w:fill="FFFFFF"/>
-                      <w:lang w:eastAsia="en-ID"/>
-                    </w:rPr>
-                    <w:t xml:space="preserve"> </w:t>
-                  </w:r>
-                  <w:proofErr w:type="spellStart"/>
-                  <w:r>
-                    <w:rPr>
-                      <w:rFonts w:ascii="Arial Narrow" w:eastAsia="Times New Roman" w:hAnsi="Arial Narrow" w:cs="Times New Roman"/>
-                      <w:sz w:val="24"/>
-                      <w:szCs w:val="24"/>
-                      <w:shd w:val="clear" w:color="auto" w:fill="FFFFFF"/>
-                      <w:lang w:eastAsia="en-ID"/>
-                    </w:rPr>
-                    <w:t>kelamin</w:t>
-                  </w:r>
-                  <w:proofErr w:type="spellEnd"/>
                 </w:p>
               </w:tc>
               <w:tc>
@@ -3376,29 +2836,7 @@
                       <w:sz w:val="24"/>
                       <w:szCs w:val="24"/>
                     </w:rPr>
-                    <w:t>${</w:t>
-                  </w:r>
-                  <w:proofErr w:type="spellStart"/>
-                  <w:r>
-                    <w:rPr>
-                      <w:rFonts w:ascii="Arial Narrow" w:eastAsia="Arial Narrow" w:hAnsi="Arial Narrow" w:cs="Times New Roman"/>
-                      <w:bCs/>
-                      <w:color w:val="000000"/>
-                      <w:sz w:val="24"/>
-                      <w:szCs w:val="24"/>
-                    </w:rPr>
-                    <w:t>suspectGenderName</w:t>
-                  </w:r>
-                  <w:proofErr w:type="spellEnd"/>
-                  <w:r>
-                    <w:rPr>
-                      <w:rFonts w:ascii="Arial Narrow" w:eastAsia="Arial Narrow" w:hAnsi="Arial Narrow" w:cs="Times New Roman"/>
-                      <w:bCs/>
-                      <w:color w:val="000000"/>
-                      <w:sz w:val="24"/>
-                      <w:szCs w:val="24"/>
-                    </w:rPr>
-                    <w:t>}</w:t>
+                    <w:t>${suspectGenderName}</w:t>
                   </w:r>
                 </w:p>
               </w:tc>
@@ -3446,7 +2884,6 @@
                       <w:lang w:eastAsia="en-ID"/>
                     </w:rPr>
                   </w:pPr>
-                  <w:proofErr w:type="spellStart"/>
                   <w:r>
                     <w:rPr>
                       <w:rFonts w:ascii="Arial Narrow" w:eastAsia="Times New Roman" w:hAnsi="Arial Narrow" w:cs="Times New Roman"/>
@@ -3455,20 +2892,8 @@
                       <w:shd w:val="clear" w:color="auto" w:fill="FFFFFF"/>
                       <w:lang w:eastAsia="en-ID"/>
                     </w:rPr>
-                    <w:t>tempat</w:t>
+                    <w:t>tempat/</w:t>
                   </w:r>
-                  <w:proofErr w:type="spellEnd"/>
-                  <w:r>
-                    <w:rPr>
-                      <w:rFonts w:ascii="Arial Narrow" w:eastAsia="Times New Roman" w:hAnsi="Arial Narrow" w:cs="Times New Roman"/>
-                      <w:sz w:val="24"/>
-                      <w:szCs w:val="24"/>
-                      <w:shd w:val="clear" w:color="auto" w:fill="FFFFFF"/>
-                      <w:lang w:eastAsia="en-ID"/>
-                    </w:rPr>
-                    <w:t>/</w:t>
-                  </w:r>
-                  <w:proofErr w:type="spellStart"/>
                   <w:r>
                     <w:rPr>
                       <w:rFonts w:ascii="Arial Narrow" w:eastAsia="Times New Roman" w:hAnsi="Arial Narrow" w:cs="Times New Roman"/>
@@ -3479,7 +2904,6 @@
                     </w:rPr>
                     <w:t>tgl</w:t>
                   </w:r>
-                  <w:proofErr w:type="spellEnd"/>
                   <w:r>
                     <w:rPr>
                       <w:rFonts w:ascii="Arial Narrow" w:eastAsia="Times New Roman" w:hAnsi="Arial Narrow" w:cs="Times New Roman"/>
@@ -3488,20 +2912,8 @@
                       <w:shd w:val="clear" w:color="auto" w:fill="FFFFFF"/>
                       <w:lang w:eastAsia="en-ID"/>
                     </w:rPr>
-                    <w:t xml:space="preserve"> </w:t>
+                    <w:t xml:space="preserve"> lahir</w:t>
                   </w:r>
-                  <w:proofErr w:type="spellStart"/>
-                  <w:r>
-                    <w:rPr>
-                      <w:rFonts w:ascii="Arial Narrow" w:eastAsia="Times New Roman" w:hAnsi="Arial Narrow" w:cs="Times New Roman"/>
-                      <w:sz w:val="24"/>
-                      <w:szCs w:val="24"/>
-                      <w:shd w:val="clear" w:color="auto" w:fill="FFFFFF"/>
-                      <w:lang w:eastAsia="en-ID"/>
-                    </w:rPr>
-                    <w:t>lahir</w:t>
-                  </w:r>
-                  <w:proofErr w:type="spellEnd"/>
                 </w:p>
               </w:tc>
               <w:tc>
@@ -3554,9 +2966,18 @@
                       <w:sz w:val="24"/>
                       <w:szCs w:val="24"/>
                     </w:rPr>
-                    <w:t>${</w:t>
+                    <w:t>${suspectBirthPlace}</w:t>
                   </w:r>
-                  <w:proofErr w:type="spellStart"/>
+                  <w:r>
+                    <w:rPr>
+                      <w:rFonts w:ascii="Arial Narrow" w:eastAsia="Times New Roman" w:hAnsi="Arial Narrow" w:cs="Times New Roman"/>
+                      <w:sz w:val="24"/>
+                      <w:szCs w:val="24"/>
+                      <w:shd w:val="clear" w:color="auto" w:fill="FFFFFF"/>
+                      <w:lang w:eastAsia="en-ID"/>
+                    </w:rPr>
+                    <w:t>/</w:t>
+                  </w:r>
                   <w:r>
                     <w:rPr>
                       <w:rFonts w:ascii="Arial Narrow" w:eastAsia="Arial Narrow" w:hAnsi="Arial Narrow" w:cs="Times New Roman"/>
@@ -3565,60 +2986,7 @@
                       <w:sz w:val="24"/>
                       <w:szCs w:val="24"/>
                     </w:rPr>
-                    <w:t>suspectBirthPlace</w:t>
-                  </w:r>
-                  <w:proofErr w:type="spellEnd"/>
-                  <w:r>
-                    <w:rPr>
-                      <w:rFonts w:ascii="Arial Narrow" w:eastAsia="Arial Narrow" w:hAnsi="Arial Narrow" w:cs="Times New Roman"/>
-                      <w:bCs/>
-                      <w:color w:val="000000"/>
-                      <w:sz w:val="24"/>
-                      <w:szCs w:val="24"/>
-                    </w:rPr>
-                    <w:t>}</w:t>
-                  </w:r>
-                  <w:r>
-                    <w:rPr>
-                      <w:rFonts w:ascii="Arial Narrow" w:eastAsia="Times New Roman" w:hAnsi="Arial Narrow" w:cs="Times New Roman"/>
-                      <w:sz w:val="24"/>
-                      <w:szCs w:val="24"/>
-                      <w:shd w:val="clear" w:color="auto" w:fill="FFFFFF"/>
-                      <w:lang w:eastAsia="en-ID"/>
-                    </w:rPr>
-                    <w:t>/</w:t>
-                  </w:r>
-                  <w:r>
-                    <w:rPr>
-                      <w:rFonts w:ascii="Arial Narrow" w:eastAsia="Arial Narrow" w:hAnsi="Arial Narrow" w:cs="Times New Roman"/>
-                      <w:bCs/>
-                      <w:color w:val="000000"/>
-                      <w:sz w:val="24"/>
-                      <w:szCs w:val="24"/>
-                    </w:rPr>
-                    <w:t>${</w:t>
-                  </w:r>
-                  <w:proofErr w:type="spellStart"/>
-                  <w:r>
-                    <w:rPr>
-                      <w:rFonts w:ascii="Arial Narrow" w:eastAsia="Arial Narrow" w:hAnsi="Arial Narrow" w:cs="Times New Roman"/>
-                      <w:bCs/>
-                      <w:color w:val="000000"/>
-                      <w:sz w:val="24"/>
-                      <w:szCs w:val="24"/>
-                    </w:rPr>
-                    <w:t>suspectBirthDate</w:t>
-                  </w:r>
-                  <w:proofErr w:type="spellEnd"/>
-                  <w:r>
-                    <w:rPr>
-                      <w:rFonts w:ascii="Arial Narrow" w:eastAsia="Arial Narrow" w:hAnsi="Arial Narrow" w:cs="Times New Roman"/>
-                      <w:bCs/>
-                      <w:color w:val="000000"/>
-                      <w:sz w:val="24"/>
-                      <w:szCs w:val="24"/>
-                    </w:rPr>
-                    <w:t>}</w:t>
+                    <w:t>${suspectBirthDate}</w:t>
                   </w:r>
                 </w:p>
               </w:tc>
@@ -3666,7 +3034,6 @@
                       <w:lang w:eastAsia="en-ID"/>
                     </w:rPr>
                   </w:pPr>
-                  <w:proofErr w:type="spellStart"/>
                   <w:r>
                     <w:rPr>
                       <w:rFonts w:ascii="Arial Narrow" w:eastAsia="Times New Roman" w:hAnsi="Arial Narrow" w:cs="Times New Roman"/>
@@ -3677,7 +3044,6 @@
                     </w:rPr>
                     <w:t>pekerjaan</w:t>
                   </w:r>
-                  <w:proofErr w:type="spellEnd"/>
                 </w:p>
               </w:tc>
               <w:tc>
@@ -3730,29 +3096,7 @@
                       <w:sz w:val="24"/>
                       <w:szCs w:val="24"/>
                     </w:rPr>
-                    <w:t>${</w:t>
-                  </w:r>
-                  <w:proofErr w:type="spellStart"/>
-                  <w:r>
-                    <w:rPr>
-                      <w:rFonts w:ascii="Arial Narrow" w:eastAsia="Arial Narrow" w:hAnsi="Arial Narrow" w:cs="Times New Roman"/>
-                      <w:bCs/>
-                      <w:color w:val="000000"/>
-                      <w:sz w:val="24"/>
-                      <w:szCs w:val="24"/>
-                    </w:rPr>
-                    <w:t>suspectJobName</w:t>
-                  </w:r>
-                  <w:proofErr w:type="spellEnd"/>
-                  <w:r>
-                    <w:rPr>
-                      <w:rFonts w:ascii="Arial Narrow" w:eastAsia="Arial Narrow" w:hAnsi="Arial Narrow" w:cs="Times New Roman"/>
-                      <w:bCs/>
-                      <w:color w:val="000000"/>
-                      <w:sz w:val="24"/>
-                      <w:szCs w:val="24"/>
-                    </w:rPr>
-                    <w:t>}</w:t>
+                    <w:t>${suspectJobName}</w:t>
                   </w:r>
                 </w:p>
               </w:tc>
@@ -3862,29 +3206,7 @@
                       <w:sz w:val="24"/>
                       <w:szCs w:val="24"/>
                     </w:rPr>
-                    <w:t>${</w:t>
-                  </w:r>
-                  <w:proofErr w:type="spellStart"/>
-                  <w:r>
-                    <w:rPr>
-                      <w:rFonts w:ascii="Arial Narrow" w:eastAsia="Arial Narrow" w:hAnsi="Arial Narrow" w:cs="Times New Roman"/>
-                      <w:bCs/>
-                      <w:color w:val="000000"/>
-                      <w:sz w:val="24"/>
-                      <w:szCs w:val="24"/>
-                    </w:rPr>
-                    <w:t>suspectReligionName</w:t>
-                  </w:r>
-                  <w:proofErr w:type="spellEnd"/>
-                  <w:r>
-                    <w:rPr>
-                      <w:rFonts w:ascii="Arial Narrow" w:eastAsia="Arial Narrow" w:hAnsi="Arial Narrow" w:cs="Times New Roman"/>
-                      <w:bCs/>
-                      <w:color w:val="000000"/>
-                      <w:sz w:val="24"/>
-                      <w:szCs w:val="24"/>
-                    </w:rPr>
-                    <w:t>}</w:t>
+                    <w:t>${suspectReligionName}</w:t>
                   </w:r>
                   <w:r>
                     <w:rPr>
@@ -3942,7 +3264,6 @@
                       <w:lang w:eastAsia="en-ID"/>
                     </w:rPr>
                   </w:pPr>
-                  <w:proofErr w:type="spellStart"/>
                   <w:r>
                     <w:rPr>
                       <w:rFonts w:ascii="Arial Narrow" w:eastAsia="Times New Roman" w:hAnsi="Arial Narrow" w:cs="Times New Roman"/>
@@ -3963,7 +3284,6 @@
                     </w:rPr>
                     <w:t>ewarganegaraan</w:t>
                   </w:r>
-                  <w:proofErr w:type="spellEnd"/>
                 </w:p>
               </w:tc>
               <w:tc>
@@ -4016,29 +3336,7 @@
                       <w:sz w:val="24"/>
                       <w:szCs w:val="24"/>
                     </w:rPr>
-                    <w:t>${</w:t>
-                  </w:r>
-                  <w:proofErr w:type="spellStart"/>
-                  <w:r>
-                    <w:rPr>
-                      <w:rFonts w:ascii="Arial Narrow" w:eastAsia="Arial Narrow" w:hAnsi="Arial Narrow" w:cs="Times New Roman"/>
-                      <w:bCs/>
-                      <w:color w:val="000000"/>
-                      <w:sz w:val="24"/>
-                      <w:szCs w:val="24"/>
-                    </w:rPr>
-                    <w:t>suspectNationality</w:t>
-                  </w:r>
-                  <w:proofErr w:type="spellEnd"/>
-                  <w:r>
-                    <w:rPr>
-                      <w:rFonts w:ascii="Arial Narrow" w:eastAsia="Arial Narrow" w:hAnsi="Arial Narrow" w:cs="Times New Roman"/>
-                      <w:bCs/>
-                      <w:color w:val="000000"/>
-                      <w:sz w:val="24"/>
-                      <w:szCs w:val="24"/>
-                    </w:rPr>
-                    <w:t>}</w:t>
+                    <w:t>${suspectNationality}</w:t>
                   </w:r>
                 </w:p>
               </w:tc>
@@ -4086,7 +3384,6 @@
                       <w:lang w:eastAsia="en-ID"/>
                     </w:rPr>
                   </w:pPr>
-                  <w:proofErr w:type="spellStart"/>
                   <w:r>
                     <w:rPr>
                       <w:rFonts w:ascii="Arial Narrow" w:hAnsi="Arial Narrow" w:cs="Times New Roman"/>
@@ -4103,43 +3400,14 @@
                     </w:rPr>
                     <w:t>lamat</w:t>
                   </w:r>
-                  <w:proofErr w:type="spellEnd"/>
                   <w:r>
                     <w:rPr>
                       <w:rFonts w:ascii="Arial Narrow" w:hAnsi="Arial Narrow" w:cs="Times New Roman"/>
                       <w:sz w:val="24"/>
                       <w:szCs w:val="24"/>
                     </w:rPr>
-                    <w:t>/</w:t>
+                    <w:t>/tempat tinggal</w:t>
                   </w:r>
-                  <w:proofErr w:type="spellStart"/>
-                  <w:r>
-                    <w:rPr>
-                      <w:rFonts w:ascii="Arial Narrow" w:hAnsi="Arial Narrow" w:cs="Times New Roman"/>
-                      <w:sz w:val="24"/>
-                      <w:szCs w:val="24"/>
-                    </w:rPr>
-                    <w:t>tempat</w:t>
-                  </w:r>
-                  <w:proofErr w:type="spellEnd"/>
-                  <w:r>
-                    <w:rPr>
-                      <w:rFonts w:ascii="Arial Narrow" w:hAnsi="Arial Narrow" w:cs="Times New Roman"/>
-                      <w:sz w:val="24"/>
-                      <w:szCs w:val="24"/>
-                    </w:rPr>
-                    <w:t xml:space="preserve"> </w:t>
-                  </w:r>
-                  <w:proofErr w:type="spellStart"/>
-                  <w:r>
-                    <w:rPr>
-                      <w:rFonts w:ascii="Arial Narrow" w:hAnsi="Arial Narrow" w:cs="Times New Roman"/>
-                      <w:sz w:val="24"/>
-                      <w:szCs w:val="24"/>
-                    </w:rPr>
-                    <w:t>tinggal</w:t>
-                  </w:r>
-                  <w:proofErr w:type="spellEnd"/>
                 </w:p>
               </w:tc>
               <w:tc>
@@ -4195,29 +3463,7 @@
                       <w:sz w:val="24"/>
                       <w:szCs w:val="24"/>
                     </w:rPr>
-                    <w:t>${</w:t>
-                  </w:r>
-                  <w:proofErr w:type="spellStart"/>
-                  <w:r>
-                    <w:rPr>
-                      <w:rFonts w:ascii="Arial Narrow" w:eastAsia="Arial Narrow" w:hAnsi="Arial Narrow" w:cs="Times New Roman"/>
-                      <w:bCs/>
-                      <w:color w:val="000000"/>
-                      <w:sz w:val="24"/>
-                      <w:szCs w:val="24"/>
-                    </w:rPr>
-                    <w:t>suspectFullAddress</w:t>
-                  </w:r>
-                  <w:proofErr w:type="spellEnd"/>
-                  <w:r>
-                    <w:rPr>
-                      <w:rFonts w:ascii="Arial Narrow" w:eastAsia="Arial Narrow" w:hAnsi="Arial Narrow" w:cs="Times New Roman"/>
-                      <w:bCs/>
-                      <w:color w:val="000000"/>
-                      <w:sz w:val="24"/>
-                      <w:szCs w:val="24"/>
-                    </w:rPr>
-                    <w:t>}</w:t>
+                    <w:t>${suspectFullAddress}</w:t>
                   </w:r>
                 </w:p>
               </w:tc>
@@ -4392,1273 +3638,21 @@
                 <w:szCs w:val="24"/>
               </w:rPr>
             </w:pPr>
-            <w:proofErr w:type="spellStart"/>
-            <w:r>
-              <w:rPr>
-                <w:rFonts w:ascii="Arial Narrow" w:hAnsi="Arial Narrow" w:cs="Times New Roman"/>
-                <w:sz w:val="24"/>
-                <w:szCs w:val="24"/>
-              </w:rPr>
-              <w:t>Berkaitan</w:t>
-            </w:r>
-            <w:proofErr w:type="spellEnd"/>
-            <w:r>
-              <w:rPr>
-                <w:rFonts w:ascii="Arial Narrow" w:hAnsi="Arial Narrow" w:cs="Times New Roman"/>
-                <w:sz w:val="24"/>
-                <w:szCs w:val="24"/>
-              </w:rPr>
-              <w:t xml:space="preserve"> </w:t>
-            </w:r>
-            <w:proofErr w:type="spellStart"/>
-            <w:r>
-              <w:rPr>
-                <w:rFonts w:ascii="Arial Narrow" w:hAnsi="Arial Narrow" w:cs="Times New Roman"/>
-                <w:sz w:val="24"/>
-                <w:szCs w:val="24"/>
-              </w:rPr>
-              <w:t>dengan</w:t>
-            </w:r>
-            <w:proofErr w:type="spellEnd"/>
-            <w:r>
-              <w:rPr>
-                <w:rFonts w:ascii="Arial Narrow" w:hAnsi="Arial Narrow" w:cs="Times New Roman"/>
-                <w:sz w:val="24"/>
-                <w:szCs w:val="24"/>
-              </w:rPr>
-              <w:t xml:space="preserve"> </w:t>
-            </w:r>
-            <w:proofErr w:type="spellStart"/>
-            <w:r>
-              <w:rPr>
-                <w:rFonts w:ascii="Arial Narrow" w:hAnsi="Arial Narrow" w:cs="Times New Roman"/>
-                <w:sz w:val="24"/>
-                <w:szCs w:val="24"/>
-              </w:rPr>
-              <w:t>hal</w:t>
-            </w:r>
-            <w:proofErr w:type="spellEnd"/>
-            <w:r>
-              <w:rPr>
-                <w:rFonts w:ascii="Arial Narrow" w:hAnsi="Arial Narrow" w:cs="Times New Roman"/>
-                <w:sz w:val="24"/>
-                <w:szCs w:val="24"/>
-              </w:rPr>
-              <w:t xml:space="preserve"> </w:t>
-            </w:r>
-            <w:proofErr w:type="spellStart"/>
-            <w:r>
-              <w:rPr>
-                <w:rFonts w:ascii="Arial Narrow" w:hAnsi="Arial Narrow" w:cs="Times New Roman"/>
-                <w:sz w:val="24"/>
-                <w:szCs w:val="24"/>
-              </w:rPr>
-              <w:t>tersebut</w:t>
-            </w:r>
-            <w:proofErr w:type="spellEnd"/>
-            <w:r>
-              <w:rPr>
-                <w:rFonts w:ascii="Arial Narrow" w:hAnsi="Arial Narrow" w:cs="Times New Roman"/>
-                <w:sz w:val="24"/>
-                <w:szCs w:val="24"/>
-              </w:rPr>
-              <w:t xml:space="preserve">, </w:t>
-            </w:r>
-            <w:proofErr w:type="spellStart"/>
-            <w:r>
-              <w:rPr>
-                <w:rFonts w:ascii="Arial Narrow" w:hAnsi="Arial Narrow" w:cs="Times New Roman"/>
-                <w:sz w:val="24"/>
-                <w:szCs w:val="24"/>
-              </w:rPr>
-              <w:t>dikarenakan</w:t>
-            </w:r>
-            <w:proofErr w:type="spellEnd"/>
-            <w:r>
-              <w:rPr>
-                <w:rFonts w:ascii="Arial Narrow" w:hAnsi="Arial Narrow" w:cs="Times New Roman"/>
-                <w:sz w:val="24"/>
-                <w:szCs w:val="24"/>
-              </w:rPr>
-              <w:t xml:space="preserve"> </w:t>
-            </w:r>
-            <w:proofErr w:type="spellStart"/>
-            <w:r>
-              <w:rPr>
-                <w:rFonts w:ascii="Arial Narrow" w:hAnsi="Arial Narrow" w:cs="Times New Roman"/>
-                <w:sz w:val="24"/>
-                <w:szCs w:val="24"/>
-              </w:rPr>
-              <w:t>tersangka</w:t>
-            </w:r>
-            <w:proofErr w:type="spellEnd"/>
-            <w:r>
-              <w:rPr>
-                <w:rFonts w:ascii="Arial Narrow" w:hAnsi="Arial Narrow" w:cs="Times New Roman"/>
-                <w:sz w:val="24"/>
-                <w:szCs w:val="24"/>
-              </w:rPr>
-              <w:t xml:space="preserve"> </w:t>
-            </w:r>
-            <w:proofErr w:type="spellStart"/>
-            <w:r>
-              <w:rPr>
-                <w:rFonts w:ascii="Arial Narrow" w:hAnsi="Arial Narrow" w:cs="Times New Roman"/>
-                <w:sz w:val="24"/>
-                <w:szCs w:val="24"/>
-              </w:rPr>
-              <w:t>menderita</w:t>
-            </w:r>
-            <w:proofErr w:type="spellEnd"/>
-            <w:r>
-              <w:rPr>
-                <w:rFonts w:ascii="Arial Narrow" w:hAnsi="Arial Narrow" w:cs="Times New Roman"/>
-                <w:sz w:val="24"/>
-                <w:szCs w:val="24"/>
-              </w:rPr>
-              <w:t xml:space="preserve"> </w:t>
-            </w:r>
-            <w:proofErr w:type="spellStart"/>
-            <w:r>
-              <w:rPr>
-                <w:rFonts w:ascii="Arial Narrow" w:hAnsi="Arial Narrow" w:cs="Times New Roman"/>
-                <w:sz w:val="24"/>
-                <w:szCs w:val="24"/>
-              </w:rPr>
-              <w:t>gangguan</w:t>
-            </w:r>
-            <w:proofErr w:type="spellEnd"/>
-            <w:r>
-              <w:rPr>
-                <w:rFonts w:ascii="Arial Narrow" w:hAnsi="Arial Narrow" w:cs="Times New Roman"/>
-                <w:sz w:val="24"/>
-                <w:szCs w:val="24"/>
-              </w:rPr>
-              <w:t xml:space="preserve"> </w:t>
-            </w:r>
-            <w:proofErr w:type="spellStart"/>
-            <w:r>
-              <w:rPr>
-                <w:rFonts w:ascii="Arial Narrow" w:hAnsi="Arial Narrow" w:cs="Times New Roman"/>
-                <w:sz w:val="24"/>
-                <w:szCs w:val="24"/>
-              </w:rPr>
-              <w:t>fisik</w:t>
-            </w:r>
-            <w:proofErr w:type="spellEnd"/>
-            <w:r>
-              <w:rPr>
-                <w:rFonts w:ascii="Arial Narrow" w:hAnsi="Arial Narrow" w:cs="Times New Roman"/>
-                <w:sz w:val="24"/>
-                <w:szCs w:val="24"/>
-              </w:rPr>
-              <w:t xml:space="preserve"> </w:t>
-            </w:r>
-            <w:proofErr w:type="spellStart"/>
-            <w:r>
-              <w:rPr>
-                <w:rFonts w:ascii="Arial Narrow" w:hAnsi="Arial Narrow" w:cs="Times New Roman"/>
-                <w:sz w:val="24"/>
-                <w:szCs w:val="24"/>
-              </w:rPr>
-              <w:t>atau</w:t>
-            </w:r>
-            <w:proofErr w:type="spellEnd"/>
-            <w:r>
-              <w:rPr>
-                <w:rFonts w:ascii="Arial Narrow" w:hAnsi="Arial Narrow" w:cs="Times New Roman"/>
-                <w:sz w:val="24"/>
-                <w:szCs w:val="24"/>
-              </w:rPr>
-              <w:t xml:space="preserve"> mental yang </w:t>
-            </w:r>
-            <w:proofErr w:type="spellStart"/>
-            <w:r>
-              <w:rPr>
-                <w:rFonts w:ascii="Arial Narrow" w:hAnsi="Arial Narrow" w:cs="Times New Roman"/>
-                <w:sz w:val="24"/>
-                <w:szCs w:val="24"/>
-              </w:rPr>
-              <w:t>berat</w:t>
-            </w:r>
-            <w:proofErr w:type="spellEnd"/>
-            <w:r>
-              <w:rPr>
-                <w:rFonts w:ascii="Arial Narrow" w:hAnsi="Arial Narrow" w:cs="Times New Roman"/>
-                <w:sz w:val="24"/>
-                <w:szCs w:val="24"/>
-              </w:rPr>
-              <w:t xml:space="preserve"> yang </w:t>
-            </w:r>
-            <w:proofErr w:type="spellStart"/>
-            <w:r>
-              <w:rPr>
-                <w:rFonts w:ascii="Arial Narrow" w:hAnsi="Arial Narrow" w:cs="Times New Roman"/>
-                <w:sz w:val="24"/>
-                <w:szCs w:val="24"/>
-              </w:rPr>
-              <w:t>dibuktikan</w:t>
-            </w:r>
-            <w:proofErr w:type="spellEnd"/>
-            <w:r>
-              <w:rPr>
-                <w:rFonts w:ascii="Arial Narrow" w:hAnsi="Arial Narrow" w:cs="Times New Roman"/>
-                <w:sz w:val="24"/>
-                <w:szCs w:val="24"/>
-              </w:rPr>
-              <w:t xml:space="preserve"> </w:t>
-            </w:r>
-            <w:proofErr w:type="spellStart"/>
-            <w:r>
-              <w:rPr>
-                <w:rFonts w:ascii="Arial Narrow" w:hAnsi="Arial Narrow" w:cs="Times New Roman"/>
-                <w:sz w:val="24"/>
-                <w:szCs w:val="24"/>
-              </w:rPr>
-              <w:t>dengan</w:t>
-            </w:r>
-            <w:proofErr w:type="spellEnd"/>
-            <w:r>
-              <w:rPr>
-                <w:rFonts w:ascii="Arial Narrow" w:hAnsi="Arial Narrow" w:cs="Times New Roman"/>
-                <w:sz w:val="24"/>
-                <w:szCs w:val="24"/>
-              </w:rPr>
-              <w:t xml:space="preserve"> </w:t>
-            </w:r>
-            <w:proofErr w:type="spellStart"/>
-            <w:r>
-              <w:rPr>
-                <w:rFonts w:ascii="Arial Narrow" w:hAnsi="Arial Narrow" w:cs="Times New Roman"/>
-                <w:sz w:val="24"/>
-                <w:szCs w:val="24"/>
-              </w:rPr>
-              <w:t>surat</w:t>
-            </w:r>
-            <w:proofErr w:type="spellEnd"/>
-            <w:r>
-              <w:rPr>
-                <w:rFonts w:ascii="Arial Narrow" w:hAnsi="Arial Narrow" w:cs="Times New Roman"/>
-                <w:sz w:val="24"/>
-                <w:szCs w:val="24"/>
-              </w:rPr>
-              <w:t xml:space="preserve"> </w:t>
-            </w:r>
-            <w:proofErr w:type="spellStart"/>
-            <w:r>
-              <w:rPr>
-                <w:rFonts w:ascii="Arial Narrow" w:hAnsi="Arial Narrow" w:cs="Times New Roman"/>
-                <w:sz w:val="24"/>
-                <w:szCs w:val="24"/>
-              </w:rPr>
-              <w:t>keterangan</w:t>
-            </w:r>
-            <w:proofErr w:type="spellEnd"/>
-            <w:r>
-              <w:rPr>
-                <w:rFonts w:ascii="Arial Narrow" w:hAnsi="Arial Narrow" w:cs="Times New Roman"/>
-                <w:sz w:val="24"/>
-                <w:szCs w:val="24"/>
-              </w:rPr>
-              <w:t xml:space="preserve"> </w:t>
-            </w:r>
-            <w:proofErr w:type="spellStart"/>
-            <w:r>
-              <w:rPr>
-                <w:rFonts w:ascii="Arial Narrow" w:hAnsi="Arial Narrow" w:cs="Times New Roman"/>
-                <w:sz w:val="24"/>
-                <w:szCs w:val="24"/>
-              </w:rPr>
-              <w:t>dokter</w:t>
-            </w:r>
-            <w:proofErr w:type="spellEnd"/>
-            <w:r>
-              <w:rPr>
-                <w:rFonts w:ascii="Arial Narrow" w:hAnsi="Arial Narrow" w:cs="Times New Roman"/>
-                <w:sz w:val="24"/>
-                <w:szCs w:val="24"/>
-              </w:rPr>
-              <w:t xml:space="preserve"> </w:t>
-            </w:r>
-            <w:proofErr w:type="spellStart"/>
-            <w:r>
-              <w:rPr>
-                <w:rFonts w:ascii="Arial Narrow" w:hAnsi="Arial Narrow" w:cs="Times New Roman"/>
-                <w:sz w:val="24"/>
-                <w:szCs w:val="24"/>
-              </w:rPr>
-              <w:t>atau</w:t>
-            </w:r>
-            <w:proofErr w:type="spellEnd"/>
-            <w:r>
-              <w:rPr>
-                <w:rFonts w:ascii="Arial Narrow" w:hAnsi="Arial Narrow" w:cs="Times New Roman"/>
-                <w:sz w:val="24"/>
-                <w:szCs w:val="24"/>
-              </w:rPr>
-              <w:t xml:space="preserve"> </w:t>
-            </w:r>
-            <w:proofErr w:type="spellStart"/>
-            <w:r>
-              <w:rPr>
-                <w:rFonts w:ascii="Arial Narrow" w:hAnsi="Arial Narrow" w:cs="Times New Roman"/>
-                <w:sz w:val="24"/>
-                <w:szCs w:val="24"/>
-              </w:rPr>
-              <w:t>perkara</w:t>
-            </w:r>
-            <w:proofErr w:type="spellEnd"/>
-            <w:r>
-              <w:rPr>
-                <w:rFonts w:ascii="Arial Narrow" w:hAnsi="Arial Narrow" w:cs="Times New Roman"/>
-                <w:sz w:val="24"/>
-                <w:szCs w:val="24"/>
-              </w:rPr>
-              <w:t xml:space="preserve"> yang </w:t>
-            </w:r>
-            <w:proofErr w:type="spellStart"/>
-            <w:r>
-              <w:rPr>
-                <w:rFonts w:ascii="Arial Narrow" w:hAnsi="Arial Narrow" w:cs="Times New Roman"/>
-                <w:sz w:val="24"/>
-                <w:szCs w:val="24"/>
-              </w:rPr>
-              <w:t>sedang</w:t>
-            </w:r>
-            <w:proofErr w:type="spellEnd"/>
-            <w:r>
-              <w:rPr>
-                <w:rFonts w:ascii="Arial Narrow" w:hAnsi="Arial Narrow" w:cs="Times New Roman"/>
-                <w:sz w:val="24"/>
-                <w:szCs w:val="24"/>
-              </w:rPr>
-              <w:t xml:space="preserve"> </w:t>
-            </w:r>
-            <w:proofErr w:type="spellStart"/>
-            <w:r>
-              <w:rPr>
-                <w:rFonts w:ascii="Arial Narrow" w:hAnsi="Arial Narrow" w:cs="Times New Roman"/>
-                <w:sz w:val="24"/>
-                <w:szCs w:val="24"/>
-              </w:rPr>
-              <w:t>diperiksa</w:t>
-            </w:r>
-            <w:proofErr w:type="spellEnd"/>
-            <w:r>
-              <w:rPr>
-                <w:rFonts w:ascii="Arial Narrow" w:hAnsi="Arial Narrow" w:cs="Times New Roman"/>
-                <w:sz w:val="24"/>
-                <w:szCs w:val="24"/>
-              </w:rPr>
-              <w:t xml:space="preserve"> </w:t>
-            </w:r>
-            <w:proofErr w:type="spellStart"/>
-            <w:r>
-              <w:rPr>
-                <w:rFonts w:ascii="Arial Narrow" w:hAnsi="Arial Narrow" w:cs="Times New Roman"/>
-                <w:sz w:val="24"/>
-                <w:szCs w:val="24"/>
-              </w:rPr>
-              <w:t>diancam</w:t>
-            </w:r>
-            <w:proofErr w:type="spellEnd"/>
-            <w:r>
-              <w:rPr>
-                <w:rFonts w:ascii="Arial Narrow" w:hAnsi="Arial Narrow" w:cs="Times New Roman"/>
-                <w:sz w:val="24"/>
-                <w:szCs w:val="24"/>
-              </w:rPr>
-              <w:t xml:space="preserve"> </w:t>
-            </w:r>
-            <w:proofErr w:type="spellStart"/>
-            <w:r>
-              <w:rPr>
-                <w:rFonts w:ascii="Arial Narrow" w:hAnsi="Arial Narrow" w:cs="Times New Roman"/>
-                <w:sz w:val="24"/>
-                <w:szCs w:val="24"/>
-              </w:rPr>
-              <w:t>dengan</w:t>
-            </w:r>
-            <w:proofErr w:type="spellEnd"/>
-            <w:r>
-              <w:rPr>
-                <w:rFonts w:ascii="Arial Narrow" w:hAnsi="Arial Narrow" w:cs="Times New Roman"/>
-                <w:sz w:val="24"/>
-                <w:szCs w:val="24"/>
-              </w:rPr>
-              <w:t xml:space="preserve"> </w:t>
-            </w:r>
-            <w:proofErr w:type="spellStart"/>
-            <w:r>
-              <w:rPr>
-                <w:rFonts w:ascii="Arial Narrow" w:hAnsi="Arial Narrow" w:cs="Times New Roman"/>
-                <w:sz w:val="24"/>
-                <w:szCs w:val="24"/>
-              </w:rPr>
-              <w:t>pidana</w:t>
-            </w:r>
-            <w:proofErr w:type="spellEnd"/>
-            <w:r>
-              <w:rPr>
-                <w:rFonts w:ascii="Arial Narrow" w:hAnsi="Arial Narrow" w:cs="Times New Roman"/>
-                <w:sz w:val="24"/>
-                <w:szCs w:val="24"/>
-              </w:rPr>
-              <w:t xml:space="preserve"> </w:t>
-            </w:r>
-            <w:proofErr w:type="spellStart"/>
-            <w:r>
-              <w:rPr>
-                <w:rFonts w:ascii="Arial Narrow" w:hAnsi="Arial Narrow" w:cs="Times New Roman"/>
-                <w:sz w:val="24"/>
-                <w:szCs w:val="24"/>
-              </w:rPr>
-              <w:t>penjara</w:t>
-            </w:r>
-            <w:proofErr w:type="spellEnd"/>
-            <w:r>
-              <w:rPr>
-                <w:rFonts w:ascii="Arial Narrow" w:hAnsi="Arial Narrow" w:cs="Times New Roman"/>
-                <w:sz w:val="24"/>
-                <w:szCs w:val="24"/>
-              </w:rPr>
-              <w:t xml:space="preserve"> 9 (</w:t>
-            </w:r>
-            <w:proofErr w:type="spellStart"/>
-            <w:r>
-              <w:rPr>
-                <w:rFonts w:ascii="Arial Narrow" w:hAnsi="Arial Narrow" w:cs="Times New Roman"/>
-                <w:sz w:val="24"/>
-                <w:szCs w:val="24"/>
-              </w:rPr>
-              <w:t>sembilan</w:t>
-            </w:r>
-            <w:proofErr w:type="spellEnd"/>
-            <w:r>
-              <w:rPr>
-                <w:rFonts w:ascii="Arial Narrow" w:hAnsi="Arial Narrow" w:cs="Times New Roman"/>
-                <w:sz w:val="24"/>
-                <w:szCs w:val="24"/>
-              </w:rPr>
-              <w:t xml:space="preserve">) </w:t>
-            </w:r>
-            <w:proofErr w:type="spellStart"/>
-            <w:r>
-              <w:rPr>
-                <w:rFonts w:ascii="Arial Narrow" w:hAnsi="Arial Narrow" w:cs="Times New Roman"/>
-                <w:sz w:val="24"/>
-                <w:szCs w:val="24"/>
-              </w:rPr>
-              <w:t>tahun</w:t>
-            </w:r>
-            <w:proofErr w:type="spellEnd"/>
-            <w:r>
-              <w:rPr>
-                <w:rFonts w:ascii="Arial Narrow" w:hAnsi="Arial Narrow" w:cs="Times New Roman"/>
-                <w:sz w:val="24"/>
-                <w:szCs w:val="24"/>
-              </w:rPr>
-              <w:t xml:space="preserve"> </w:t>
-            </w:r>
-            <w:proofErr w:type="spellStart"/>
-            <w:r>
-              <w:rPr>
-                <w:rFonts w:ascii="Arial Narrow" w:hAnsi="Arial Narrow" w:cs="Times New Roman"/>
-                <w:sz w:val="24"/>
-                <w:szCs w:val="24"/>
-              </w:rPr>
-              <w:t>atau</w:t>
-            </w:r>
-            <w:proofErr w:type="spellEnd"/>
-            <w:r>
-              <w:rPr>
-                <w:rFonts w:ascii="Arial Narrow" w:hAnsi="Arial Narrow" w:cs="Times New Roman"/>
-                <w:sz w:val="24"/>
-                <w:szCs w:val="24"/>
-              </w:rPr>
-              <w:t xml:space="preserve"> </w:t>
-            </w:r>
-            <w:proofErr w:type="spellStart"/>
-            <w:r>
-              <w:rPr>
-                <w:rFonts w:ascii="Arial Narrow" w:hAnsi="Arial Narrow" w:cs="Times New Roman"/>
-                <w:sz w:val="24"/>
-                <w:szCs w:val="24"/>
-              </w:rPr>
-              <w:t>lebih</w:t>
-            </w:r>
-            <w:proofErr w:type="spellEnd"/>
-            <w:r>
-              <w:rPr>
-                <w:rFonts w:ascii="Arial Narrow" w:hAnsi="Arial Narrow" w:cs="Times New Roman"/>
-                <w:sz w:val="24"/>
-                <w:szCs w:val="24"/>
-              </w:rPr>
-              <w:t xml:space="preserve">*), </w:t>
-            </w:r>
-            <w:proofErr w:type="spellStart"/>
-            <w:r>
-              <w:rPr>
-                <w:rFonts w:ascii="Arial Narrow" w:hAnsi="Arial Narrow" w:cs="Times New Roman"/>
-                <w:sz w:val="24"/>
-                <w:szCs w:val="24"/>
-              </w:rPr>
-              <w:t>untuk</w:t>
-            </w:r>
-            <w:proofErr w:type="spellEnd"/>
-            <w:r>
-              <w:rPr>
-                <w:rFonts w:ascii="Arial Narrow" w:hAnsi="Arial Narrow" w:cs="Times New Roman"/>
-                <w:sz w:val="24"/>
-                <w:szCs w:val="24"/>
-              </w:rPr>
-              <w:t xml:space="preserve"> </w:t>
-            </w:r>
-            <w:proofErr w:type="spellStart"/>
-            <w:r>
-              <w:rPr>
-                <w:rFonts w:ascii="Arial Narrow" w:hAnsi="Arial Narrow" w:cs="Times New Roman"/>
-                <w:sz w:val="24"/>
-                <w:szCs w:val="24"/>
-              </w:rPr>
-              <w:t>kepentingan</w:t>
-            </w:r>
-            <w:proofErr w:type="spellEnd"/>
-            <w:r>
-              <w:rPr>
-                <w:rFonts w:ascii="Arial Narrow" w:hAnsi="Arial Narrow" w:cs="Times New Roman"/>
-                <w:sz w:val="24"/>
-                <w:szCs w:val="24"/>
-              </w:rPr>
-              <w:t xml:space="preserve"> proses </w:t>
-            </w:r>
-            <w:proofErr w:type="spellStart"/>
-            <w:r>
-              <w:rPr>
-                <w:rFonts w:ascii="Arial Narrow" w:hAnsi="Arial Narrow" w:cs="Times New Roman"/>
-                <w:sz w:val="24"/>
-                <w:szCs w:val="24"/>
-              </w:rPr>
-              <w:t>penyidikan</w:t>
-            </w:r>
-            <w:proofErr w:type="spellEnd"/>
-            <w:r>
-              <w:rPr>
-                <w:rFonts w:ascii="Arial Narrow" w:hAnsi="Arial Narrow" w:cs="Times New Roman"/>
-                <w:sz w:val="24"/>
-                <w:szCs w:val="24"/>
-              </w:rPr>
-              <w:t xml:space="preserve"> </w:t>
-            </w:r>
-            <w:proofErr w:type="spellStart"/>
-            <w:r>
-              <w:rPr>
-                <w:rFonts w:ascii="Arial Narrow" w:hAnsi="Arial Narrow" w:cs="Times New Roman"/>
-                <w:sz w:val="24"/>
-                <w:szCs w:val="24"/>
-              </w:rPr>
-              <w:t>karena</w:t>
-            </w:r>
-            <w:proofErr w:type="spellEnd"/>
-            <w:r>
-              <w:rPr>
-                <w:rFonts w:ascii="Arial Narrow" w:hAnsi="Arial Narrow" w:cs="Times New Roman"/>
-                <w:sz w:val="24"/>
-                <w:szCs w:val="24"/>
-              </w:rPr>
-              <w:t xml:space="preserve"> </w:t>
-            </w:r>
-            <w:proofErr w:type="spellStart"/>
-            <w:r>
-              <w:rPr>
-                <w:rFonts w:ascii="Arial Narrow" w:hAnsi="Arial Narrow" w:cs="Times New Roman"/>
-                <w:sz w:val="24"/>
-                <w:szCs w:val="24"/>
-              </w:rPr>
-              <w:t>pemeriksaan</w:t>
-            </w:r>
-            <w:proofErr w:type="spellEnd"/>
-            <w:r>
-              <w:rPr>
-                <w:rFonts w:ascii="Arial Narrow" w:hAnsi="Arial Narrow" w:cs="Times New Roman"/>
-                <w:sz w:val="24"/>
-                <w:szCs w:val="24"/>
-              </w:rPr>
-              <w:t xml:space="preserve"> </w:t>
-            </w:r>
-            <w:proofErr w:type="spellStart"/>
-            <w:r>
-              <w:rPr>
-                <w:rFonts w:ascii="Arial Narrow" w:hAnsi="Arial Narrow" w:cs="Times New Roman"/>
-                <w:sz w:val="24"/>
-                <w:szCs w:val="24"/>
-              </w:rPr>
-              <w:t>terhadap</w:t>
-            </w:r>
-            <w:proofErr w:type="spellEnd"/>
-            <w:r>
-              <w:rPr>
-                <w:rFonts w:ascii="Arial Narrow" w:hAnsi="Arial Narrow" w:cs="Times New Roman"/>
-                <w:sz w:val="24"/>
-                <w:szCs w:val="24"/>
-              </w:rPr>
-              <w:t xml:space="preserve"> </w:t>
-            </w:r>
-            <w:proofErr w:type="spellStart"/>
-            <w:r>
-              <w:rPr>
-                <w:rFonts w:ascii="Arial Narrow" w:hAnsi="Arial Narrow" w:cs="Times New Roman"/>
-                <w:sz w:val="24"/>
-                <w:szCs w:val="24"/>
-              </w:rPr>
-              <w:t>tersangka</w:t>
-            </w:r>
-            <w:proofErr w:type="spellEnd"/>
-            <w:r>
-              <w:rPr>
-                <w:rFonts w:ascii="Arial Narrow" w:hAnsi="Arial Narrow" w:cs="Times New Roman"/>
-                <w:sz w:val="24"/>
-                <w:szCs w:val="24"/>
-              </w:rPr>
-              <w:t xml:space="preserve"> dan proses </w:t>
-            </w:r>
-            <w:proofErr w:type="spellStart"/>
-            <w:r>
-              <w:rPr>
-                <w:rFonts w:ascii="Arial Narrow" w:hAnsi="Arial Narrow" w:cs="Times New Roman"/>
-                <w:sz w:val="24"/>
-                <w:szCs w:val="24"/>
-              </w:rPr>
-              <w:t>penyidikan</w:t>
-            </w:r>
-            <w:proofErr w:type="spellEnd"/>
-            <w:r>
-              <w:rPr>
-                <w:rFonts w:ascii="Arial Narrow" w:hAnsi="Arial Narrow" w:cs="Times New Roman"/>
-                <w:sz w:val="24"/>
-                <w:szCs w:val="24"/>
-              </w:rPr>
-              <w:t xml:space="preserve"> </w:t>
-            </w:r>
-            <w:proofErr w:type="spellStart"/>
-            <w:r>
-              <w:rPr>
-                <w:rFonts w:ascii="Arial Narrow" w:hAnsi="Arial Narrow" w:cs="Times New Roman"/>
-                <w:sz w:val="24"/>
-                <w:szCs w:val="24"/>
-              </w:rPr>
-              <w:t>perkaranya</w:t>
-            </w:r>
-            <w:proofErr w:type="spellEnd"/>
-            <w:r>
-              <w:rPr>
-                <w:rFonts w:ascii="Arial Narrow" w:hAnsi="Arial Narrow" w:cs="Times New Roman"/>
-                <w:sz w:val="24"/>
-                <w:szCs w:val="24"/>
-              </w:rPr>
-              <w:t xml:space="preserve"> </w:t>
-            </w:r>
-            <w:proofErr w:type="spellStart"/>
-            <w:r>
-              <w:rPr>
-                <w:rFonts w:ascii="Arial Narrow" w:hAnsi="Arial Narrow" w:cs="Times New Roman"/>
-                <w:sz w:val="24"/>
-                <w:szCs w:val="24"/>
-              </w:rPr>
-              <w:t>belum</w:t>
-            </w:r>
-            <w:proofErr w:type="spellEnd"/>
-            <w:r>
-              <w:rPr>
-                <w:rFonts w:ascii="Arial Narrow" w:hAnsi="Arial Narrow" w:cs="Times New Roman"/>
-                <w:sz w:val="24"/>
-                <w:szCs w:val="24"/>
-              </w:rPr>
-              <w:t xml:space="preserve"> </w:t>
-            </w:r>
-            <w:proofErr w:type="spellStart"/>
-            <w:r>
-              <w:rPr>
-                <w:rFonts w:ascii="Arial Narrow" w:hAnsi="Arial Narrow" w:cs="Times New Roman"/>
-                <w:sz w:val="24"/>
-                <w:szCs w:val="24"/>
-              </w:rPr>
-              <w:t>selesai</w:t>
-            </w:r>
-            <w:proofErr w:type="spellEnd"/>
-            <w:r>
-              <w:rPr>
-                <w:rFonts w:ascii="Arial Narrow" w:hAnsi="Arial Narrow" w:cs="Times New Roman"/>
-                <w:sz w:val="24"/>
-                <w:szCs w:val="24"/>
-              </w:rPr>
-              <w:t xml:space="preserve">, </w:t>
-            </w:r>
-            <w:proofErr w:type="spellStart"/>
-            <w:r>
-              <w:rPr>
-                <w:rFonts w:ascii="Arial Narrow" w:hAnsi="Arial Narrow" w:cs="Times New Roman"/>
-                <w:sz w:val="24"/>
-                <w:szCs w:val="24"/>
-              </w:rPr>
-              <w:t>sedangkan</w:t>
-            </w:r>
-            <w:proofErr w:type="spellEnd"/>
-            <w:r>
-              <w:rPr>
-                <w:rFonts w:ascii="Arial Narrow" w:hAnsi="Arial Narrow" w:cs="Times New Roman"/>
-                <w:sz w:val="24"/>
-                <w:szCs w:val="24"/>
-              </w:rPr>
-              <w:t xml:space="preserve"> masa </w:t>
-            </w:r>
-            <w:proofErr w:type="spellStart"/>
-            <w:r>
-              <w:rPr>
-                <w:rFonts w:ascii="Arial Narrow" w:hAnsi="Arial Narrow" w:cs="Times New Roman"/>
-                <w:sz w:val="24"/>
-                <w:szCs w:val="24"/>
-              </w:rPr>
-              <w:t>penahanan</w:t>
-            </w:r>
-            <w:proofErr w:type="spellEnd"/>
-            <w:r>
-              <w:rPr>
-                <w:rFonts w:ascii="Arial Narrow" w:hAnsi="Arial Narrow" w:cs="Times New Roman"/>
-                <w:sz w:val="24"/>
-                <w:szCs w:val="24"/>
-              </w:rPr>
-              <w:t xml:space="preserve"> </w:t>
-            </w:r>
-            <w:proofErr w:type="spellStart"/>
-            <w:r>
-              <w:rPr>
-                <w:rFonts w:ascii="Arial Narrow" w:hAnsi="Arial Narrow" w:cs="Times New Roman"/>
-                <w:sz w:val="24"/>
-                <w:szCs w:val="24"/>
-              </w:rPr>
-              <w:t>dari</w:t>
-            </w:r>
-            <w:proofErr w:type="spellEnd"/>
-            <w:r>
-              <w:rPr>
-                <w:rFonts w:ascii="Arial Narrow" w:hAnsi="Arial Narrow" w:cs="Times New Roman"/>
-                <w:sz w:val="24"/>
-                <w:szCs w:val="24"/>
-              </w:rPr>
-              <w:t xml:space="preserve"> </w:t>
-            </w:r>
-            <w:proofErr w:type="spellStart"/>
-            <w:r>
-              <w:rPr>
-                <w:rFonts w:ascii="Arial Narrow" w:hAnsi="Arial Narrow" w:cs="Times New Roman"/>
-                <w:sz w:val="24"/>
-                <w:szCs w:val="24"/>
-              </w:rPr>
-              <w:t>pengadilan</w:t>
-            </w:r>
-            <w:proofErr w:type="spellEnd"/>
-            <w:r>
-              <w:rPr>
-                <w:rFonts w:ascii="Arial Narrow" w:hAnsi="Arial Narrow" w:cs="Times New Roman"/>
-                <w:sz w:val="24"/>
-                <w:szCs w:val="24"/>
-              </w:rPr>
-              <w:t xml:space="preserve"> negeri </w:t>
-            </w:r>
-            <w:proofErr w:type="spellStart"/>
-            <w:r>
-              <w:rPr>
-                <w:rFonts w:ascii="Arial Narrow" w:hAnsi="Arial Narrow" w:cs="Times New Roman"/>
-                <w:sz w:val="24"/>
-                <w:szCs w:val="24"/>
-              </w:rPr>
-              <w:t>akan</w:t>
-            </w:r>
-            <w:proofErr w:type="spellEnd"/>
-            <w:r>
-              <w:rPr>
-                <w:rFonts w:ascii="Arial Narrow" w:hAnsi="Arial Narrow" w:cs="Times New Roman"/>
-                <w:sz w:val="24"/>
-                <w:szCs w:val="24"/>
-              </w:rPr>
-              <w:t xml:space="preserve"> </w:t>
-            </w:r>
-            <w:proofErr w:type="spellStart"/>
-            <w:r>
-              <w:rPr>
-                <w:rFonts w:ascii="Arial Narrow" w:hAnsi="Arial Narrow" w:cs="Times New Roman"/>
-                <w:sz w:val="24"/>
-                <w:szCs w:val="24"/>
-              </w:rPr>
-              <w:t>berakhir</w:t>
-            </w:r>
-            <w:proofErr w:type="spellEnd"/>
-            <w:r>
-              <w:rPr>
-                <w:rFonts w:ascii="Arial Narrow" w:hAnsi="Arial Narrow" w:cs="Times New Roman"/>
-                <w:sz w:val="24"/>
-                <w:szCs w:val="24"/>
-              </w:rPr>
-              <w:t xml:space="preserve"> pada </w:t>
-            </w:r>
-            <w:proofErr w:type="spellStart"/>
-            <w:r>
-              <w:rPr>
-                <w:rFonts w:ascii="Arial Narrow" w:hAnsi="Arial Narrow" w:cs="Times New Roman"/>
-                <w:sz w:val="24"/>
-                <w:szCs w:val="24"/>
-              </w:rPr>
-              <w:t>tanggal</w:t>
-            </w:r>
-            <w:proofErr w:type="spellEnd"/>
-            <w:r>
-              <w:rPr>
-                <w:rFonts w:ascii="Arial Narrow" w:hAnsi="Arial Narrow" w:cs="Times New Roman"/>
-                <w:sz w:val="24"/>
-                <w:szCs w:val="24"/>
-              </w:rPr>
-              <w:t xml:space="preserve"> </w:t>
-            </w:r>
-            <w:r>
-              <w:rPr>
-                <w:rFonts w:ascii="Arial Narrow" w:hAnsi="Arial Narrow" w:cs="Times New Roman"/>
-                <w:sz w:val="24"/>
-                <w:szCs w:val="24"/>
-              </w:rPr>
-              <w:t>${</w:t>
-            </w:r>
-            <w:proofErr w:type="spellStart"/>
-            <w:r>
-              <w:rPr>
-                <w:rFonts w:ascii="Arial Narrow" w:hAnsi="Arial Narrow" w:cs="Times New Roman"/>
-                <w:sz w:val="24"/>
-                <w:szCs w:val="24"/>
-              </w:rPr>
-              <w:t>pengadilan_negeri_akhir_tanggal</w:t>
-            </w:r>
-            <w:proofErr w:type="spellEnd"/>
-            <w:r>
-              <w:rPr>
-                <w:rFonts w:ascii="Arial Narrow" w:hAnsi="Arial Narrow" w:cs="Times New Roman"/>
-                <w:sz w:val="24"/>
-                <w:szCs w:val="24"/>
-              </w:rPr>
-              <w:t xml:space="preserve">}, </w:t>
-            </w:r>
-            <w:proofErr w:type="spellStart"/>
-            <w:r>
-              <w:rPr>
-                <w:rFonts w:ascii="Arial Narrow" w:hAnsi="Arial Narrow" w:cs="Times New Roman"/>
-                <w:sz w:val="24"/>
-                <w:szCs w:val="24"/>
-              </w:rPr>
-              <w:t>maka</w:t>
-            </w:r>
-            <w:proofErr w:type="spellEnd"/>
-            <w:r>
-              <w:rPr>
-                <w:rFonts w:ascii="Arial Narrow" w:hAnsi="Arial Narrow" w:cs="Times New Roman"/>
-                <w:sz w:val="24"/>
-                <w:szCs w:val="24"/>
-              </w:rPr>
-              <w:t xml:space="preserve"> </w:t>
-            </w:r>
-            <w:proofErr w:type="spellStart"/>
-            <w:r>
-              <w:rPr>
-                <w:rFonts w:ascii="Arial Narrow" w:hAnsi="Arial Narrow" w:cs="Times New Roman"/>
-                <w:sz w:val="24"/>
-                <w:szCs w:val="24"/>
-              </w:rPr>
-              <w:t>penyidik</w:t>
-            </w:r>
-            <w:proofErr w:type="spellEnd"/>
-            <w:r>
-              <w:rPr>
-                <w:rFonts w:ascii="Arial Narrow" w:hAnsi="Arial Narrow" w:cs="Times New Roman"/>
-                <w:sz w:val="24"/>
-                <w:szCs w:val="24"/>
-              </w:rPr>
-              <w:t xml:space="preserve"> </w:t>
-            </w:r>
-            <w:proofErr w:type="spellStart"/>
-            <w:r>
-              <w:rPr>
-                <w:rFonts w:ascii="Arial Narrow" w:hAnsi="Arial Narrow" w:cs="Times New Roman"/>
-                <w:sz w:val="24"/>
-                <w:szCs w:val="24"/>
-              </w:rPr>
-              <w:t>mengajukan</w:t>
-            </w:r>
-            <w:proofErr w:type="spellEnd"/>
-            <w:r>
-              <w:rPr>
-                <w:rFonts w:ascii="Arial Narrow" w:hAnsi="Arial Narrow" w:cs="Times New Roman"/>
-                <w:sz w:val="24"/>
-                <w:szCs w:val="24"/>
-              </w:rPr>
-              <w:t xml:space="preserve"> </w:t>
-            </w:r>
-            <w:proofErr w:type="spellStart"/>
-            <w:r>
-              <w:rPr>
-                <w:rFonts w:ascii="Arial Narrow" w:hAnsi="Arial Narrow" w:cs="Times New Roman"/>
-                <w:sz w:val="24"/>
-                <w:szCs w:val="24"/>
-              </w:rPr>
-              <w:t>permohonan</w:t>
-            </w:r>
-            <w:proofErr w:type="spellEnd"/>
-            <w:r>
-              <w:rPr>
-                <w:rFonts w:ascii="Arial Narrow" w:hAnsi="Arial Narrow" w:cs="Times New Roman"/>
-                <w:sz w:val="24"/>
-                <w:szCs w:val="24"/>
-              </w:rPr>
-              <w:t xml:space="preserve"> </w:t>
-            </w:r>
-            <w:proofErr w:type="spellStart"/>
-            <w:r>
-              <w:rPr>
-                <w:rFonts w:ascii="Arial Narrow" w:hAnsi="Arial Narrow" w:cs="Times New Roman"/>
-                <w:sz w:val="24"/>
-                <w:szCs w:val="24"/>
-              </w:rPr>
-              <w:t>kepada</w:t>
-            </w:r>
-            <w:proofErr w:type="spellEnd"/>
-            <w:r>
-              <w:rPr>
-                <w:rFonts w:ascii="Arial Narrow" w:hAnsi="Arial Narrow" w:cs="Times New Roman"/>
-                <w:sz w:val="24"/>
-                <w:szCs w:val="24"/>
-              </w:rPr>
-              <w:t xml:space="preserve"> </w:t>
-            </w:r>
-            <w:proofErr w:type="spellStart"/>
-            <w:r>
-              <w:rPr>
-                <w:rFonts w:ascii="Arial Narrow" w:hAnsi="Arial Narrow" w:cs="Times New Roman"/>
-                <w:sz w:val="24"/>
-                <w:szCs w:val="24"/>
-              </w:rPr>
-              <w:t>Ketua</w:t>
-            </w:r>
-            <w:proofErr w:type="spellEnd"/>
-            <w:r>
-              <w:rPr>
-                <w:rFonts w:ascii="Arial Narrow" w:hAnsi="Arial Narrow" w:cs="Times New Roman"/>
-                <w:sz w:val="24"/>
-                <w:szCs w:val="24"/>
-              </w:rPr>
-              <w:t xml:space="preserve"> </w:t>
-            </w:r>
-            <w:proofErr w:type="spellStart"/>
-            <w:r>
-              <w:rPr>
-                <w:rFonts w:ascii="Arial Narrow" w:hAnsi="Arial Narrow" w:cs="Times New Roman"/>
-                <w:sz w:val="24"/>
-                <w:szCs w:val="24"/>
-              </w:rPr>
-              <w:t>untuk</w:t>
-            </w:r>
-            <w:proofErr w:type="spellEnd"/>
-            <w:r>
-              <w:rPr>
-                <w:rFonts w:ascii="Arial Narrow" w:hAnsi="Arial Narrow" w:cs="Times New Roman"/>
-                <w:sz w:val="24"/>
-                <w:szCs w:val="24"/>
-              </w:rPr>
-              <w:t xml:space="preserve"> </w:t>
-            </w:r>
-            <w:proofErr w:type="spellStart"/>
-            <w:r>
-              <w:rPr>
-                <w:rFonts w:ascii="Arial Narrow" w:hAnsi="Arial Narrow" w:cs="Times New Roman"/>
-                <w:sz w:val="24"/>
-                <w:szCs w:val="24"/>
-              </w:rPr>
-              <w:t>dapatnya</w:t>
-            </w:r>
-            <w:proofErr w:type="spellEnd"/>
-            <w:r>
-              <w:rPr>
-                <w:rFonts w:ascii="Arial Narrow" w:hAnsi="Arial Narrow" w:cs="Times New Roman"/>
-                <w:sz w:val="24"/>
-                <w:szCs w:val="24"/>
-              </w:rPr>
-              <w:t xml:space="preserve"> </w:t>
-            </w:r>
-            <w:proofErr w:type="spellStart"/>
-            <w:r>
-              <w:rPr>
-                <w:rFonts w:ascii="Arial Narrow" w:hAnsi="Arial Narrow" w:cs="Times New Roman"/>
-                <w:sz w:val="24"/>
-                <w:szCs w:val="24"/>
-              </w:rPr>
-              <w:t>penahanan</w:t>
-            </w:r>
-            <w:proofErr w:type="spellEnd"/>
-            <w:r>
-              <w:rPr>
-                <w:rFonts w:ascii="Arial Narrow" w:hAnsi="Arial Narrow" w:cs="Times New Roman"/>
-                <w:sz w:val="24"/>
-                <w:szCs w:val="24"/>
-              </w:rPr>
-              <w:t xml:space="preserve"> </w:t>
-            </w:r>
-            <w:proofErr w:type="spellStart"/>
-            <w:r>
-              <w:rPr>
-                <w:rFonts w:ascii="Arial Narrow" w:hAnsi="Arial Narrow" w:cs="Times New Roman"/>
-                <w:sz w:val="24"/>
-                <w:szCs w:val="24"/>
-              </w:rPr>
-              <w:t>terhadap</w:t>
-            </w:r>
-            <w:proofErr w:type="spellEnd"/>
-            <w:r>
-              <w:rPr>
-                <w:rFonts w:ascii="Arial Narrow" w:hAnsi="Arial Narrow" w:cs="Times New Roman"/>
-                <w:sz w:val="24"/>
-                <w:szCs w:val="24"/>
-              </w:rPr>
-              <w:t xml:space="preserve"> </w:t>
-            </w:r>
-            <w:proofErr w:type="spellStart"/>
-            <w:r>
-              <w:rPr>
-                <w:rFonts w:ascii="Arial Narrow" w:hAnsi="Arial Narrow" w:cs="Times New Roman"/>
-                <w:sz w:val="24"/>
-                <w:szCs w:val="24"/>
-              </w:rPr>
-              <w:t>tersangka</w:t>
-            </w:r>
-            <w:proofErr w:type="spellEnd"/>
-            <w:r>
-              <w:rPr>
-                <w:rFonts w:ascii="Arial Narrow" w:hAnsi="Arial Narrow" w:cs="Times New Roman"/>
-                <w:sz w:val="24"/>
-                <w:szCs w:val="24"/>
-              </w:rPr>
-              <w:t xml:space="preserve"> </w:t>
-            </w:r>
-            <w:proofErr w:type="spellStart"/>
-            <w:r>
-              <w:rPr>
-                <w:rFonts w:ascii="Arial Narrow" w:hAnsi="Arial Narrow" w:cs="Times New Roman"/>
-                <w:sz w:val="24"/>
-                <w:szCs w:val="24"/>
-              </w:rPr>
-              <w:t>diperpanjang</w:t>
-            </w:r>
-            <w:proofErr w:type="spellEnd"/>
-            <w:r>
-              <w:rPr>
-                <w:rFonts w:ascii="Arial Narrow" w:hAnsi="Arial Narrow" w:cs="Times New Roman"/>
-                <w:sz w:val="24"/>
-                <w:szCs w:val="24"/>
-              </w:rPr>
-              <w:t xml:space="preserve"> </w:t>
-            </w:r>
-            <w:proofErr w:type="spellStart"/>
-            <w:r>
-              <w:rPr>
-                <w:rFonts w:ascii="Arial Narrow" w:hAnsi="Arial Narrow" w:cs="Times New Roman"/>
-                <w:sz w:val="24"/>
-                <w:szCs w:val="24"/>
-              </w:rPr>
-              <w:t>selama</w:t>
-            </w:r>
-            <w:proofErr w:type="spellEnd"/>
-            <w:r>
-              <w:rPr>
-                <w:rFonts w:ascii="Arial Narrow" w:hAnsi="Arial Narrow" w:cs="Times New Roman"/>
-                <w:sz w:val="24"/>
-                <w:szCs w:val="24"/>
-              </w:rPr>
-              <w:t xml:space="preserve"> ${</w:t>
-            </w:r>
-            <w:proofErr w:type="spellStart"/>
-            <w:r>
-              <w:rPr>
-                <w:rFonts w:ascii="Arial Narrow" w:hAnsi="Arial Narrow" w:cs="Times New Roman"/>
-                <w:sz w:val="24"/>
-                <w:szCs w:val="24"/>
-              </w:rPr>
-              <w:t>requestedExtensionDays</w:t>
-            </w:r>
-            <w:proofErr w:type="spellEnd"/>
-            <w:r>
-              <w:rPr>
-                <w:rFonts w:ascii="Arial Narrow" w:hAnsi="Arial Narrow" w:cs="Times New Roman"/>
-                <w:sz w:val="24"/>
-                <w:szCs w:val="24"/>
-              </w:rPr>
-              <w:t>} (</w:t>
-            </w:r>
-            <w:proofErr w:type="spellStart"/>
-            <w:r>
-              <w:rPr>
-                <w:rFonts w:ascii="Arial Narrow" w:hAnsi="Arial Narrow" w:cs="Times New Roman"/>
-                <w:sz w:val="24"/>
-                <w:szCs w:val="24"/>
-              </w:rPr>
-              <w:t>tiga</w:t>
-            </w:r>
-            <w:proofErr w:type="spellEnd"/>
-            <w:r>
-              <w:rPr>
-                <w:rFonts w:ascii="Arial Narrow" w:hAnsi="Arial Narrow" w:cs="Times New Roman"/>
-                <w:sz w:val="24"/>
-                <w:szCs w:val="24"/>
-              </w:rPr>
-              <w:t xml:space="preserve"> </w:t>
-            </w:r>
-            <w:proofErr w:type="spellStart"/>
-            <w:r>
-              <w:rPr>
-                <w:rFonts w:ascii="Arial Narrow" w:hAnsi="Arial Narrow" w:cs="Times New Roman"/>
-                <w:sz w:val="24"/>
-                <w:szCs w:val="24"/>
-              </w:rPr>
-              <w:t>puluh</w:t>
-            </w:r>
-            <w:proofErr w:type="spellEnd"/>
-            <w:r>
-              <w:rPr>
-                <w:rFonts w:ascii="Arial Narrow" w:hAnsi="Arial Narrow" w:cs="Times New Roman"/>
-                <w:sz w:val="24"/>
-                <w:szCs w:val="24"/>
-              </w:rPr>
-              <w:t xml:space="preserve">) </w:t>
-            </w:r>
-            <w:proofErr w:type="spellStart"/>
-            <w:r>
-              <w:rPr>
-                <w:rFonts w:ascii="Arial Narrow" w:hAnsi="Arial Narrow" w:cs="Times New Roman"/>
-                <w:sz w:val="24"/>
-                <w:szCs w:val="24"/>
-              </w:rPr>
-              <w:t>hari</w:t>
-            </w:r>
-            <w:proofErr w:type="spellEnd"/>
-            <w:r>
-              <w:rPr>
-                <w:rFonts w:ascii="Arial Narrow" w:hAnsi="Arial Narrow" w:cs="Times New Roman"/>
-                <w:sz w:val="24"/>
-                <w:szCs w:val="24"/>
-              </w:rPr>
-              <w:t xml:space="preserve"> di ${</w:t>
-            </w:r>
-            <w:proofErr w:type="spellStart"/>
-            <w:r>
-              <w:rPr>
-                <w:rFonts w:ascii="Arial Narrow" w:hAnsi="Arial Narrow" w:cs="Times New Roman"/>
-                <w:sz w:val="24"/>
-                <w:szCs w:val="24"/>
-              </w:rPr>
-              <w:t>rutan_name</w:t>
-            </w:r>
-            <w:proofErr w:type="spellEnd"/>
-            <w:r>
-              <w:rPr>
-                <w:rFonts w:ascii="Arial Narrow" w:hAnsi="Arial Narrow" w:cs="Times New Roman"/>
-                <w:sz w:val="24"/>
-                <w:szCs w:val="24"/>
-              </w:rPr>
-              <w:t xml:space="preserve">} </w:t>
-            </w:r>
-            <w:proofErr w:type="spellStart"/>
-            <w:r>
-              <w:rPr>
-                <w:rFonts w:ascii="Arial Narrow" w:hAnsi="Arial Narrow" w:cs="Times New Roman"/>
-                <w:sz w:val="24"/>
-                <w:szCs w:val="24"/>
-              </w:rPr>
-              <w:t>dari</w:t>
-            </w:r>
-            <w:proofErr w:type="spellEnd"/>
-            <w:r>
-              <w:rPr>
-                <w:rFonts w:ascii="Arial Narrow" w:hAnsi="Arial Narrow" w:cs="Times New Roman"/>
-                <w:sz w:val="24"/>
-                <w:szCs w:val="24"/>
-              </w:rPr>
-              <w:t xml:space="preserve"> </w:t>
-            </w:r>
-            <w:proofErr w:type="spellStart"/>
-            <w:r>
-              <w:rPr>
-                <w:rFonts w:ascii="Arial Narrow" w:hAnsi="Arial Narrow" w:cs="Times New Roman"/>
-                <w:sz w:val="24"/>
-                <w:szCs w:val="24"/>
-              </w:rPr>
-              <w:t>tanggal</w:t>
-            </w:r>
-            <w:proofErr w:type="spellEnd"/>
-            <w:r>
-              <w:rPr>
-                <w:rFonts w:ascii="Arial Narrow" w:hAnsi="Arial Narrow" w:cs="Times New Roman"/>
-                <w:sz w:val="24"/>
-                <w:szCs w:val="24"/>
-              </w:rPr>
-              <w:t xml:space="preserve"> ${</w:t>
-            </w:r>
-            <w:proofErr w:type="spellStart"/>
-            <w:r>
-              <w:rPr>
-                <w:rFonts w:ascii="Arial Narrow" w:hAnsi="Arial Narrow" w:cs="Times New Roman"/>
-                <w:sz w:val="24"/>
-                <w:szCs w:val="24"/>
-              </w:rPr>
-              <w:t>extensionStartDate</w:t>
-            </w:r>
-            <w:proofErr w:type="spellEnd"/>
-            <w:r>
-              <w:rPr>
-                <w:rFonts w:ascii="Arial Narrow" w:hAnsi="Arial Narrow" w:cs="Times New Roman"/>
-                <w:sz w:val="24"/>
-                <w:szCs w:val="24"/>
-              </w:rPr>
-              <w:t xml:space="preserve">} </w:t>
-            </w:r>
-            <w:proofErr w:type="spellStart"/>
-            <w:r>
-              <w:rPr>
-                <w:rFonts w:ascii="Arial Narrow" w:hAnsi="Arial Narrow" w:cs="Times New Roman"/>
-                <w:sz w:val="24"/>
-                <w:szCs w:val="24"/>
-              </w:rPr>
-              <w:t>s.d.</w:t>
-            </w:r>
-            <w:proofErr w:type="spellEnd"/>
-            <w:r>
-              <w:rPr>
-                <w:rFonts w:ascii="Arial Narrow" w:hAnsi="Arial Narrow" w:cs="Times New Roman"/>
-                <w:sz w:val="24"/>
-                <w:szCs w:val="24"/>
-              </w:rPr>
-              <w:t xml:space="preserve"> ${</w:t>
-            </w:r>
-            <w:proofErr w:type="spellStart"/>
-            <w:r>
-              <w:rPr>
-                <w:rFonts w:ascii="Arial Narrow" w:hAnsi="Arial Narrow" w:cs="Times New Roman"/>
-                <w:sz w:val="24"/>
-                <w:szCs w:val="24"/>
-              </w:rPr>
-              <w:t>extensionEndDate</w:t>
-            </w:r>
-            <w:proofErr w:type="spellEnd"/>
-            <w:r>
-              <w:rPr>
-                <w:rFonts w:ascii="Arial Narrow" w:hAnsi="Arial Narrow" w:cs="Times New Roman"/>
-                <w:sz w:val="24"/>
-                <w:szCs w:val="24"/>
-              </w:rPr>
-              <w:t>}.</w:t>
+            <w:r>
+              <w:rPr>
+                <w:rFonts w:ascii="Arial Narrow" w:hAnsi="Arial Narrow" w:cs="Times New Roman"/>
+                <w:sz w:val="24"/>
+                <w:szCs w:val="24"/>
+              </w:rPr>
+              <w:t xml:space="preserve">Berkaitan dengan hal tersebut, dikarenakan tersangka menderita gangguan fisik atau mental yang berat yang dibuktikan dengan surat keterangan dokter atau perkara yang sedang diperiksa diancam dengan pidana penjara 9 (sembilan) tahun atau lebih*), untuk kepentingan proses penyidikan karena pemeriksaan terhadap tersangka dan proses penyidikan perkaranya belum selesai, sedangkan masa penahanan dari pengadilan negeri akan berakhir pada tanggal </w:t>
+            </w:r>
+            <w:r>
+              <w:rPr>
+                <w:rFonts w:ascii="Arial Narrow" w:hAnsi="Arial Narrow" w:cs="Times New Roman"/>
+                <w:sz w:val="24"/>
+                <w:szCs w:val="24"/>
+              </w:rPr>
+              <w:t>${pengadilan_negeri_akhir_tanggal}, maka penyidik mengajukan permohonan kepada Ketua untuk dapatnya penahanan terhadap tersangka diperpanjang selama ${requestedExtensionDays} (tiga puluh) hari di ${rutan_name} dari tanggal ${extensionStartDate} s.d. ${extensionEndDate}.</w:t>
             </w:r>
           </w:p>
           <w:p>
@@ -5988,23 +3982,13 @@
                       <w:szCs w:val="24"/>
                     </w:rPr>
                   </w:pPr>
-                  <w:proofErr w:type="spellStart"/>
                   <w:r>
                     <w:rPr>
                       <w:rFonts w:ascii="Arial Narrow" w:hAnsi="Arial Narrow" w:cs="Times New Roman"/>
                       <w:sz w:val="24"/>
                       <w:szCs w:val="24"/>
                     </w:rPr>
-                    <w:t>Tembusan</w:t>
-                  </w:r>
-                  <w:proofErr w:type="spellEnd"/>
-                  <w:r>
-                    <w:rPr>
-                      <w:rFonts w:ascii="Arial Narrow" w:hAnsi="Arial Narrow" w:cs="Times New Roman"/>
-                      <w:sz w:val="24"/>
-                      <w:szCs w:val="24"/>
-                    </w:rPr>
-                    <w:t xml:space="preserve"> :</w:t>
+                    <w:t>Tembusan :</w:t>
                   </w:r>
                 </w:p>
               </w:tc>
@@ -6034,9 +4018,8 @@
                       <w:sz w:val="24"/>
                       <w:szCs w:val="24"/>
                     </w:rPr>
-                    <w:t>${</w:t>
+                    <w:t>${carbon</w:t>
                   </w:r>
-                  <w:proofErr w:type="spellStart"/>
                   <w:r>
                     <w:rPr>
                       <w:rFonts w:ascii="Arial Narrow" w:eastAsia="Arial Narrow" w:hAnsi="Arial Narrow" w:cs="Times New Roman"/>
@@ -6045,7 +4028,7 @@
                       <w:sz w:val="24"/>
                       <w:szCs w:val="24"/>
                     </w:rPr>
-                    <w:t>carbon</w:t>
+                    <w:t>_c</w:t>
                   </w:r>
                   <w:r>
                     <w:rPr>
@@ -6055,6 +4038,36 @@
                       <w:sz w:val="24"/>
                       <w:szCs w:val="24"/>
                     </w:rPr>
+                    <w:t>opy</w:t>
+                  </w:r>
+                  <w:r>
+                    <w:rPr>
+                      <w:rFonts w:ascii="Arial Narrow" w:eastAsia="Arial Narrow" w:hAnsi="Arial Narrow" w:cs="Times New Roman"/>
+                      <w:bCs/>
+                      <w:color w:val="000000"/>
+                      <w:sz w:val="24"/>
+                      <w:szCs w:val="24"/>
+                    </w:rPr>
+                    <w:t>_i</w:t>
+                  </w:r>
+                  <w:r>
+                    <w:rPr>
+                      <w:rFonts w:ascii="Arial Narrow" w:eastAsia="Arial Narrow" w:hAnsi="Arial Narrow" w:cs="Times New Roman"/>
+                      <w:bCs/>
+                      <w:color w:val="000000"/>
+                      <w:sz w:val="24"/>
+                      <w:szCs w:val="24"/>
+                    </w:rPr>
+                    <w:t>teration}. ${carbon</w:t>
+                  </w:r>
+                  <w:r>
+                    <w:rPr>
+                      <w:rFonts w:ascii="Arial Narrow" w:eastAsia="Arial Narrow" w:hAnsi="Arial Narrow" w:cs="Times New Roman"/>
+                      <w:bCs/>
+                      <w:color w:val="000000"/>
+                      <w:sz w:val="24"/>
+                      <w:szCs w:val="24"/>
+                    </w:rPr>
                     <w:t>_c</w:t>
                   </w:r>
                   <w:r>
@@ -6075,7 +4088,7 @@
                       <w:sz w:val="24"/>
                       <w:szCs w:val="24"/>
                     </w:rPr>
-                    <w:t>_i</w:t>
+                    <w:t>_n</w:t>
                   </w:r>
                   <w:r>
                     <w:rPr>
@@ -6085,80 +4098,7 @@
                       <w:sz w:val="24"/>
                       <w:szCs w:val="24"/>
                     </w:rPr>
-                    <w:t>teration</w:t>
-                  </w:r>
-                  <w:proofErr w:type="spellEnd"/>
-                  <w:r>
-                    <w:rPr>
-                      <w:rFonts w:ascii="Arial Narrow" w:eastAsia="Arial Narrow" w:hAnsi="Arial Narrow" w:cs="Times New Roman"/>
-                      <w:bCs/>
-                      <w:color w:val="000000"/>
-                      <w:sz w:val="24"/>
-                      <w:szCs w:val="24"/>
-                    </w:rPr>
-                    <w:t>}. ${</w:t>
-                  </w:r>
-                  <w:proofErr w:type="spellStart"/>
-                  <w:r>
-                    <w:rPr>
-                      <w:rFonts w:ascii="Arial Narrow" w:eastAsia="Arial Narrow" w:hAnsi="Arial Narrow" w:cs="Times New Roman"/>
-                      <w:bCs/>
-                      <w:color w:val="000000"/>
-                      <w:sz w:val="24"/>
-                      <w:szCs w:val="24"/>
-                    </w:rPr>
-                    <w:t>carbon</w:t>
-                  </w:r>
-                  <w:r>
-                    <w:rPr>
-                      <w:rFonts w:ascii="Arial Narrow" w:eastAsia="Arial Narrow" w:hAnsi="Arial Narrow" w:cs="Times New Roman"/>
-                      <w:bCs/>
-                      <w:color w:val="000000"/>
-                      <w:sz w:val="24"/>
-                      <w:szCs w:val="24"/>
-                    </w:rPr>
-                    <w:t>_c</w:t>
-                  </w:r>
-                  <w:r>
-                    <w:rPr>
-                      <w:rFonts w:ascii="Arial Narrow" w:eastAsia="Arial Narrow" w:hAnsi="Arial Narrow" w:cs="Times New Roman"/>
-                      <w:bCs/>
-                      <w:color w:val="000000"/>
-                      <w:sz w:val="24"/>
-                      <w:szCs w:val="24"/>
-                    </w:rPr>
-                    <w:t>opy</w:t>
-                  </w:r>
-                  <w:r>
-                    <w:rPr>
-                      <w:rFonts w:ascii="Arial Narrow" w:eastAsia="Arial Narrow" w:hAnsi="Arial Narrow" w:cs="Times New Roman"/>
-                      <w:bCs/>
-                      <w:color w:val="000000"/>
-                      <w:sz w:val="24"/>
-                      <w:szCs w:val="24"/>
-                    </w:rPr>
-                    <w:t>_n</w:t>
-                  </w:r>
-                  <w:r>
-                    <w:rPr>
-                      <w:rFonts w:ascii="Arial Narrow" w:eastAsia="Arial Narrow" w:hAnsi="Arial Narrow" w:cs="Times New Roman"/>
-                      <w:bCs/>
-                      <w:color w:val="000000"/>
-                      <w:sz w:val="24"/>
-                      <w:szCs w:val="24"/>
-                    </w:rPr>
-                    <w:t>ame</w:t>
-                  </w:r>
-                  <w:proofErr w:type="spellEnd"/>
-                  <w:r>
-                    <w:rPr>
-                      <w:rFonts w:ascii="Arial Narrow" w:eastAsia="Arial Narrow" w:hAnsi="Arial Narrow" w:cs="Times New Roman"/>
-                      <w:bCs/>
-                      <w:color w:val="000000"/>
-                      <w:sz w:val="24"/>
-                      <w:szCs w:val="24"/>
-                    </w:rPr>
-                    <w:t>}</w:t>
+                    <w:t>ame}</w:t>
                   </w:r>
                 </w:p>
               </w:tc>
@@ -6231,29 +4171,7 @@
                       <w:sz w:val="24"/>
                       <w:szCs w:val="24"/>
                     </w:rPr>
-                    <w:t>${</w:t>
-                  </w:r>
-                  <w:proofErr w:type="spellStart"/>
-                  <w:r>
-                    <w:rPr>
-                      <w:rFonts w:ascii="Arial Narrow" w:eastAsia="Arial Narrow" w:hAnsi="Arial Narrow" w:cs="Times New Roman"/>
-                      <w:bCs/>
-                      <w:color w:val="000000"/>
-                      <w:sz w:val="24"/>
-                      <w:szCs w:val="24"/>
-                    </w:rPr>
-                    <w:t>signatoryHeadText</w:t>
-                  </w:r>
-                  <w:proofErr w:type="spellEnd"/>
-                  <w:r>
-                    <w:rPr>
-                      <w:rFonts w:ascii="Arial Narrow" w:eastAsia="Arial Narrow" w:hAnsi="Arial Narrow" w:cs="Times New Roman"/>
-                      <w:bCs/>
-                      <w:color w:val="000000"/>
-                      <w:sz w:val="24"/>
-                      <w:szCs w:val="24"/>
-                    </w:rPr>
-                    <w:t>}</w:t>
+                    <w:t>${signatoryHeadText}</w:t>
                   </w:r>
                 </w:p>
               </w:tc>
@@ -6285,29 +4203,7 @@
                       <w:sz w:val="24"/>
                       <w:szCs w:val="24"/>
                     </w:rPr>
-                    <w:t>${</w:t>
-                  </w:r>
-                  <w:proofErr w:type="spellStart"/>
-                  <w:r>
-                    <w:rPr>
-                      <w:rFonts w:ascii="Arial Narrow" w:eastAsia="Arial Narrow" w:hAnsi="Arial Narrow" w:cs="Times New Roman"/>
-                      <w:bCs/>
-                      <w:color w:val="000000"/>
-                      <w:sz w:val="24"/>
-                      <w:szCs w:val="24"/>
-                    </w:rPr>
-                    <w:t>signatoryPositionName</w:t>
-                  </w:r>
-                  <w:proofErr w:type="spellEnd"/>
-                  <w:r>
-                    <w:rPr>
-                      <w:rFonts w:ascii="Arial Narrow" w:eastAsia="Arial Narrow" w:hAnsi="Arial Narrow" w:cs="Times New Roman"/>
-                      <w:bCs/>
-                      <w:color w:val="000000"/>
-                      <w:sz w:val="24"/>
-                      <w:szCs w:val="24"/>
-                    </w:rPr>
-                    <w:t>}</w:t>
+                    <w:t>${signatoryPositionName}</w:t>
                   </w:r>
                 </w:p>
               </w:tc>
@@ -6441,29 +4337,7 @@
                             <w:sz w:val="24"/>
                             <w:szCs w:val="24"/>
                           </w:rPr>
-                          <w:t>${</w:t>
-                        </w:r>
-                        <w:proofErr w:type="spellStart"/>
-                        <w:r>
-                          <w:rPr>
-                            <w:rFonts w:ascii="Arial Narrow" w:eastAsia="Arial Narrow" w:hAnsi="Arial Narrow" w:cs="Times New Roman"/>
-                            <w:b/>
-                            <w:color w:val="000000"/>
-                            <w:sz w:val="24"/>
-                            <w:szCs w:val="24"/>
-                          </w:rPr>
-                          <w:t>signatoryName</w:t>
-                        </w:r>
-                        <w:proofErr w:type="spellEnd"/>
-                        <w:r>
-                          <w:rPr>
-                            <w:rFonts w:ascii="Arial Narrow" w:eastAsia="Arial Narrow" w:hAnsi="Arial Narrow" w:cs="Times New Roman"/>
-                            <w:b/>
-                            <w:color w:val="000000"/>
-                            <w:sz w:val="24"/>
-                            <w:szCs w:val="24"/>
-                          </w:rPr>
-                          <w:t>}</w:t>
+                          <w:t>${signatoryName}</w:t>
                         </w:r>
                       </w:p>
                     </w:tc>
@@ -6499,29 +4373,7 @@
                             <w:sz w:val="24"/>
                             <w:szCs w:val="24"/>
                           </w:rPr>
-                          <w:t>${</w:t>
-                        </w:r>
-                        <w:proofErr w:type="spellStart"/>
-                        <w:r>
-                          <w:rPr>
-                            <w:rFonts w:ascii="Arial Narrow" w:eastAsia="Arial Narrow" w:hAnsi="Arial Narrow" w:cs="Times New Roman"/>
-                            <w:bCs/>
-                            <w:color w:val="000000"/>
-                            <w:sz w:val="24"/>
-                            <w:szCs w:val="24"/>
-                          </w:rPr>
-                          <w:t>signatoryRankName</w:t>
-                        </w:r>
-                        <w:proofErr w:type="spellEnd"/>
-                        <w:r>
-                          <w:rPr>
-                            <w:rFonts w:ascii="Arial Narrow" w:eastAsia="Arial Narrow" w:hAnsi="Arial Narrow" w:cs="Times New Roman"/>
-                            <w:bCs/>
-                            <w:color w:val="000000"/>
-                            <w:sz w:val="24"/>
-                            <w:szCs w:val="24"/>
-                          </w:rPr>
-                          <w:t>}</w:t>
+                          <w:t>${signatoryRankName}</w:t>
                         </w:r>
                         <w:r>
                           <w:rPr>
@@ -6541,29 +4393,7 @@
                             <w:sz w:val="24"/>
                             <w:szCs w:val="24"/>
                           </w:rPr>
-                          <w:t>${</w:t>
-                        </w:r>
-                        <w:proofErr w:type="spellStart"/>
-                        <w:r>
-                          <w:rPr>
-                            <w:rFonts w:ascii="Arial Narrow" w:eastAsia="Arial Narrow" w:hAnsi="Arial Narrow" w:cs="Times New Roman"/>
-                            <w:bCs/>
-                            <w:color w:val="000000"/>
-                            <w:sz w:val="24"/>
-                            <w:szCs w:val="24"/>
-                          </w:rPr>
-                          <w:t>signatoryRegisterNumber</w:t>
-                        </w:r>
-                        <w:proofErr w:type="spellEnd"/>
-                        <w:r>
-                          <w:rPr>
-                            <w:rFonts w:ascii="Arial Narrow" w:eastAsia="Arial Narrow" w:hAnsi="Arial Narrow" w:cs="Times New Roman"/>
-                            <w:bCs/>
-                            <w:color w:val="000000"/>
-                            <w:sz w:val="24"/>
-                            <w:szCs w:val="24"/>
-                          </w:rPr>
-                          <w:t>}</w:t>
+                          <w:t>${signatoryRegisterNumber}</w:t>
                         </w:r>
                       </w:p>
                     </w:tc>

</xml_diff>

<commit_message>
[UPDATE]: Template s22 pertama dan kedua
</commit_message>
<xml_diff>
--- a/public/word-template/surat_permintaan_perpanjangan_penahanan_kedua_30_hari.docx
+++ b/public/word-template/surat_permintaan_perpanjangan_penahanan_kedua_30_hari.docx
@@ -243,6 +243,7 @@
           </w:p>
           <w:p>
             <w:pPr>
+              <w:jc w:val="both"/>
               <w:rPr>
                 <w:rFonts w:ascii="Arial Narrow" w:eastAsia="Times New Roman" w:hAnsi="Arial Narrow" w:cs="Times New Roman"/>
                 <w:color w:val="444444"/>
@@ -259,38 +260,7 @@
                 <w:sz w:val="24"/>
                 <w:szCs w:val="24"/>
               </w:rPr>
-              <w:t xml:space="preserve">                                      </w:t>
-            </w:r>
-            <w:r>
-              <w:rPr>
-                <w:rFonts w:ascii="Arial Narrow" w:hAnsi="Arial Narrow" w:cs="Times New Roman"/>
-                <w:color w:val="000000"/>
-                <w:sz w:val="24"/>
-                <w:szCs w:val="24"/>
-              </w:rPr>
-              <w:t>${documentLocation}</w:t>
-            </w:r>
-          </w:p>
-          <w:p>
-            <w:pPr>
-              <w:jc w:val="both"/>
-              <w:rPr>
-                <w:rFonts w:ascii="Arial Narrow" w:eastAsia="Times New Roman" w:hAnsi="Arial Narrow" w:cs="Times New Roman"/>
-                <w:color w:val="444444"/>
-                <w:sz w:val="24"/>
-                <w:szCs w:val="24"/>
-                <w:shd w:val="clear" w:color="auto" w:fill="FFFFFF"/>
-                <w:lang w:eastAsia="en-ID"/>
-              </w:rPr>
-            </w:pPr>
-            <w:r>
-              <w:rPr>
-                <w:rFonts w:ascii="Arial Narrow" w:hAnsi="Arial Narrow" w:cs="Times New Roman"/>
-                <w:color w:val="000000"/>
-                <w:sz w:val="24"/>
-                <w:szCs w:val="24"/>
-              </w:rPr>
-              <w:t>${documentCity}, ${documentDate}</w:t>
+              <w:t>${documentLocation}, ${documentDate}</w:t>
             </w:r>
           </w:p>
         </w:tc>
@@ -1340,7 +1310,7 @@
                 <w:szCs w:val="24"/>
                 <w:u w:val="single"/>
               </w:rPr>
-              <w:t>${prosecutorLocation}</w:t>
+              <w:t>${courtLocation}</w:t>
             </w:r>
           </w:p>
         </w:tc>

</xml_diff>